<commit_message>
Fix duplicate citations in the literature review
</commit_message>
<xml_diff>
--- a/thesis/chapters/02_literature_review/Literature Review.docx
+++ b/thesis/chapters/02_literature_review/Literature Review.docx
@@ -195,7 +195,7 @@
         <w:rPr>
           <w:rFonts w:ascii="Times New Roman" w:hAnsi="Times New Roman" w:cs="Times New Roman"/>
         </w:rPr>
-        <w:instrText xml:space="preserve"> ADDIN ZOTERO_ITEM CSL_CITATION {"citationID":"jykQSL37","properties":{"formattedCitation":"(Erdogan et al. 2026)","plainCitation":"(Erdogan et al. 2026)","noteIndex":0},"citationItems":[{"id":135,"uris":["http://zotero.org/groups/6681328/items/MJDHE9ZV"],"itemData":{"id":135,"type":"article-journal","abstract":"The study of political polarization has undergone significant conceptual and methodological evolution, progressing from early emphases on ideological divides toward a more complex understanding that incorporates affective, identity-based, digital, and cross-national dimensions. This shift reflects the growing recognition that polarization is not merely a divergence of policy preferences, but a multifaceted phenomenon shaped by emotional, social, technological, and epistemic processes. In this review, we provide an elaboration of the various ways to approach the study of political polarization. This task may be daunting, but a well-organized, comprehensive and interdisciplinary overview is surely necessary. We begin by elaborating different types of political polarization, moving from an early focus on ideological divides to multidimensional constructs. Then, we shift to an overview of key disciplinary concepts and theoretical approaches for examining political polarization. At the heart of this review, we elaborate the various methodologies and methods for studying polarization, including quantitative, computational/digital, experimental, and qualitative approaches. We also highlight the strengths and limitations of these methodologies. To conclude the review, we first offer some suggestions for interventions that could mitigate the effects of polarization, and second, point to directions for future research. We suggest expanding the national focus that has dominated the study of polarization, highlighting the benefits of cross-national comparisons with a global reach., The study of political polarization has undergone significant changes, progressing from early emphasis on ideological divides toward a more complex understanding. This shift reflects the growing recognition that polarization is not merely disagreement about policy preferences, but something shaped by emotional, social, technological, and knowledge-related processes. In this review, we look at the various ways to approach the study of political polarization. A well-organized, comprehensive and interdisciplinary overview is surely necessary. We begin by elaborating different types of political polarization, moving from an early focus on ideological divides to more complex constructs. Then, we shift to an overview of key disciplinary concepts and theoretical approaches for examining political polarization. At the heart of this review, we elaborate the various methodologies and methods for studying polarization, including quantitative, computational/digital, experimental, and qualitative approaches. We also highlight the strengths and limitations of these methodologies. To conclude the review, we first offer some suggestions to mitigate the effects of polarization, and second, point to directions for future research. We suggest expanding the national focus that has dominated the study of polarization, highlighting the benefits of cross-national comparisons with a global reach.","container-title":"Open Research Europe","DOI":"10.12688/openreseurope.23252.1","ISSN":"2732-5121","journalAbbreviation":"Open Res Eur","page":"93","PMID":"42394998","PMCID":"PMC13320125","source":"PubMed Central","title":"The evolving study of political polarization","volume":"6","author":[{"family":"Erdogan","given":"Emre"},{"family":"Jaworsky","given":"Bernadette Nadya"},{"family":"Álvares","given":"Cláudia"},{"family":"Bodroža","given":"Bojana"},{"family":"Butkevičienė","given":"Eglė"},{"family":"Cela","given":"Erlis"},{"family":"Dodeigne","given":"Jérémy"},{"family":"Fahmy","given":"Shahira S."},{"family":"Schäfer","given":"Sarah Helena"},{"family":"Scott","given":"Graham"},{"family":"Velasco Arias","given":"Gonzalo"},{"family":"Zamora Medina","given":"Rocio"}],"issued":{"date-parts":[["2026",4,7]]}}}],"schema":"https://github.com/citation-style-language/schema/raw/master/csl-citation.json"} </w:instrText>
+        <w:instrText xml:space="preserve"> ADDIN ZOTERO_ITEM CSL_CITATION {"citationID":"i5zvAyDJ","properties":{"formattedCitation":"(Erdogan et al. 2026)","plainCitation":"(Erdogan et al. 2026)","noteIndex":0},"citationItems":[{"id":135,"uris":["http://zotero.org/groups/6681328/items/MJDHE9ZV"],"itemData":{"id":135,"type":"article-journal","abstract":"The study of political polarization has undergone significant conceptual and methodological evolution, progressing from early emphases on ideological divides toward a more complex understanding that incorporates affective, identity-based, digital, and cross-national dimensions. This shift reflects the growing recognition that polarization is not merely a divergence of policy preferences, but a multifaceted phenomenon shaped by emotional, social, technological, and epistemic processes. In this review, we provide an elaboration of the various ways to approach the study of political polarization. This task may be daunting, but a well-organized, comprehensive and interdisciplinary overview is surely necessary. We begin by elaborating different types of political polarization, moving from an early focus on ideological divides to multidimensional constructs. Then, we shift to an overview of key disciplinary concepts and theoretical approaches for examining political polarization. At the heart of this review, we elaborate the various methodologies and methods for studying polarization, including quantitative, computational/digital, experimental, and qualitative approaches. We also highlight the strengths and limitations of these methodologies. To conclude the review, we first offer some suggestions for interventions that could mitigate the effects of polarization, and second, point to directions for future research. We suggest expanding the national focus that has dominated the study of polarization, highlighting the benefits of cross-national comparisons with a global reach., The study of political polarization has undergone significant changes, progressing from early emphasis on ideological divides toward a more complex understanding. This shift reflects the growing recognition that polarization is not merely disagreement about policy preferences, but something shaped by emotional, social, technological, and knowledge-related processes. In this review, we look at the various ways to approach the study of political polarization. A well-organized, comprehensive and interdisciplinary overview is surely necessary. We begin by elaborating different types of political polarization, moving from an early focus on ideological divides to more complex constructs. Then, we shift to an overview of key disciplinary concepts and theoretical approaches for examining political polarization. At the heart of this review, we elaborate the various methodologies and methods for studying polarization, including quantitative, computational/digital, experimental, and qualitative approaches. We also highlight the strengths and limitations of these methodologies. To conclude the review, we first offer some suggestions to mitigate the effects of polarization, and second, point to directions for future research. We suggest expanding the national focus that has dominated the study of polarization, highlighting the benefits of cross-national comparisons with a global reach.","container-title":"Open Research Europe","DOI":"10.12688/openreseurope.23252.1","ISSN":"2732-5121","journalAbbreviation":"Open Res Eur","page":"93","PMID":"42394998","PMCID":"PMC13320125","source":"PubMed Central","title":"The evolving study of political polarization","volume":"6","author":[{"family":"Erdogan","given":"Emre"},{"family":"Jaworsky","given":"Bernadette Nadya"},{"family":"Álvares","given":"Cláudia"},{"family":"Bodroža","given":"Bojana"},{"family":"Butkevičienė","given":"Eglė"},{"family":"Cela","given":"Erlis"},{"family":"Dodeigne","given":"Jérémy"},{"family":"Fahmy","given":"Shahira S."},{"family":"Schäfer","given":"Sarah Helena"},{"family":"Scott","given":"Graham"},{"family":"Velasco Arias","given":"Gonzalo"},{"family":"Zamora Medina","given":"Rocio"}],"issued":{"date-parts":[["2026",4,7]]}}}],"schema":"https://github.com/citation-style-language/schema/raw/master/csl-citation.json"} </w:instrText>
       </w:r>
       <w:r>
         <w:rPr>
@@ -359,7 +359,7 @@
         <w:rPr>
           <w:rFonts w:ascii="Times New Roman" w:hAnsi="Times New Roman" w:cs="Times New Roman"/>
         </w:rPr>
-        <w:instrText xml:space="preserve"> ADDIN ZOTERO_ITEM CSL_CITATION {"citationID":"3uzQJg0D","properties":{"formattedCitation":"(Iyengar et al. 2019)","plainCitation":"(Iyengar et al. 2019)","noteIndex":0},"citationItems":[{"id":33,"uris":["http://zotero.org/groups/6681328/items/TJB6VGSQ"],"itemData":{"id":33,"type":"article-journal","abstract":"While previously polarization was primarily seen only in issue-based terms, a new type of division has emerged in the mass public in recent years: Ordinary Americans increasingly dislike and distrust those from the other party. Democrats and Republicans both say that the other party's members are hypocritical, selfish, and closed-minded, and they are unwilling to socialize across party lines. This phenomenon of animosity between the parties is known as affective polarization. We trace its origins to the power of partisanship as a social identity, and explain the factors that intensify partisan animus. We also explore the consequences of affective polarization, highlighting how partisan affect influences attitudes and behaviors well outside the political sphere. Finally, we discuss strategies that might mitigate partisan discord and conclude with suggestions for future work.","container-title":"Annual Review of Political Science","DOI":"10.1146/annurev-polisci-051117-073034","ISSN":"1545-1577","page":"129-146","publisher":"Annual Reviews","source":"Annual Reviews","title":"The Origins and Consequences of Affective Polarization in the United States","volume":"22","author":[{"family":"Iyengar","given":"Shanto"},{"family":"Lelkes","given":"Yphtach"},{"family":"Levendusky","given":"Matthew"},{"family":"Malhotra","given":"Neil"},{"family":"Westwood","given":"Sean J."}],"issued":{"date-parts":[["2019"]]}}}],"schema":"https://github.com/citation-style-language/schema/raw/master/csl-citation.json"} </w:instrText>
+        <w:instrText xml:space="preserve"> ADDIN ZOTERO_ITEM CSL_CITATION {"citationID":"sM2tf7dy","properties":{"formattedCitation":"(Iyengar et al. 2019)","plainCitation":"(Iyengar et al. 2019)","noteIndex":0},"citationItems":[{"id":33,"uris":["http://zotero.org/groups/6681328/items/TJB6VGSQ"],"itemData":{"id":33,"type":"article-journal","abstract":"While previously polarization was primarily seen only in issue-based terms, a new type of division has emerged in the mass public in recent years: Ordinary Americans increasingly dislike and distrust those from the other party. Democrats and Republicans both say that the other party's members are hypocritical, selfish, and closed-minded, and they are unwilling to socialize across party lines. This phenomenon of animosity between the parties is known as affective polarization. We trace its origins to the power of partisanship as a social identity, and explain the factors that intensify partisan animus. We also explore the consequences of affective polarization, highlighting how partisan affect influences attitudes and behaviors well outside the political sphere. Finally, we discuss strategies that might mitigate partisan discord and conclude with suggestions for future work.","container-title":"Annual Review of Political Science","DOI":"10.1146/annurev-polisci-051117-073034","ISSN":"1545-1577","page":"129-146","publisher":"Annual Reviews","source":"Annual Reviews","title":"The Origins and Consequences of Affective Polarization in the United States","volume":"22","author":[{"family":"Iyengar","given":"Shanto"},{"family":"Lelkes","given":"Yphtach"},{"family":"Levendusky","given":"Matthew"},{"family":"Malhotra","given":"Neil"},{"family":"Westwood","given":"Sean J."}],"issued":{"date-parts":[["2019"]]}}}],"schema":"https://github.com/citation-style-language/schema/raw/master/csl-citation.json"} </w:instrText>
       </w:r>
       <w:r>
         <w:rPr>
@@ -443,7 +443,7 @@
         <w:rPr>
           <w:rFonts w:ascii="Times New Roman" w:hAnsi="Times New Roman" w:cs="Times New Roman"/>
         </w:rPr>
-        <w:instrText xml:space="preserve"> ADDIN ZOTERO_ITEM CSL_CITATION {"citationID":"bec9ozAe","properties":{"formattedCitation":"(Bakker and Lelkes 2024; Druckman and Levendusky 2019)","plainCitation":"(Bakker and Lelkes 2024; Druckman and Levendusky 2019)","noteIndex":0},"citationItems":[{"id":138,"uris":["http://zotero.org/groups/6681328/items/B276VWI8"],"itemData":{"id":138,"type":"article-journal","container-title":"Cognition and Emotion","DOI":"10.1080/02699931.2024.2362366","ISSN":"0269-9931","issue":"4","page":"418-436","publisher":"Routledge","source":"tandfonline.com (Atypon)","title":"Putting the affect into affective polarisation","volume":"38","author":[{"family":"Bakker","given":"Bert N."},{"family":"Lelkes","given":"Yphtach"}],"issued":{"date-parts":[["2024",5,18]]}}},{"id":172,"uris":["http://zotero.org/groups/6681328/items/4XLZHLLC"],"itemData":{"id":172,"type":"article-journal","abstract":"The authors show that commonly used affective-polarization items are not interchangeable and that respondents often think about political elites when evaluating the other party. They argue researchers should choose measures that match the research question and account for the distinction between attitudes toward voters and elites.","container-title":"Public Opinion Quarterly","DOI":"10.1093/poq/nfz003","issue":"1","page":"114–122","title":"What Do We Measure When We Measure Affective Polarization?","volume":"83","author":[{"family":"Druckman","given":"James N."},{"family":"Levendusky","given":"Matthew S."}],"issued":{"date-parts":[["2019"]]}}}],"schema":"https://github.com/citation-style-language/schema/raw/master/csl-citation.json"} </w:instrText>
+        <w:instrText xml:space="preserve"> ADDIN ZOTERO_ITEM CSL_CITATION {"citationID":"xaYPYBBy","properties":{"formattedCitation":"(Bakker and Lelkes 2024; Druckman and Levendusky 2019)","plainCitation":"(Bakker and Lelkes 2024; Druckman and Levendusky 2019)","noteIndex":0},"citationItems":[{"id":138,"uris":["http://zotero.org/groups/6681328/items/B276VWI8"],"itemData":{"id":138,"type":"article-journal","container-title":"Cognition and Emotion","DOI":"10.1080/02699931.2024.2362366","ISSN":"0269-9931","issue":"4","page":"418-436","publisher":"Routledge","source":"tandfonline.com (Atypon)","title":"Putting the affect into affective polarisation","volume":"38","author":[{"family":"Bakker","given":"Bert N."},{"family":"Lelkes","given":"Yphtach"}],"issued":{"date-parts":[["2024",5,18]]}}},{"id":172,"uris":["http://zotero.org/groups/6681328/items/4XLZHLLC"],"itemData":{"id":172,"type":"article-journal","abstract":"The authors show that commonly used affective-polarization items are not interchangeable and that respondents often think about political elites when evaluating the other party. They argue researchers should choose measures that match the research question and account for the distinction between attitudes toward voters and elites.","container-title":"Public Opinion Quarterly","DOI":"10.1093/poq/nfz003","issue":"1","page":"114–122","title":"What Do We Measure When We Measure Affective Polarization?","volume":"83","author":[{"family":"Druckman","given":"James N."},{"family":"Levendusky","given":"Matthew S."}],"issued":{"date-parts":[["2019"]]}}}],"schema":"https://github.com/citation-style-language/schema/raw/master/csl-citation.json"} </w:instrText>
       </w:r>
       <w:r>
         <w:rPr>
@@ -557,7 +557,7 @@
         <w:rPr>
           <w:rFonts w:ascii="Times New Roman" w:hAnsi="Times New Roman" w:cs="Times New Roman"/>
         </w:rPr>
-        <w:instrText xml:space="preserve"> ADDIN ZOTERO_ITEM CSL_CITATION {"citationID":"IgMqAeZ3","properties":{"formattedCitation":"(Iakovlev 2026)","plainCitation":"(Iakovlev 2026)","noteIndex":0},"citationItems":[{"id":238,"uris":["http://zotero.org/groups/6681328/items/2SXVFGYJ"],"itemData":{"id":238,"type":"article","abstract":"Theories of democratic stability, populism, and party-system crisis often point to a form of polarization that comparative research rarely measures directly: hostile relations among political elites. Existing comparative measures capture adjacent phenomena, including mass affective polarization, or elite ideological distance, but not directed mutual elite evaluation. This paper introduces the Elite Polarization Score, a measurement of out-party evaluations in parliamentary speech. Large Language Models identify political actors mentioned in parliamentary debates, recover speaker-target pairs, estimate the sentiment directed at each actor, standardize heterogeneous references into party dyads, and aggregate these evaluations into party- and parliament-level measures of mutual out-party negativity. The validity of the approach is demonstrated on parliamentary corpora from the United Kingdom, Hungary, and Italy, covering up to four decades of debate. The resulting measure is conceptually distinct from mass affective polarization, elite ideological polarization, incivility, negative campaigning, and general sentiment. Evidence from the UK case study shows that it is also empirically distinct from mass affective polarization, elite ideological polarization, and incivility. Extreme negative evaluations can also be used to locate pernicious polarization rhetoric. Validation across three countries finds no false discoveries, sentiment estimates accurate to roughly 10 percent of the scale range, and AI sensitivity that meets or exceeds that of human coders in two of three settings. Because the algorithm is multilingual, requires no task-specific training, and can be aggregated by party and quarter, it provides a scalable basis for future cross-national research on what produces elite polarization and what elite polarization itself produces","DOI":"10.48550/arXiv.2507.06658","note":"arXiv:2507.06658 [cs.CL]","number":"arXiv:2507.06658","publisher":"arXiv","source":"arXiv.org","title":"Elite Polarization in European Parliamentary Speeches: a Novel Measurement Approach Using Large Language Models","title-short":"Elite Polarization in European Parliamentary Speeches","URL":"http://arxiv.org/abs/2507.06658","author":[{"family":"Iakovlev","given":"Gennadii"}],"accessed":{"date-parts":[["2026",10,2]]},"issued":{"date-parts":[["2026",5,11]]}}}],"schema":"https://github.com/citation-style-language/schema/raw/master/csl-citation.json"} </w:instrText>
+        <w:instrText xml:space="preserve"> ADDIN ZOTERO_ITEM CSL_CITATION {"citationID":"IgnkiX4y","properties":{"formattedCitation":"(Iakovlev 2026)","plainCitation":"(Iakovlev 2026)","noteIndex":0},"citationItems":[{"id":238,"uris":["http://zotero.org/groups/6681328/items/2SXVFGYJ"],"itemData":{"id":238,"type":"article","abstract":"Theories of democratic stability, populism, and party-system crisis often point to a form of polarization that comparative research rarely measures directly: hostile relations among political elites. Existing comparative measures capture adjacent phenomena, including mass affective polarization, or elite ideological distance, but not directed mutual elite evaluation. This paper introduces the Elite Polarization Score, a measurement of out-party evaluations in parliamentary speech. Large Language Models identify political actors mentioned in parliamentary debates, recover speaker-target pairs, estimate the sentiment directed at each actor, standardize heterogeneous references into party dyads, and aggregate these evaluations into party- and parliament-level measures of mutual out-party negativity. The validity of the approach is demonstrated on parliamentary corpora from the United Kingdom, Hungary, and Italy, covering up to four decades of debate. The resulting measure is conceptually distinct from mass affective polarization, elite ideological polarization, incivility, negative campaigning, and general sentiment. Evidence from the UK case study shows that it is also empirically distinct from mass affective polarization, elite ideological polarization, and incivility. Extreme negative evaluations can also be used to locate pernicious polarization rhetoric. Validation across three countries finds no false discoveries, sentiment estimates accurate to roughly 10 percent of the scale range, and AI sensitivity that meets or exceeds that of human coders in two of three settings. Because the algorithm is multilingual, requires no task-specific training, and can be aggregated by party and quarter, it provides a scalable basis for future cross-national research on what produces elite polarization and what elite polarization itself produces","DOI":"10.48550/arXiv.2507.06658","note":"arXiv:2507.06658 [cs.CL]","number":"arXiv:2507.06658","publisher":"arXiv","source":"arXiv.org","title":"Elite Polarization in European Parliamentary Speeches: a Novel Measurement Approach Using Large Language Models","title-short":"Elite Polarization in European Parliamentary Speeches","URL":"http://arxiv.org/abs/2507.06658","author":[{"family":"Iakovlev","given":"Gennadii"}],"accessed":{"date-parts":[["2026",10,2]]},"issued":{"date-parts":[["2026",5,11]]}}}],"schema":"https://github.com/citation-style-language/schema/raw/master/csl-citation.json"} </w:instrText>
       </w:r>
       <w:r>
         <w:rPr>
@@ -607,7 +607,7 @@
         <w:rPr>
           <w:rFonts w:ascii="Times New Roman" w:hAnsi="Times New Roman" w:cs="Times New Roman"/>
         </w:rPr>
-        <w:instrText xml:space="preserve"> ADDIN ZOTERO_ITEM CSL_CITATION {"citationID":"8GTqANWP","properties":{"formattedCitation":"(Lelkes 2016; Mehlhaff 2024)","plainCitation":"(Lelkes 2016; Mehlhaff 2024)","noteIndex":0},"citationItems":[{"id":31,"uris":["http://zotero.org/groups/6681328/items/R7VN8NJU"],"itemData":{"id":31,"type":"article-journal","abstract":"The debate on mass polarization is itself polarized. Some argue that the United States is in the midst of a culture war; others argue that the claims are exaggerated. As polarization is a multifaceted concept, both sides can be correct. I review four distinct manifestations of polarization that have appeared in the public opinion literature—ideological consistency, ideological divergence, perceived polarization, and affective polarization—and discuss ways in which each has been measured. Then, using longitudinal data from the American National Election Studies (ANES), I update past analyses in order to more clearly show the ways in which Americans have or have not polarized: Americans at the mass level have not diverged, nor have they become more consistent ideologically, but partisans have; perceptions of polarization have increased, but this change is driven by partisans, who increasingly dislike one another.","container-title":"Public Opinion Quarterly","DOI":"10.1093/poq/nfw005","ISSN":"0033-362X","issue":"S1","journalAbbreviation":"Public Opin Q","page":"392-410","source":"Silverchair","title":"Mass Polarization: Manifestations and Measurements","title-short":"Mass Polarization","volume":"80","author":[{"family":"Lelkes","given":"Yphtach"}],"issued":{"date-parts":[["2016",1,1]]}}},{"id":146,"uris":["http://zotero.org/groups/6681328/items/6UAEUXT2"],"itemData":{"id":146,"type":"article-journal","abstract":"Despite polarization’s growing importance in social science, its quantitative measurement has lagged behind its conceptual development. Political and social polarization are group-based phenomena characterized by intergroup heterogeneity and intragroup homogeneity, but existing measures capture only one of these features or make it difficult to compare across cases or over time. To bring the concept and measurement of polarization into closer alignment, I introduce the cluster-polarization coefficient (CPC), a measure of multimodality that allows scholars to incorporate multiple variables and compare across contexts with varying numbers of parties or social groups. Three applications to elite and mass polarization demonstrate that the CPC returns substantively sensible results, and an open-source software package implements the measure.","container-title":"American Political Science Review","DOI":"10.1017/S0003055423001041","ISSN":"0003-0554, 1537-5943","issue":"3","language":"en","page":"1518-1526","source":"Cambridge University Press","title":"A Group-Based Approach to Measuring Polarization","volume":"118","author":[{"family":"Mehlhaff","given":"Isaac D."}],"issued":{"date-parts":[["2024",8]]}}}],"schema":"https://github.com/citation-style-language/schema/raw/master/csl-citation.json"} </w:instrText>
+        <w:instrText xml:space="preserve"> ADDIN ZOTERO_ITEM CSL_CITATION {"citationID":"6DvXKyzr","properties":{"formattedCitation":"(Lelkes 2016; Mehlhaff 2024)","plainCitation":"(Lelkes 2016; Mehlhaff 2024)","noteIndex":0},"citationItems":[{"id":31,"uris":["http://zotero.org/groups/6681328/items/R7VN8NJU"],"itemData":{"id":31,"type":"article-journal","abstract":"The debate on mass polarization is itself polarized. Some argue that the United States is in the midst of a culture war; others argue that the claims are exaggerated. As polarization is a multifaceted concept, both sides can be correct. I review four distinct manifestations of polarization that have appeared in the public opinion literature—ideological consistency, ideological divergence, perceived polarization, and affective polarization—and discuss ways in which each has been measured. Then, using longitudinal data from the American National Election Studies (ANES), I update past analyses in order to more clearly show the ways in which Americans have or have not polarized: Americans at the mass level have not diverged, nor have they become more consistent ideologically, but partisans have; perceptions of polarization have increased, but this change is driven by partisans, who increasingly dislike one another.","container-title":"Public Opinion Quarterly","DOI":"10.1093/poq/nfw005","ISSN":"0033-362X","issue":"S1","journalAbbreviation":"Public Opin Q","page":"392-410","source":"Silverchair","title":"Mass Polarization: Manifestations and Measurements","title-short":"Mass Polarization","volume":"80","author":[{"family":"Lelkes","given":"Yphtach"}],"issued":{"date-parts":[["2016",1,1]]}}},{"id":146,"uris":["http://zotero.org/groups/6681328/items/6UAEUXT2"],"itemData":{"id":146,"type":"article-journal","abstract":"Despite polarization’s growing importance in social science, its quantitative measurement has lagged behind its conceptual development. Political and social polarization are group-based phenomena characterized by intergroup heterogeneity and intragroup homogeneity, but existing measures capture only one of these features or make it difficult to compare across cases or over time. To bring the concept and measurement of polarization into closer alignment, I introduce the cluster-polarization coefficient (CPC), a measure of multimodality that allows scholars to incorporate multiple variables and compare across contexts with varying numbers of parties or social groups. Three applications to elite and mass polarization demonstrate that the CPC returns substantively sensible results, and an open-source software package implements the measure.","container-title":"American Political Science Review","DOI":"10.1017/S0003055423001041","ISSN":"0003-0554, 1537-5943","issue":"3","language":"en","page":"1518-1526","source":"Cambridge University Press","title":"A Group-Based Approach to Measuring Polarization","volume":"118","author":[{"family":"Mehlhaff","given":"Isaac D."}],"issued":{"date-parts":[["2024",8]]}}}],"schema":"https://github.com/citation-style-language/schema/raw/master/csl-citation.json"} </w:instrText>
       </w:r>
       <w:r>
         <w:rPr>
@@ -649,7 +649,7 @@
         <w:rPr>
           <w:rFonts w:ascii="Times New Roman" w:hAnsi="Times New Roman" w:cs="Times New Roman"/>
         </w:rPr>
-        <w:instrText xml:space="preserve"> ADDIN ZOTERO_ITEM CSL_CITATION {"citationID":"etj3NdVt","properties":{"formattedCitation":"(Lelkes 2016)","plainCitation":"(Lelkes 2016)","noteIndex":0},"citationItems":[{"id":31,"uris":["http://zotero.org/groups/6681328/items/R7VN8NJU"],"itemData":{"id":31,"type":"article-journal","abstract":"The debate on mass polarization is itself polarized. Some argue that the United States is in the midst of a culture war; others argue that the claims are exaggerated. As polarization is a multifaceted concept, both sides can be correct. I review four distinct manifestations of polarization that have appeared in the public opinion literature—ideological consistency, ideological divergence, perceived polarization, and affective polarization—and discuss ways in which each has been measured. Then, using longitudinal data from the American National Election Studies (ANES), I update past analyses in order to more clearly show the ways in which Americans have or have not polarized: Americans at the mass level have not diverged, nor have they become more consistent ideologically, but partisans have; perceptions of polarization have increased, but this change is driven by partisans, who increasingly dislike one another.","container-title":"Public Opinion Quarterly","DOI":"10.1093/poq/nfw005","ISSN":"0033-362X","issue":"S1","journalAbbreviation":"Public Opin Q","page":"392-410","source":"Silverchair","title":"Mass Polarization: Manifestations and Measurements","title-short":"Mass Polarization","volume":"80","author":[{"family":"Lelkes","given":"Yphtach"}],"issued":{"date-parts":[["2016",1,1]]}}}],"schema":"https://github.com/citation-style-language/schema/raw/master/csl-citation.json"} </w:instrText>
+        <w:instrText xml:space="preserve"> ADDIN ZOTERO_ITEM CSL_CITATION {"citationID":"qqEkSxaS","properties":{"formattedCitation":"(Lelkes 2016)","plainCitation":"(Lelkes 2016)","noteIndex":0},"citationItems":[{"id":31,"uris":["http://zotero.org/groups/6681328/items/R7VN8NJU"],"itemData":{"id":31,"type":"article-journal","abstract":"The debate on mass polarization is itself polarized. Some argue that the United States is in the midst of a culture war; others argue that the claims are exaggerated. As polarization is a multifaceted concept, both sides can be correct. I review four distinct manifestations of polarization that have appeared in the public opinion literature—ideological consistency, ideological divergence, perceived polarization, and affective polarization—and discuss ways in which each has been measured. Then, using longitudinal data from the American National Election Studies (ANES), I update past analyses in order to more clearly show the ways in which Americans have or have not polarized: Americans at the mass level have not diverged, nor have they become more consistent ideologically, but partisans have; perceptions of polarization have increased, but this change is driven by partisans, who increasingly dislike one another.","container-title":"Public Opinion Quarterly","DOI":"10.1093/poq/nfw005","ISSN":"0033-362X","issue":"S1","journalAbbreviation":"Public Opin Q","page":"392-410","source":"Silverchair","title":"Mass Polarization: Manifestations and Measurements","title-short":"Mass Polarization","volume":"80","author":[{"family":"Lelkes","given":"Yphtach"}],"issued":{"date-parts":[["2016",1,1]]}}}],"schema":"https://github.com/citation-style-language/schema/raw/master/csl-citation.json"} </w:instrText>
       </w:r>
       <w:r>
         <w:rPr>
@@ -726,7 +726,6 @@
         </w:rPr>
         <w:t xml:space="preserve"> </w:t>
       </w:r>
-      <w:commentRangeStart w:id="0"/>
       <w:r>
         <w:rPr>
           <w:rFonts w:ascii="Times New Roman" w:hAnsi="Times New Roman" w:cs="Times New Roman"/>
@@ -737,7 +736,7 @@
         <w:rPr>
           <w:rFonts w:ascii="Times New Roman" w:hAnsi="Times New Roman" w:cs="Times New Roman"/>
         </w:rPr>
-        <w:instrText xml:space="preserve"> ADDIN ZOTERO_ITEM CSL_CITATION {"citationID":"L2p9ss3J","properties":{"formattedCitation":"(Lelkes 2016)","plainCitation":"(Lelkes 2016)","noteIndex":0},"citationItems":[{"id":31,"uris":["http://zotero.org/groups/6681328/items/R7VN8NJU"],"itemData":{"id":31,"type":"article-journal","abstract":"The debate on mass polarization is itself polarized. Some argue that the United States is in the midst of a culture war; others argue that the claims are exaggerated. As polarization is a multifaceted concept, both sides can be correct. I review four distinct manifestations of polarization that have appeared in the public opinion literature—ideological consistency, ideological divergence, perceived polarization, and affective polarization—and discuss ways in which each has been measured. Then, using longitudinal data from the American National Election Studies (ANES), I update past analyses in order to more clearly show the ways in which Americans have or have not polarized: Americans at the mass level have not diverged, nor have they become more consistent ideologically, but partisans have; perceptions of polarization have increased, but this change is driven by partisans, who increasingly dislike one another.","container-title":"Public Opinion Quarterly","DOI":"10.1093/poq/nfw005","ISSN":"0033-362X","issue":"S1","journalAbbreviation":"Public Opin Q","page":"392-410","source":"Silverchair","title":"Mass Polarization: Manifestations and Measurements","title-short":"Mass Polarization","volume":"80","author":[{"family":"Lelkes","given":"Yphtach"}],"issued":{"date-parts":[["2016",1,1]]}}}],"schema":"https://github.com/citation-style-language/schema/raw/master/csl-citation.json"} </w:instrText>
+        <w:instrText xml:space="preserve"> ADDIN ZOTERO_ITEM CSL_CITATION {"citationID":"c3x3mHyO","properties":{"formattedCitation":"(Lelkes 2016)","plainCitation":"(Lelkes 2016)","noteIndex":0},"citationItems":[{"id":31,"uris":["http://zotero.org/groups/6681328/items/R7VN8NJU"],"itemData":{"id":31,"type":"article-journal","abstract":"The debate on mass polarization is itself polarized. Some argue that the United States is in the midst of a culture war; others argue that the claims are exaggerated. As polarization is a multifaceted concept, both sides can be correct. I review four distinct manifestations of polarization that have appeared in the public opinion literature—ideological consistency, ideological divergence, perceived polarization, and affective polarization—and discuss ways in which each has been measured. Then, using longitudinal data from the American National Election Studies (ANES), I update past analyses in order to more clearly show the ways in which Americans have or have not polarized: Americans at the mass level have not diverged, nor have they become more consistent ideologically, but partisans have; perceptions of polarization have increased, but this change is driven by partisans, who increasingly dislike one another.","container-title":"Public Opinion Quarterly","DOI":"10.1093/poq/nfw005","ISSN":"0033-362X","issue":"S1","journalAbbreviation":"Public Opin Q","page":"392-410","source":"Silverchair","title":"Mass Polarization: Manifestations and Measurements","title-short":"Mass Polarization","volume":"80","author":[{"family":"Lelkes","given":"Yphtach"}],"issued":{"date-parts":[["2016",1,1]]}}}],"schema":"https://github.com/citation-style-language/schema/raw/master/csl-citation.json"} </w:instrText>
       </w:r>
       <w:r>
         <w:rPr>
@@ -763,16 +762,6 @@
         </w:rPr>
         <w:t>.</w:t>
       </w:r>
-      <w:commentRangeEnd w:id="0"/>
-      <w:r>
-        <w:rPr>
-          <w:rStyle w:val="CommentReference"/>
-          <w:rFonts w:ascii="Times New Roman" w:hAnsi="Times New Roman" w:cs="Times New Roman"/>
-          <w:sz w:val="24"/>
-          <w:szCs w:val="24"/>
-        </w:rPr>
-        <w:commentReference w:id="0"/>
-      </w:r>
     </w:p>
     <w:p>
       <w:pPr>
@@ -935,7 +924,7 @@
         <w:rPr>
           <w:rFonts w:ascii="Times New Roman" w:hAnsi="Times New Roman" w:cs="Times New Roman"/>
         </w:rPr>
-        <w:instrText xml:space="preserve"> ADDIN ZOTERO_ITEM CSL_CITATION {"citationID":"k6pJZjbK","properties":{"formattedCitation":"(Fiorina and Abrams 2008)","plainCitation":"(Fiorina and Abrams 2008)","noteIndex":0},"citationItems":[{"id":122,"uris":["http://zotero.org/groups/6681328/items/IPWRD9QE"],"itemData":{"id":122,"type":"article-journal","abstract":"For more than two decades political scientists have discussed rising elite polarization in the United States, but the study of mass polarization did not receive comparable attention until fairly recently. This article surveys the literature on mass polarization. It begins with a discussion of the concept of polarization, then moves to a critical consideration of different kinds of evidence that have been used to study polarization, concluding that much of the evidence presents problems of inference that render conclusions problematic. The most direct evidence—citizens' positions on public policy issues—shows little or no indication of increased mass polarization over the past two to three decades. Party sorting—an increased correlation between policy views and partisan identification—clearly has occurred, although the extent has sometimes been exaggerated. Geographic polarization—the hypothesized tendency of like-minded people to cluster together—remains an open question. To date, there is no conclusive evidence that elite polarization has stimulated voters to polarize, on the one hand, or withdraw from politics, on the other.","container-title":"Annual Review of Political Science","DOI":"10.1146/annurev.polisci.11.053106.153836","ISSN":"1545-1577","page":"563-588","publisher":"Annual Reviews","source":"Annual Reviews","title":"Political Polarization in the American Public","volume":"11","author":[{"family":"Fiorina","given":"Morris P."},{"family":"Abrams","given":"Samuel J."}],"issued":{"date-parts":[["2008"]]}}}],"schema":"https://github.com/citation-style-language/schema/raw/master/csl-citation.json"} </w:instrText>
+        <w:instrText xml:space="preserve"> ADDIN ZOTERO_ITEM CSL_CITATION {"citationID":"LkDqbBom","properties":{"formattedCitation":"(Fiorina and Abrams 2008)","plainCitation":"(Fiorina and Abrams 2008)","noteIndex":0},"citationItems":[{"id":122,"uris":["http://zotero.org/groups/6681328/items/IPWRD9QE"],"itemData":{"id":122,"type":"article-journal","abstract":"For more than two decades political scientists have discussed rising elite polarization in the United States, but the study of mass polarization did not receive comparable attention until fairly recently. This article surveys the literature on mass polarization. It begins with a discussion of the concept of polarization, then moves to a critical consideration of different kinds of evidence that have been used to study polarization, concluding that much of the evidence presents problems of inference that render conclusions problematic. The most direct evidence—citizens' positions on public policy issues—shows little or no indication of increased mass polarization over the past two to three decades. Party sorting—an increased correlation between policy views and partisan identification—clearly has occurred, although the extent has sometimes been exaggerated. Geographic polarization—the hypothesized tendency of like-minded people to cluster together—remains an open question. To date, there is no conclusive evidence that elite polarization has stimulated voters to polarize, on the one hand, or withdraw from politics, on the other.","container-title":"Annual Review of Political Science","DOI":"10.1146/annurev.polisci.11.053106.153836","ISSN":"1545-1577","page":"563-588","publisher":"Annual Reviews","source":"Annual Reviews","title":"Political Polarization in the American Public","volume":"11","author":[{"family":"Fiorina","given":"Morris P."},{"family":"Abrams","given":"Samuel J."}],"issued":{"date-parts":[["2008"]]}}}],"schema":"https://github.com/citation-style-language/schema/raw/master/csl-citation.json"} </w:instrText>
       </w:r>
       <w:r>
         <w:rPr>
@@ -1085,7 +1074,7 @@
         <w:rPr>
           <w:rFonts w:ascii="Times New Roman" w:hAnsi="Times New Roman" w:cs="Times New Roman"/>
         </w:rPr>
-        <w:instrText xml:space="preserve"> ADDIN ZOTERO_ITEM CSL_CITATION {"citationID":"EMwOW3zW","properties":{"formattedCitation":"(Enders 2021)","plainCitation":"(Enders 2021)","noteIndex":0},"citationItems":[{"id":131,"uris":["http://zotero.org/groups/6681328/items/A9FT3HUQ"],"itemData":{"id":131,"type":"article-journal","abstract":"Conventional wisdom holds that political elites harbor more ideologically constrained issue attitudes and are more polarized on such issues than their mass counterparts. In contrast, the mass public is more polarized in its emotional reactions to political stimuli. How affective polarization among the mass public compares to affective polarization among elites is, however, an open question. Using items common to the Convention Delegate Studies and American National Election Studies, I compare the mass public to political elites when it comes to both affective and ideological polarization. I find that elites are more affectively polarized than the mass public and more affectively polarized than they are ideologically polarized, although mass affective polarization has increased over time. These findings provide context for understanding the extent to which the mass public has affectively polarized and demonstrate that elites, despite ideological capabilities, exhibit extreme emotional reactions toward political groups just like their mass counterparts.","container-title":"The Journal of Politics","DOI":"10.1086/715059","issue":"4","page":"1872-1877","publisher":"The University of Chicago Press","source":"journals.uchicago.edu (Atypon)","title":"Issues versus Affect: How Do Elite and Mass Polarization Compare?","title-short":"Issues versus Affect","volume":"83","author":[{"family":"Enders","given":"Adam M."}],"issued":{"date-parts":[["2021",10]]}}}],"schema":"https://github.com/citation-style-language/schema/raw/master/csl-citation.json"} </w:instrText>
+        <w:instrText xml:space="preserve"> ADDIN ZOTERO_ITEM CSL_CITATION {"citationID":"lX6PVOg2","properties":{"formattedCitation":"(Enders 2021)","plainCitation":"(Enders 2021)","noteIndex":0},"citationItems":[{"id":131,"uris":["http://zotero.org/groups/6681328/items/A9FT3HUQ"],"itemData":{"id":131,"type":"article-journal","abstract":"Conventional wisdom holds that political elites harbor more ideologically constrained issue attitudes and are more polarized on such issues than their mass counterparts. In contrast, the mass public is more polarized in its emotional reactions to political stimuli. How affective polarization among the mass public compares to affective polarization among elites is, however, an open question. Using items common to the Convention Delegate Studies and American National Election Studies, I compare the mass public to political elites when it comes to both affective and ideological polarization. I find that elites are more affectively polarized than the mass public and more affectively polarized than they are ideologically polarized, although mass affective polarization has increased over time. These findings provide context for understanding the extent to which the mass public has affectively polarized and demonstrate that elites, despite ideological capabilities, exhibit extreme emotional reactions toward political groups just like their mass counterparts.","container-title":"The Journal of Politics","DOI":"10.1086/715059","issue":"4","page":"1872-1877","publisher":"The University of Chicago Press","source":"journals.uchicago.edu (Atypon)","title":"Issues versus Affect: How Do Elite and Mass Polarization Compare?","title-short":"Issues versus Affect","volume":"83","author":[{"family":"Enders","given":"Adam M."}],"issued":{"date-parts":[["2021",10]]}}}],"schema":"https://github.com/citation-style-language/schema/raw/master/csl-citation.json"} </w:instrText>
       </w:r>
       <w:r>
         <w:rPr>
@@ -1253,7 +1242,7 @@
         <w:rPr>
           <w:rFonts w:ascii="Times New Roman" w:hAnsi="Times New Roman" w:cs="Times New Roman"/>
         </w:rPr>
-        <w:instrText xml:space="preserve"> ADDIN ZOTERO_ITEM CSL_CITATION {"citationID":"HjYz4HWW","properties":{"formattedCitation":"(Poole and Rosenthal 2007a)","plainCitation":"(Poole and Rosenthal 2007a)","noteIndex":0},"citationItems":[{"id":340,"uris":["http://zotero.org/groups/6681328/items/6PNL5E44"],"itemData":{"id":340,"type":"book","abstract":"In Ideology and Congress, authors Poole and Rosenthal have analyzed over 13 million individual roll call votes spanning the two centuries since Congress began recording votes in 1789. By tracing the voting patterns of Congress throughout the country&amp;#39;s history, the authors find that, despite a wide array of issues facing legislators, over 81 percent of their voting decisions can be attributed to a consistent ideological position ranging from ultraconservatism to ultraliberalism. In their classic 1997 volume, Congress: A Political Economic History of Roll Call Voting, roll call voting became the framework for a novel interpretation of important episodes in American political and economic history. Congress demonstrated that roll call voting has a very simple structure and that, for most of American history, roll call voting patterns have maintained a core stability based on two great issues: the extent of government regulation of, and intervention in, the economy; and race. In this new, paperback volume, the authors include nineteen years of additional data, bringing in the period from 1986 through 2004.","edition":"2nd revised","ISBN":"978-1-4128-0608-4","language":"en","note":"Google-Books-ID: KaVfAAAAQBAJ","number-of-pages":"363","publisher":"Transaction Publishers","source":"Google Books","title":"Ideology and Congress: Second Revised Edition of Congress: A Political Economic History of Roll Call Voting","title-short":"Ideology and Congress","author":[{"family":"Poole","given":"Keith T."},{"family":"Rosenthal","given":"Howard"}],"issued":{"date-parts":[["2007"]]}}}],"schema":"https://github.com/citation-style-language/schema/raw/master/csl-citation.json"} </w:instrText>
+        <w:instrText xml:space="preserve"> ADDIN ZOTERO_ITEM CSL_CITATION {"citationID":"5glJ08Bm","properties":{"formattedCitation":"(Poole and Rosenthal 2007)","plainCitation":"(Poole and Rosenthal 2007)","noteIndex":0},"citationItems":[{"id":222,"uris":["http://zotero.org/groups/6681328/items/6BBVJBBT"],"itemData":{"id":222,"type":"article-journal","container-title":"Daedalus","ISSN":"0011-5266","issue":"3","page":"104-107","publisher":"[American Academy of Arts &amp; Sciences, The MIT Press]","source":"JSTOR","title":"On Party Polarization in Congress","volume":"136","author":[{"family":"Poole","given":"Keith T."},{"family":"Rosenthal","given":"Howard"}],"issued":{"date-parts":[["2007"]]}}}],"schema":"https://github.com/citation-style-language/schema/raw/master/csl-citation.json"} </w:instrText>
       </w:r>
       <w:r>
         <w:rPr>
@@ -1265,7 +1254,7 @@
         <w:rPr>
           <w:rFonts w:ascii="Times New Roman" w:hAnsi="Times New Roman" w:cs="Times New Roman"/>
         </w:rPr>
-        <w:t>(Poole and Rosenthal 2007a)</w:t>
+        <w:t>(Poole and Rosenthal 2007)</w:t>
       </w:r>
       <w:r>
         <w:rPr>
@@ -1558,7 +1547,13 @@
         <w:rPr>
           <w:rFonts w:ascii="Times New Roman" w:hAnsi="Times New Roman" w:cs="Times New Roman"/>
         </w:rPr>
-        <w:t xml:space="preserve">with congressional parties representing increasingly distinct electoral constituencies. </w:t>
+        <w:t>with congressional parties representing increasingly distinct electoral constituencies</w:t>
+      </w:r>
+      <w:r>
+        <w:rPr>
+          <w:rFonts w:ascii="Times New Roman" w:hAnsi="Times New Roman" w:cs="Times New Roman"/>
+        </w:rPr>
+        <w:t xml:space="preserve"> </w:t>
       </w:r>
       <w:r>
         <w:rPr>
@@ -1570,7 +1565,7 @@
         <w:rPr>
           <w:rFonts w:ascii="Times New Roman" w:hAnsi="Times New Roman" w:cs="Times New Roman"/>
         </w:rPr>
-        <w:instrText xml:space="preserve"> ADDIN ZOTERO_ITEM CSL_CITATION {"citationID":"o81aQjKz","properties":{"formattedCitation":"(Jacobson 2013)","plainCitation":"(Jacobson 2013)","noteIndex":0},"citationItems":[{"id":27,"uris":["http://zotero.org/groups/6681328/items/HKZ6RL26"],"itemData":{"id":27,"type":"article-journal","abstract":"Polarization and gridlock are defining characteristics of present-day American national politics, reflecting the interaction of the Madisonian system's checks and balances with the widening partisan and ideological divisions in the House and Senate. These divisions have coevolved with complimentary changes in electoral politics over the same period in a mutually reinforcing spiral. The partisan, ideological, and policy opinions of American voters have grown more internally consistent, more distinctive between parties, and more predictive of voting in national elections. Party loyalty has increased, ticket splitting has decreased, and winning congressional seats against the local partisan grain has become much more difficult. The congressional parties thus represent increasingly divergent electoral constituencies. Republicans enjoy a structural advantage in the distribution of their regular voters across House districts, so these changes have solidified their control of the House even as their national party grows less competitive nationally. Divided government and polarized politics thus rest on a firm electoral base, and partisan warfare in Washington is unlikely to diminish until voters begin to punish the warriors.","container-title":"Presidential Studies Quarterly","DOI":"10.1111/psq.12062","ISSN":"1741-5705","issue":"4","language":"en","license":"© 2013 Center for the Study of the Presidency","page":"688-708","source":"Wiley Online Library","title":"Partisan Polarization in American Politics: A Background Paper","title-short":"Partisan Polarization in American Politics","volume":"43","author":[{"family":"Jacobson","given":"Gary C."}],"issued":{"date-parts":[["2013"]]}}}],"schema":"https://github.com/citation-style-language/schema/raw/master/csl-citation.json"} </w:instrText>
+        <w:instrText xml:space="preserve"> ADDIN ZOTERO_ITEM CSL_CITATION {"citationID":"oOLseZr9","properties":{"formattedCitation":"(Jacobson 2013)","plainCitation":"(Jacobson 2013)","noteIndex":0},"citationItems":[{"id":27,"uris":["http://zotero.org/groups/6681328/items/HKZ6RL26"],"itemData":{"id":27,"type":"article-journal","abstract":"Polarization and gridlock are defining characteristics of present-day American national politics, reflecting the interaction of the Madisonian system's checks and balances with the widening partisan and ideological divisions in the House and Senate. These divisions have coevolved with complimentary changes in electoral politics over the same period in a mutually reinforcing spiral. The partisan, ideological, and policy opinions of American voters have grown more internally consistent, more distinctive between parties, and more predictive of voting in national elections. Party loyalty has increased, ticket splitting has decreased, and winning congressional seats against the local partisan grain has become much more difficult. The congressional parties thus represent increasingly divergent electoral constituencies. Republicans enjoy a structural advantage in the distribution of their regular voters across House districts, so these changes have solidified their control of the House even as their national party grows less competitive nationally. Divided government and polarized politics thus rest on a firm electoral base, and partisan warfare in Washington is unlikely to diminish until voters begin to punish the warriors.","container-title":"Presidential Studies Quarterly","DOI":"10.1111/psq.12062","ISSN":"1741-5705","issue":"4","language":"en","license":"© 2013 Center for the Study of the Presidency","page":"688-708","source":"Wiley Online Library","title":"Partisan Polarization in American Politics: A Background Paper","title-short":"Partisan Polarization in American Politics","volume":"43","author":[{"family":"Jacobson","given":"Gary C."}],"issued":{"date-parts":[["2013"]]}}}],"schema":"https://github.com/citation-style-language/schema/raw/master/csl-citation.json"} </w:instrText>
       </w:r>
       <w:r>
         <w:rPr>
@@ -1722,7 +1717,7 @@
         <w:rPr>
           <w:rFonts w:ascii="Times New Roman" w:hAnsi="Times New Roman" w:cs="Times New Roman"/>
         </w:rPr>
-        <w:instrText xml:space="preserve"> ADDIN ZOTERO_ITEM CSL_CITATION {"citationID":"PredJlJ2","properties":{"formattedCitation":"(Moskowitz, Rogowski, and Snyder 2024)","plainCitation":"(Moskowitz, Rogowski, and Snyder 2024)","noteIndex":0},"citationItems":[{"id":179,"uris":["http://zotero.org/groups/6681328/items/E4GGWSA6"],"itemData":{"id":179,"type":"article-journal","abstract":"Using candidate surveys to hold the policy agenda constant over 1996–2008, the authors find that congressional polarization is not solely an artifact of an evolving roll-call agenda. Under a fixed agenda, increased House polarization is due to replacement: incoming members are more extreme than departing members. Apparent within-member movement toward extremity in roll-call records may instead reflect agenda change, party pressure, or both.","container-title":"Quarterly Journal of Political Science","title":"Parsing Party Polarization in Congress","URL":"https://consensus.app/papers/parsing-party-polarization-in-congress-moskowitz-rogowski/6430fea8ea5454cebf4c4715ebdb3892/?utm_source=chatgpt","author":[{"family":"Moskowitz","given":"D."},{"family":"Rogowski","given":"Jon C."},{"family":"Snyder","given":"J."}],"issued":{"date-parts":[["2024"]]}}}],"schema":"https://github.com/citation-style-language/schema/raw/master/csl-citation.json"} </w:instrText>
+        <w:instrText xml:space="preserve"> ADDIN ZOTERO_ITEM CSL_CITATION {"citationID":"39jwT6cm","properties":{"formattedCitation":"(Moskowitz, Rogowski, and Snyder 2024)","plainCitation":"(Moskowitz, Rogowski, and Snyder 2024)","noteIndex":0},"citationItems":[{"id":412,"uris":["http://zotero.org/groups/6681328/items/BLZ5CRNN"],"itemData":{"id":412,"type":"article-journal","abstract":"A vast literature documents growing ideological divisions between the parties in the contemporary U.S. Congress based on estimates from roll-call voting behavior (such as DW-NOMINATE). We revisit theoretical and empirical claims about the nature of partisan polarization by addressing concerns raised in recent scholarship about the comparability and interpretation of roll-call estimates over time. We leverage data from candidate surveys that allow us to hold the policy agenda constant from 1996 to 2008. We show that the replacement of relatively moderate legislators with more ideologically extreme legislators, particularly among Republicans, explains virtually all of the recent growth in partisan polarization. We further demonstrate that these patterns are explained mostly by increased polarization over social and environmental issues and link our findings to changes in the congressional agenda. Our results have important substantive and methodological implications for evaluating sources of legislative polarization and using roll-call measures in empirical applications.","container-title":"Quarterly Journal of Political Science","DOI":"10.1561/100.00022039","ISSN":"1554-0626","issue":"4","page":"357-385","source":"Silverchair","title":"Parsing Party Polarization in Congress","volume":"19","author":[{"family":"Moskowitz","given":"Daniel J."},{"family":"Rogowski","given":"Jon C."},{"family":"Snyder","given":"James M.","suffix":"Jr."}],"issued":{"date-parts":[["2024",10,16]]}}}],"schema":"https://github.com/citation-style-language/schema/raw/master/csl-citation.json"} </w:instrText>
       </w:r>
       <w:r>
         <w:rPr>
@@ -1857,7 +1852,7 @@
         <w:rPr>
           <w:rFonts w:ascii="Times New Roman" w:hAnsi="Times New Roman" w:cs="Times New Roman"/>
         </w:rPr>
-        <w:instrText xml:space="preserve"> ADDIN ZOTERO_ITEM CSL_CITATION {"citationID":"I3BihgWO","properties":{"formattedCitation":"(Poole and Rosenthal 2007a)","plainCitation":"(Poole and Rosenthal 2007a)","noteIndex":0},"citationItems":[{"id":340,"uris":["http://zotero.org/groups/6681328/items/6PNL5E44"],"itemData":{"id":340,"type":"book","abstract":"In Ideology and Congress, authors Poole and Rosenthal have analyzed over 13 million individual roll call votes spanning the two centuries since Congress began recording votes in 1789. By tracing the voting patterns of Congress throughout the country&amp;#39;s history, the authors find that, despite a wide array of issues facing legislators, over 81 percent of their voting decisions can be attributed to a consistent ideological position ranging from ultraconservatism to ultraliberalism. In their classic 1997 volume, Congress: A Political Economic History of Roll Call Voting, roll call voting became the framework for a novel interpretation of important episodes in American political and economic history. Congress demonstrated that roll call voting has a very simple structure and that, for most of American history, roll call voting patterns have maintained a core stability based on two great issues: the extent of government regulation of, and intervention in, the economy; and race. In this new, paperback volume, the authors include nineteen years of additional data, bringing in the period from 1986 through 2004.","edition":"2nd revised","ISBN":"978-1-4128-0608-4","language":"en","note":"Google-Books-ID: KaVfAAAAQBAJ","number-of-pages":"363","publisher":"Transaction Publishers","source":"Google Books","title":"Ideology and Congress: Second Revised Edition of Congress: A Political Economic History of Roll Call Voting","title-short":"Ideology and Congress","author":[{"family":"Poole","given":"Keith T."},{"family":"Rosenthal","given":"Howard"}],"issued":{"date-parts":[["2007"]]}}}],"schema":"https://github.com/citation-style-language/schema/raw/master/csl-citation.json"} </w:instrText>
+        <w:instrText xml:space="preserve"> ADDIN ZOTERO_ITEM CSL_CITATION {"citationID":"0AJD0VXm","properties":{"formattedCitation":"(Poole and Rosenthal 2007)","plainCitation":"(Poole and Rosenthal 2007)","noteIndex":0},"citationItems":[{"id":222,"uris":["http://zotero.org/groups/6681328/items/6BBVJBBT"],"itemData":{"id":222,"type":"article-journal","container-title":"Daedalus","ISSN":"0011-5266","issue":"3","page":"104-107","publisher":"[American Academy of Arts &amp; Sciences, The MIT Press]","source":"JSTOR","title":"On Party Polarization in Congress","volume":"136","author":[{"family":"Poole","given":"Keith T."},{"family":"Rosenthal","given":"Howard"}],"issued":{"date-parts":[["2007"]]}}}],"schema":"https://github.com/citation-style-language/schema/raw/master/csl-citation.json"} </w:instrText>
       </w:r>
       <w:r>
         <w:rPr>
@@ -1869,7 +1864,7 @@
         <w:rPr>
           <w:rFonts w:ascii="Times New Roman" w:hAnsi="Times New Roman" w:cs="Times New Roman"/>
         </w:rPr>
-        <w:t>(Poole and Rosenthal 2007a)</w:t>
+        <w:t>(Poole and Rosenthal 2007)</w:t>
       </w:r>
       <w:r>
         <w:rPr>
@@ -2079,7 +2074,7 @@
         <w:rPr>
           <w:rFonts w:ascii="Times New Roman" w:hAnsi="Times New Roman" w:cs="Times New Roman"/>
         </w:rPr>
-        <w:instrText xml:space="preserve"> ADDIN ZOTERO_ITEM CSL_CITATION {"citationID":"Je2ljYYW","properties":{"formattedCitation":"(Moskowitz, Rogowski, and Snyder 2024)","plainCitation":"(Moskowitz, Rogowski, and Snyder 2024)","noteIndex":0},"citationItems":[{"id":179,"uris":["http://zotero.org/groups/6681328/items/E4GGWSA6"],"itemData":{"id":179,"type":"article-journal","abstract":"Using candidate surveys to hold the policy agenda constant over 1996–2008, the authors find that congressional polarization is not solely an artifact of an evolving roll-call agenda. Under a fixed agenda, increased House polarization is due to replacement: incoming members are more extreme than departing members. Apparent within-member movement toward extremity in roll-call records may instead reflect agenda change, party pressure, or both.","container-title":"Quarterly Journal of Political Science","title":"Parsing Party Polarization in Congress","URL":"https://consensus.app/papers/parsing-party-polarization-in-congress-moskowitz-rogowski/6430fea8ea5454cebf4c4715ebdb3892/?utm_source=chatgpt","author":[{"family":"Moskowitz","given":"D."},{"family":"Rogowski","given":"Jon C."},{"family":"Snyder","given":"J."}],"issued":{"date-parts":[["2024"]]}}}],"schema":"https://github.com/citation-style-language/schema/raw/master/csl-citation.json"} </w:instrText>
+        <w:instrText xml:space="preserve"> ADDIN ZOTERO_ITEM CSL_CITATION {"citationID":"MI1OtwuT","properties":{"formattedCitation":"(Moskowitz, Rogowski, and Snyder 2024)","plainCitation":"(Moskowitz, Rogowski, and Snyder 2024)","noteIndex":0},"citationItems":[{"id":412,"uris":["http://zotero.org/groups/6681328/items/BLZ5CRNN"],"itemData":{"id":412,"type":"article-journal","abstract":"A vast literature documents growing ideological divisions between the parties in the contemporary U.S. Congress based on estimates from roll-call voting behavior (such as DW-NOMINATE). We revisit theoretical and empirical claims about the nature of partisan polarization by addressing concerns raised in recent scholarship about the comparability and interpretation of roll-call estimates over time. We leverage data from candidate surveys that allow us to hold the policy agenda constant from 1996 to 2008. We show that the replacement of relatively moderate legislators with more ideologically extreme legislators, particularly among Republicans, explains virtually all of the recent growth in partisan polarization. We further demonstrate that these patterns are explained mostly by increased polarization over social and environmental issues and link our findings to changes in the congressional agenda. Our results have important substantive and methodological implications for evaluating sources of legislative polarization and using roll-call measures in empirical applications.","container-title":"Quarterly Journal of Political Science","DOI":"10.1561/100.00022039","ISSN":"1554-0626","issue":"4","page":"357-385","source":"Silverchair","title":"Parsing Party Polarization in Congress","volume":"19","author":[{"family":"Moskowitz","given":"Daniel J."},{"family":"Rogowski","given":"Jon C."},{"family":"Snyder","given":"James M.","suffix":"Jr."}],"issued":{"date-parts":[["2024",10,16]]}}}],"schema":"https://github.com/citation-style-language/schema/raw/master/csl-citation.json"} </w:instrText>
       </w:r>
       <w:r>
         <w:rPr>
@@ -2198,7 +2193,7 @@
         <w:rPr>
           <w:rFonts w:ascii="Times New Roman" w:hAnsi="Times New Roman" w:cs="Times New Roman"/>
         </w:rPr>
-        <w:instrText xml:space="preserve"> ADDIN ZOTERO_ITEM CSL_CITATION {"citationID":"bwPJnBDC","properties":{"formattedCitation":"(Ainsley et al. 2020)","plainCitation":"(Ainsley et al. 2020)","noteIndex":0},"citationItems":[{"id":290,"uris":["http://zotero.org/groups/6681328/items/NRDS92KK"],"itemData":{"id":290,"type":"article-journal","abstract":"Roll-call votes provide scholars with the opportunity to measure many quantities of interest. However, the usefulness of the roll-call sample depends on the population it is intended to represent. After laying out why understanding the sample properties of the roll-call record is important, we catalogue voting procedures for 145 legislative chambers, finding that roll calls are typically discretionary. We then consider two arguments for discounting the potential problem: (a) roll calls are ubiquitous, especially where the threshold for invoking them is low or (b) the strategic incentives behind requests are sufficiently benign so as to generate representative samples. We address the first defense with novel empirical evidence regarding roll-call prevalence and the second with an original formal model of the position-taking argument for roll-call vote requests. Both our empirical and theoretical results confirm that inattention to vote method selection should broadly be considered an issue for the study of legislative behavior.","container-title":"American Political Science Review","DOI":"10.1017/S0003055420000192","ISSN":"0003-0554, 1537-5943","issue":"3","language":"en","page":"691-706","source":"Cambridge University Press","title":"Roll-Call Vote Selection: Implications for the Study of Legislative Politics","title-short":"Roll-Call Vote Selection","volume":"114","author":[{"family":"Ainsley","given":"Caitlin"},{"family":"Carrubba","given":"Clifford J."},{"family":"Crisp","given":"Brian F."},{"family":"Demirkaya","given":"Betul"},{"family":"Gabel","given":"Matthew J."},{"family":"Hadzic","given":"Dino"}],"issued":{"date-parts":[["2020",8]]}}}],"schema":"https://github.com/citation-style-language/schema/raw/master/csl-citation.json"} </w:instrText>
+        <w:instrText xml:space="preserve"> ADDIN ZOTERO_ITEM CSL_CITATION {"citationID":"0gE62Jla","properties":{"formattedCitation":"(Ainsley et al. 2020)","plainCitation":"(Ainsley et al. 2020)","noteIndex":0},"citationItems":[{"id":163,"uris":["http://zotero.org/groups/6681328/items/SPKDQHY6"],"itemData":{"id":163,"type":"article-journal","abstract":"Roll-call votes provide scholars with the opportunity to measure many quantities of interest. However, the usefulness of the roll-call sample depends on the population it is intended to represent. After laying out why understanding the sample properties of the roll-call record is important, we catalogue voting procedures for 145 legislative chambers, finding that roll calls are typically discretionary. We then consider two arguments for discounting the potential problem: (a) roll calls are ubiquitous, especially where the threshold for invoking them is low or (b) the strategic incentives behind requests are sufficiently benign so as to generate representative samples. We address the first defense with novel empirical evidence regarding roll-call prevalence and the second with an original formal model of the position-taking argument for roll-call vote requests. Both our empirical and theoretical results confirm that inattention to vote method selection should broadly be considered an issue for the study of legislative behavior.","container-title":"American Political Science Review","DOI":"10.1017/S0003055420000192","ISSN":"0003-0554, 1537-5943","issue":"3","language":"en","page":"691-706","source":"Cambridge University Press","title":"Roll-Call Vote Selection: Implications for the Study of Legislative Politics","title-short":"Roll-Call Vote Selection","volume":"114","author":[{"family":"Ainsley","given":"Caitlin"},{"family":"Carrubba","given":"Clifford J."},{"family":"Crisp","given":"Brian F."},{"family":"Demirkaya","given":"Betul"},{"family":"Gabel","given":"Matthew J."},{"family":"Hadzic","given":"Dino"}],"issued":{"date-parts":[["2020",8]]}}}],"schema":"https://github.com/citation-style-language/schema/raw/master/csl-citation.json"} </w:instrText>
       </w:r>
       <w:r>
         <w:rPr>
@@ -2248,7 +2243,7 @@
         <w:rPr>
           <w:rFonts w:ascii="Times New Roman" w:hAnsi="Times New Roman" w:cs="Times New Roman"/>
         </w:rPr>
-        <w:instrText xml:space="preserve"> ADDIN ZOTERO_ITEM CSL_CITATION {"citationID":"siZt7NLI","properties":{"formattedCitation":"(Carroll et al. 2009)","plainCitation":"(Carroll et al. 2009)","noteIndex":0},"citationItems":[{"id":335,"uris":["http://zotero.org/groups/6681328/items/5334IJRD"],"itemData":{"id":335,"type":"article-journal","abstract":"DW-NOMINATE scores for the U.S. Congress are widely used measures of legislators' ideological locations over time. These scores have been used in a large number of studies in political science and closely related fields. In this paper, we extend the work of Lewis and Poole (2004) on the parametric bootstrap to DW-NOMINATE and obtain standard errors for the legislator ideal points. These standard errors are in the range of 1%–4% of the range of DW-NOMINATE coordinates.","container-title":"Political Analysis","DOI":"10.1093/pan/mpp005","ISSN":"1047-1987, 1476-4989","issue":"3","journalAbbreviation":"Polit. anal.","language":"en","license":"https://www.cambridge.org/core/terms","page":"261-275","source":"Semantic Scholar","title":"Measuring Bias and Uncertainty in DW-NOMINATE Ideal Point Estimates via the Parametric Bootstrap","volume":"17","author":[{"family":"Carroll","given":"Royce"},{"family":"Lewis","given":"Jeffrey B."},{"family":"Lo","given":"James"},{"family":"Poole","given":"Keith T."},{"family":"Rosenthal","given":"Howard"}],"issued":{"date-parts":[["2009"]]}}}],"schema":"https://github.com/citation-style-language/schema/raw/master/csl-citation.json"} </w:instrText>
+        <w:instrText xml:space="preserve"> ADDIN ZOTERO_ITEM CSL_CITATION {"citationID":"NlDIYdHj","properties":{"formattedCitation":"(Carroll et al. 2009)","plainCitation":"(Carroll et al. 2009)","noteIndex":0},"citationItems":[{"id":270,"uris":["http://zotero.org/groups/6681328/items/NN2HUT8A"],"itemData":{"id":270,"type":"article-journal","abstract":"DW-NOMINATE scores for the U.S. Congress are widely used measures of legislators' ideological locations over time. These scores have been used in a large number of studies in political science and closely related fields. In this paper, we extend the work of Lewis and Poole (2004) on the parametric bootstrap to DW-NOMINATE and obtain standard errors for the legislator ideal points. These standard errors are in the range of 1%–4% of the range of DW-NOMINATE coordinates.","container-title":"Political Analysis","DOI":"10.1093/pan/mpp005","ISSN":"1047-1987, 1476-4989","issue":"3","language":"en","page":"261-275","source":"Cambridge University Press","title":"Measuring Bias and Uncertainty in DW-NOMINATE Ideal Point Estimates via the Parametric Bootstrap","volume":"17","author":[{"family":"Carroll","given":"Royce"},{"family":"Lewis","given":"Jeffrey B."},{"family":"Lo","given":"James"},{"family":"Poole","given":"Keith T."},{"family":"Rosenthal","given":"Howard"}],"issued":{"date-parts":[["2009",7]]}}}],"schema":"https://github.com/citation-style-language/schema/raw/master/csl-citation.json"} </w:instrText>
       </w:r>
       <w:r>
         <w:rPr>
@@ -2290,7 +2285,7 @@
         <w:rPr>
           <w:rFonts w:ascii="Times New Roman" w:hAnsi="Times New Roman" w:cs="Times New Roman"/>
         </w:rPr>
-        <w:instrText xml:space="preserve"> ADDIN ZOTERO_ITEM CSL_CITATION {"citationID":"rGBYfRcU","properties":{"formattedCitation":"(Lauderdale and Herzog 2016)","plainCitation":"(Lauderdale and Herzog 2016)","noteIndex":0},"citationItems":[{"id":237,"uris":["http://zotero.org/groups/6681328/items/UFF3DLZ4"],"itemData":{"id":237,"type":"article-journal","abstract":"Existing approaches to measuring political disagreement from text data perform poorly except when applied to narrowly selected texts discussing the same issues and written in the same style. We demonstrate the first viable approach for estimating legislator-specific scores from the entire speech corpus of a legislature, while also producing extensive information about the evolution of speech polarization and politically loaded language. In the Irish Dáil, we show that the dominant dimension of speech variation is government–opposition, with ministers more extreme on this dimension than backbenchers, and a second dimension distinguishing between the establishment and anti-establishment opposition parties. In the U. S. Senate, we estimate a dimension that has moderate within-party correlations with scales based on roll-call votes and campaign donation patterns; however, we observe greater overlap across parties in speech positions than roll-call positions and partisan polarization in speeches varies more clearly in response to major political events.","container-title":"Political Analysis","DOI":"10.1093/pan/mpw017","ISSN":"1047-1987, 1476-4989","issue":"3","journalAbbreviation":"Polit. anal.","language":"en","license":"https://www.cambridge.org/core/terms","page":"374-394","source":"DOI.org (Crossref)","title":"Measuring Political Positions from Legislative Speech","volume":"24","author":[{"family":"Lauderdale","given":"Benjamin E."},{"family":"Herzog","given":"Alexander"}],"issued":{"date-parts":[["2016"]]}}}],"schema":"https://github.com/citation-style-language/schema/raw/master/csl-citation.json"} </w:instrText>
+        <w:instrText xml:space="preserve"> ADDIN ZOTERO_ITEM CSL_CITATION {"citationID":"8TfZGxcZ","properties":{"formattedCitation":"(Lauderdale and Herzog 2016)","plainCitation":"(Lauderdale and Herzog 2016)","noteIndex":0},"citationItems":[{"id":149,"uris":["http://zotero.org/groups/6681328/items/6AZ7VJB3"],"itemData":{"id":149,"type":"article-journal","abstract":"Existing approaches to measuring political disagreement from text data perform poorly except when applied to narrowly selected texts discussing the same issues and written in the same style. We demonstrate the first viable approach for estimating legislator-specific scores from the entire speech corpus of a legislature, while also producing extensive information about the evolution of speech polarization and politically loaded language. In the Irish Dáil, we show that the dominant dimension of speech variation is government–opposition, with ministers more extreme on this dimension than backbenchers, and a second dimension distinguishing between the establishment and anti-establishment opposition parties. In the U. S. Senate, we estimate a dimension that has moderate within-party correlations with scales based on roll-call votes and campaign donation patterns; however, we observe greater overlap across parties in speech positions than roll-call positions and partisan polarization in speeches varies more clearly in response to major political events.","container-title":"Political Analysis","DOI":"10.1093/pan/mpw017","ISSN":"1047-1987, 1476-4989","issue":"3","language":"en","page":"374-394","source":"Cambridge University Press","title":"Measuring Political Positions from Legislative Speech","volume":"24","author":[{"family":"Lauderdale","given":"Benjamin E."},{"family":"Herzog","given":"Alexander"}],"issued":{"date-parts":[["2016",7]]}}}],"schema":"https://github.com/citation-style-language/schema/raw/master/csl-citation.json"} </w:instrText>
       </w:r>
       <w:r>
         <w:rPr>
@@ -2346,7 +2341,7 @@
         <w:rPr>
           <w:rFonts w:ascii="Times New Roman" w:hAnsi="Times New Roman" w:cs="Times New Roman"/>
         </w:rPr>
-        <w:t xml:space="preserve">Speech-based positions in the US Senate show patterns related to, but different from, voting-based position  </w:t>
+        <w:t>Speech-based positions in the US Senate show patterns related to, but different from, voting-based position</w:t>
       </w:r>
       <w:r>
         <w:rPr>
@@ -2358,7 +2353,7 @@
         <w:rPr>
           <w:rFonts w:ascii="Times New Roman" w:hAnsi="Times New Roman" w:cs="Times New Roman"/>
         </w:rPr>
-        <w:instrText xml:space="preserve"> ADDIN ZOTERO_ITEM CSL_CITATION {"citationID":"iM92EOro","properties":{"formattedCitation":"(Lauderdale and Herzog 2016)","plainCitation":"(Lauderdale and Herzog 2016)","noteIndex":0},"citationItems":[{"id":237,"uris":["http://zotero.org/groups/6681328/items/UFF3DLZ4"],"itemData":{"id":237,"type":"article-journal","abstract":"Existing approaches to measuring political disagreement from text data perform poorly except when applied to narrowly selected texts discussing the same issues and written in the same style. We demonstrate the first viable approach for estimating legislator-specific scores from the entire speech corpus of a legislature, while also producing extensive information about the evolution of speech polarization and politically loaded language. In the Irish Dáil, we show that the dominant dimension of speech variation is government–opposition, with ministers more extreme on this dimension than backbenchers, and a second dimension distinguishing between the establishment and anti-establishment opposition parties. In the U. S. Senate, we estimate a dimension that has moderate within-party correlations with scales based on roll-call votes and campaign donation patterns; however, we observe greater overlap across parties in speech positions than roll-call positions and partisan polarization in speeches varies more clearly in response to major political events.","container-title":"Political Analysis","DOI":"10.1093/pan/mpw017","ISSN":"1047-1987, 1476-4989","issue":"3","journalAbbreviation":"Polit. anal.","language":"en","license":"https://www.cambridge.org/core/terms","page":"374-394","source":"DOI.org (Crossref)","title":"Measuring Political Positions from Legislative Speech","volume":"24","author":[{"family":"Lauderdale","given":"Benjamin E."},{"family":"Herzog","given":"Alexander"}],"issued":{"date-parts":[["2016"]]}}}],"schema":"https://github.com/citation-style-language/schema/raw/master/csl-citation.json"} </w:instrText>
+        <w:instrText xml:space="preserve"> ADDIN ZOTERO_ITEM CSL_CITATION {"citationID":"mVUIvpMW","properties":{"formattedCitation":"(Lauderdale and Herzog 2016)","plainCitation":"(Lauderdale and Herzog 2016)","noteIndex":0},"citationItems":[{"id":149,"uris":["http://zotero.org/groups/6681328/items/6AZ7VJB3"],"itemData":{"id":149,"type":"article-journal","abstract":"Existing approaches to measuring political disagreement from text data perform poorly except when applied to narrowly selected texts discussing the same issues and written in the same style. We demonstrate the first viable approach for estimating legislator-specific scores from the entire speech corpus of a legislature, while also producing extensive information about the evolution of speech polarization and politically loaded language. In the Irish Dáil, we show that the dominant dimension of speech variation is government–opposition, with ministers more extreme on this dimension than backbenchers, and a second dimension distinguishing between the establishment and anti-establishment opposition parties. In the U. S. Senate, we estimate a dimension that has moderate within-party correlations with scales based on roll-call votes and campaign donation patterns; however, we observe greater overlap across parties in speech positions than roll-call positions and partisan polarization in speeches varies more clearly in response to major political events.","container-title":"Political Analysis","DOI":"10.1093/pan/mpw017","ISSN":"1047-1987, 1476-4989","issue":"3","language":"en","page":"374-394","source":"Cambridge University Press","title":"Measuring Political Positions from Legislative Speech","volume":"24","author":[{"family":"Lauderdale","given":"Benjamin E."},{"family":"Herzog","given":"Alexander"}],"issued":{"date-parts":[["2016",7]]}}}],"schema":"https://github.com/citation-style-language/schema/raw/master/csl-citation.json"} </w:instrText>
       </w:r>
       <w:r>
         <w:rPr>
@@ -2394,7 +2389,7 @@
         <w:rPr>
           <w:rFonts w:ascii="Times New Roman" w:hAnsi="Times New Roman" w:cs="Times New Roman"/>
         </w:rPr>
-        <w:instrText xml:space="preserve"> ADDIN ZOTERO_ITEM CSL_CITATION {"citationID":"klQTVJm2","properties":{"formattedCitation":"(Gentzkow, Shapiro, and Taddy 2019)","plainCitation":"(Gentzkow, Shapiro, and Taddy 2019)","noteIndex":0},"citationItems":[{"id":233,"uris":["http://zotero.org/groups/6681328/items/TQGM25XV"],"itemData":{"id":233,"type":"article-journal","abstract":"We study the problem of measuring group differences in choices when the dimensionality of the choice set is large. We show that standard approaches suffer from a severe finite-sample bias, and we propose an estimator that applies recent advances in machine learning to address this bias. We apply this method to measure trends in the partisanship of congressional speech from 1873 to 2016, defining partisanship to be the ease with which an observer could infer a congressperson's party from a single utterance. Our estimates imply that partisanship is far greater in recent years than in the past, and that it increased sharply in the early 1990s after remaining low and relatively constant over the preceding century.","container-title":"Econometrica","DOI":"10.3982/ECTA16566","ISSN":"1468-0262","issue":"4","language":"en","license":"© 2019 The Econometric Society","page":"1307-1340","source":"Wiley Online Library","title":"Measuring Group Differences in High-Dimensional Choices: Method and Application to Congressional Speech","title-short":"Measuring Group Differences in High-Dimensional Choices","volume":"87","author":[{"family":"Gentzkow","given":"Matthew"},{"family":"Shapiro","given":"Jesse M."},{"family":"Taddy","given":"Matt"}],"issued":{"date-parts":[["2019"]]}}}],"schema":"https://github.com/citation-style-language/schema/raw/master/csl-citation.json"} </w:instrText>
+        <w:instrText xml:space="preserve"> ADDIN ZOTERO_ITEM CSL_CITATION {"citationID":"DDNRS1mH","properties":{"formattedCitation":"(Gentzkow, Shapiro, and Taddy 2019)","plainCitation":"(Gentzkow, Shapiro, and Taddy 2019)","noteIndex":0},"citationItems":[{"id":233,"uris":["http://zotero.org/groups/6681328/items/TQGM25XV"],"itemData":{"id":233,"type":"article-journal","abstract":"We study the problem of measuring group differences in choices when the dimensionality of the choice set is large. We show that standard approaches suffer from a severe finite-sample bias, and we propose an estimator that applies recent advances in machine learning to address this bias. We apply this method to measure trends in the partisanship of congressional speech from 1873 to 2016, defining partisanship to be the ease with which an observer could infer a congressperson's party from a single utterance. Our estimates imply that partisanship is far greater in recent years than in the past, and that it increased sharply in the early 1990s after remaining low and relatively constant over the preceding century.","container-title":"Econometrica","DOI":"10.3982/ECTA16566","ISSN":"1468-0262","issue":"4","language":"en","license":"© 2019 The Econometric Society","page":"1307-1340","source":"Wiley Online Library","title":"Measuring Group Differences in High-Dimensional Choices: Method and Application to Congressional Speech","title-short":"Measuring Group Differences in High-Dimensional Choices","volume":"87","author":[{"family":"Gentzkow","given":"Matthew"},{"family":"Shapiro","given":"Jesse M."},{"family":"Taddy","given":"Matt"}],"issued":{"date-parts":[["2019"]]}}}],"schema":"https://github.com/citation-style-language/schema/raw/master/csl-citation.json"} </w:instrText>
       </w:r>
       <w:r>
         <w:rPr>
@@ -2418,7 +2413,13 @@
         <w:rPr>
           <w:rFonts w:ascii="Times New Roman" w:hAnsi="Times New Roman" w:cs="Times New Roman"/>
         </w:rPr>
-        <w:t xml:space="preserve">, later than the rise in voting-based polarisation described above </w:t>
+        <w:t>, later than the rise in voting-based polarisation described above</w:t>
+      </w:r>
+      <w:r>
+        <w:rPr>
+          <w:rFonts w:ascii="Times New Roman" w:hAnsi="Times New Roman" w:cs="Times New Roman"/>
+        </w:rPr>
+        <w:t xml:space="preserve"> </w:t>
       </w:r>
       <w:r>
         <w:rPr>
@@ -2430,7 +2431,7 @@
         <w:rPr>
           <w:rFonts w:ascii="Times New Roman" w:hAnsi="Times New Roman" w:cs="Times New Roman"/>
         </w:rPr>
-        <w:instrText xml:space="preserve"> ADDIN ZOTERO_ITEM CSL_CITATION {"citationID":"8YRPxexj","properties":{"formattedCitation":"(Poole and Rosenthal 2007a)","plainCitation":"(Poole and Rosenthal 2007a)","noteIndex":0},"citationItems":[{"id":340,"uris":["http://zotero.org/groups/6681328/items/6PNL5E44"],"itemData":{"id":340,"type":"book","abstract":"In Ideology and Congress, authors Poole and Rosenthal have analyzed over 13 million individual roll call votes spanning the two centuries since Congress began recording votes in 1789. By tracing the voting patterns of Congress throughout the country&amp;#39;s history, the authors find that, despite a wide array of issues facing legislators, over 81 percent of their voting decisions can be attributed to a consistent ideological position ranging from ultraconservatism to ultraliberalism. In their classic 1997 volume, Congress: A Political Economic History of Roll Call Voting, roll call voting became the framework for a novel interpretation of important episodes in American political and economic history. Congress demonstrated that roll call voting has a very simple structure and that, for most of American history, roll call voting patterns have maintained a core stability based on two great issues: the extent of government regulation of, and intervention in, the economy; and race. In this new, paperback volume, the authors include nineteen years of additional data, bringing in the period from 1986 through 2004.","edition":"2nd revised","ISBN":"978-1-4128-0608-4","language":"en","note":"Google-Books-ID: KaVfAAAAQBAJ","number-of-pages":"363","publisher":"Transaction Publishers","source":"Google Books","title":"Ideology and Congress: Second Revised Edition of Congress: A Political Economic History of Roll Call Voting","title-short":"Ideology and Congress","author":[{"family":"Poole","given":"Keith T."},{"family":"Rosenthal","given":"Howard"}],"issued":{"date-parts":[["2007"]]}}}],"schema":"https://github.com/citation-style-language/schema/raw/master/csl-citation.json"} </w:instrText>
+        <w:instrText xml:space="preserve"> ADDIN ZOTERO_ITEM CSL_CITATION {"citationID":"Ubbt0e2m","properties":{"formattedCitation":"(Lauderdale and Herzog 2016)","plainCitation":"(Lauderdale and Herzog 2016)","noteIndex":0},"citationItems":[{"id":149,"uris":["http://zotero.org/groups/6681328/items/6AZ7VJB3"],"itemData":{"id":149,"type":"article-journal","abstract":"Existing approaches to measuring political disagreement from text data perform poorly except when applied to narrowly selected texts discussing the same issues and written in the same style. We demonstrate the first viable approach for estimating legislator-specific scores from the entire speech corpus of a legislature, while also producing extensive information about the evolution of speech polarization and politically loaded language. In the Irish Dáil, we show that the dominant dimension of speech variation is government–opposition, with ministers more extreme on this dimension than backbenchers, and a second dimension distinguishing between the establishment and anti-establishment opposition parties. In the U. S. Senate, we estimate a dimension that has moderate within-party correlations with scales based on roll-call votes and campaign donation patterns; however, we observe greater overlap across parties in speech positions than roll-call positions and partisan polarization in speeches varies more clearly in response to major political events.","container-title":"Political Analysis","DOI":"10.1093/pan/mpw017","ISSN":"1047-1987, 1476-4989","issue":"3","language":"en","page":"374-394","source":"Cambridge University Press","title":"Measuring Political Positions from Legislative Speech","volume":"24","author":[{"family":"Lauderdale","given":"Benjamin E."},{"family":"Herzog","given":"Alexander"}],"issued":{"date-parts":[["2016",7]]}}}],"schema":"https://github.com/citation-style-language/schema/raw/master/csl-citation.json"} </w:instrText>
       </w:r>
       <w:r>
         <w:rPr>
@@ -2442,7 +2443,7 @@
         <w:rPr>
           <w:rFonts w:ascii="Times New Roman" w:hAnsi="Times New Roman" w:cs="Times New Roman"/>
         </w:rPr>
-        <w:t>(Poole and Rosenthal 2007a)</w:t>
+        <w:t>(Lauderdale and Herzog 2016)</w:t>
       </w:r>
       <w:r>
         <w:rPr>
@@ -2492,7 +2493,7 @@
         <w:rPr>
           <w:rFonts w:ascii="Times New Roman" w:hAnsi="Times New Roman" w:cs="Times New Roman"/>
         </w:rPr>
-        <w:instrText xml:space="preserve"> ADDIN ZOTERO_ITEM CSL_CITATION {"citationID":"JFrnxVyE","properties":{"formattedCitation":"(Lauderdale and Herzog 2016)","plainCitation":"(Lauderdale and Herzog 2016)","noteIndex":0},"citationItems":[{"id":237,"uris":["http://zotero.org/groups/6681328/items/UFF3DLZ4"],"itemData":{"id":237,"type":"article-journal","abstract":"Existing approaches to measuring political disagreement from text data perform poorly except when applied to narrowly selected texts discussing the same issues and written in the same style. We demonstrate the first viable approach for estimating legislator-specific scores from the entire speech corpus of a legislature, while also producing extensive information about the evolution of speech polarization and politically loaded language. In the Irish Dáil, we show that the dominant dimension of speech variation is government–opposition, with ministers more extreme on this dimension than backbenchers, and a second dimension distinguishing between the establishment and anti-establishment opposition parties. In the U. S. Senate, we estimate a dimension that has moderate within-party correlations with scales based on roll-call votes and campaign donation patterns; however, we observe greater overlap across parties in speech positions than roll-call positions and partisan polarization in speeches varies more clearly in response to major political events.","container-title":"Political Analysis","DOI":"10.1093/pan/mpw017","ISSN":"1047-1987, 1476-4989","issue":"3","journalAbbreviation":"Polit. anal.","language":"en","license":"https://www.cambridge.org/core/terms","page":"374-394","source":"DOI.org (Crossref)","title":"Measuring Political Positions from Legislative Speech","volume":"24","author":[{"family":"Lauderdale","given":"Benjamin E."},{"family":"Herzog","given":"Alexander"}],"issued":{"date-parts":[["2016"]]}}}],"schema":"https://github.com/citation-style-language/schema/raw/master/csl-citation.json"} </w:instrText>
+        <w:instrText xml:space="preserve"> ADDIN ZOTERO_ITEM CSL_CITATION {"citationID":"j13wyxwJ","properties":{"formattedCitation":"(Lauderdale and Herzog 2016)","plainCitation":"(Lauderdale and Herzog 2016)","noteIndex":0},"citationItems":[{"id":149,"uris":["http://zotero.org/groups/6681328/items/6AZ7VJB3"],"itemData":{"id":149,"type":"article-journal","abstract":"Existing approaches to measuring political disagreement from text data perform poorly except when applied to narrowly selected texts discussing the same issues and written in the same style. We demonstrate the first viable approach for estimating legislator-specific scores from the entire speech corpus of a legislature, while also producing extensive information about the evolution of speech polarization and politically loaded language. In the Irish Dáil, we show that the dominant dimension of speech variation is government–opposition, with ministers more extreme on this dimension than backbenchers, and a second dimension distinguishing between the establishment and anti-establishment opposition parties. In the U. S. Senate, we estimate a dimension that has moderate within-party correlations with scales based on roll-call votes and campaign donation patterns; however, we observe greater overlap across parties in speech positions than roll-call positions and partisan polarization in speeches varies more clearly in response to major political events.","container-title":"Political Analysis","DOI":"10.1093/pan/mpw017","ISSN":"1047-1987, 1476-4989","issue":"3","language":"en","page":"374-394","source":"Cambridge University Press","title":"Measuring Political Positions from Legislative Speech","volume":"24","author":[{"family":"Lauderdale","given":"Benjamin E."},{"family":"Herzog","given":"Alexander"}],"issued":{"date-parts":[["2016",7]]}}}],"schema":"https://github.com/citation-style-language/schema/raw/master/csl-citation.json"} </w:instrText>
       </w:r>
       <w:r>
         <w:rPr>
@@ -2526,11 +2527,19 @@
           <w:rFonts w:ascii="Times New Roman" w:hAnsi="Times New Roman" w:cs="Times New Roman"/>
         </w:rPr>
       </w:pPr>
-      <w:r>
-        <w:rPr>
-          <w:rFonts w:ascii="Times New Roman" w:hAnsi="Times New Roman" w:cs="Times New Roman"/>
-        </w:rPr>
-        <w:t xml:space="preserve">Wordshoal, a speech-based method, estimates </w:t>
+      <w:proofErr w:type="spellStart"/>
+      <w:r>
+        <w:rPr>
+          <w:rFonts w:ascii="Times New Roman" w:hAnsi="Times New Roman" w:cs="Times New Roman"/>
+        </w:rPr>
+        <w:t>Wordshoal</w:t>
+      </w:r>
+      <w:proofErr w:type="spellEnd"/>
+      <w:r>
+        <w:rPr>
+          <w:rFonts w:ascii="Times New Roman" w:hAnsi="Times New Roman" w:cs="Times New Roman"/>
+        </w:rPr>
+        <w:t xml:space="preserve">, a speech-based method, estimates </w:t>
       </w:r>
       <w:r>
         <w:rPr>
@@ -2554,7 +2563,7 @@
         <w:rPr>
           <w:rFonts w:ascii="Times New Roman" w:hAnsi="Times New Roman" w:cs="Times New Roman"/>
         </w:rPr>
-        <w:instrText xml:space="preserve"> ADDIN ZOTERO_ITEM CSL_CITATION {"citationID":"Z6Jglms9","properties":{"formattedCitation":"(Lauderdale and Herzog 2016)","plainCitation":"(Lauderdale and Herzog 2016)","noteIndex":0},"citationItems":[{"id":237,"uris":["http://zotero.org/groups/6681328/items/UFF3DLZ4"],"itemData":{"id":237,"type":"article-journal","abstract":"Existing approaches to measuring political disagreement from text data perform poorly except when applied to narrowly selected texts discussing the same issues and written in the same style. We demonstrate the first viable approach for estimating legislator-specific scores from the entire speech corpus of a legislature, while also producing extensive information about the evolution of speech polarization and politically loaded language. In the Irish Dáil, we show that the dominant dimension of speech variation is government–opposition, with ministers more extreme on this dimension than backbenchers, and a second dimension distinguishing between the establishment and anti-establishment opposition parties. In the U. S. Senate, we estimate a dimension that has moderate within-party correlations with scales based on roll-call votes and campaign donation patterns; however, we observe greater overlap across parties in speech positions than roll-call positions and partisan polarization in speeches varies more clearly in response to major political events.","container-title":"Political Analysis","DOI":"10.1093/pan/mpw017","ISSN":"1047-1987, 1476-4989","issue":"3","journalAbbreviation":"Polit. anal.","language":"en","license":"https://www.cambridge.org/core/terms","page":"374-394","source":"DOI.org (Crossref)","title":"Measuring Political Positions from Legislative Speech","volume":"24","author":[{"family":"Lauderdale","given":"Benjamin E."},{"family":"Herzog","given":"Alexander"}],"issued":{"date-parts":[["2016"]]}}}],"schema":"https://github.com/citation-style-language/schema/raw/master/csl-citation.json"} </w:instrText>
+        <w:instrText xml:space="preserve"> ADDIN ZOTERO_ITEM CSL_CITATION {"citationID":"uODkPtD0","properties":{"formattedCitation":"(Lauderdale and Herzog 2016)","plainCitation":"(Lauderdale and Herzog 2016)","noteIndex":0},"citationItems":[{"id":149,"uris":["http://zotero.org/groups/6681328/items/6AZ7VJB3"],"itemData":{"id":149,"type":"article-journal","abstract":"Existing approaches to measuring political disagreement from text data perform poorly except when applied to narrowly selected texts discussing the same issues and written in the same style. We demonstrate the first viable approach for estimating legislator-specific scores from the entire speech corpus of a legislature, while also producing extensive information about the evolution of speech polarization and politically loaded language. In the Irish Dáil, we show that the dominant dimension of speech variation is government–opposition, with ministers more extreme on this dimension than backbenchers, and a second dimension distinguishing between the establishment and anti-establishment opposition parties. In the U. S. Senate, we estimate a dimension that has moderate within-party correlations with scales based on roll-call votes and campaign donation patterns; however, we observe greater overlap across parties in speech positions than roll-call positions and partisan polarization in speeches varies more clearly in response to major political events.","container-title":"Political Analysis","DOI":"10.1093/pan/mpw017","ISSN":"1047-1987, 1476-4989","issue":"3","language":"en","page":"374-394","source":"Cambridge University Press","title":"Measuring Political Positions from Legislative Speech","volume":"24","author":[{"family":"Lauderdale","given":"Benjamin E."},{"family":"Herzog","given":"Alexander"}],"issued":{"date-parts":[["2016",7]]}}}],"schema":"https://github.com/citation-style-language/schema/raw/master/csl-citation.json"} </w:instrText>
       </w:r>
       <w:r>
         <w:rPr>
@@ -2695,7 +2704,13 @@
         <w:rPr>
           <w:rFonts w:ascii="Times New Roman" w:hAnsi="Times New Roman" w:cs="Times New Roman"/>
         </w:rPr>
-        <w:t xml:space="preserve"> relatively few recorded votes </w:t>
+        <w:t xml:space="preserve"> relatively few recorded votes</w:t>
+      </w:r>
+      <w:r>
+        <w:rPr>
+          <w:rFonts w:ascii="Times New Roman" w:hAnsi="Times New Roman" w:cs="Times New Roman"/>
+        </w:rPr>
+        <w:t xml:space="preserve"> </w:t>
       </w:r>
       <w:r>
         <w:rPr>
@@ -2707,7 +2722,7 @@
         <w:rPr>
           <w:rFonts w:ascii="Times New Roman" w:hAnsi="Times New Roman" w:cs="Times New Roman"/>
         </w:rPr>
-        <w:instrText xml:space="preserve"> ADDIN ZOTERO_ITEM CSL_CITATION {"citationID":"s0WXR8uw","properties":{"formattedCitation":"(Lauderdale and Herzog 2016)","plainCitation":"(Lauderdale and Herzog 2016)","noteIndex":0},"citationItems":[{"id":237,"uris":["http://zotero.org/groups/6681328/items/UFF3DLZ4"],"itemData":{"id":237,"type":"article-journal","abstract":"Existing approaches to measuring political disagreement from text data perform poorly except when applied to narrowly selected texts discussing the same issues and written in the same style. We demonstrate the first viable approach for estimating legislator-specific scores from the entire speech corpus of a legislature, while also producing extensive information about the evolution of speech polarization and politically loaded language. In the Irish Dáil, we show that the dominant dimension of speech variation is government–opposition, with ministers more extreme on this dimension than backbenchers, and a second dimension distinguishing between the establishment and anti-establishment opposition parties. In the U. S. Senate, we estimate a dimension that has moderate within-party correlations with scales based on roll-call votes and campaign donation patterns; however, we observe greater overlap across parties in speech positions than roll-call positions and partisan polarization in speeches varies more clearly in response to major political events.","container-title":"Political Analysis","DOI":"10.1093/pan/mpw017","ISSN":"1047-1987, 1476-4989","issue":"3","journalAbbreviation":"Polit. anal.","language":"en","license":"https://www.cambridge.org/core/terms","page":"374-394","source":"DOI.org (Crossref)","title":"Measuring Political Positions from Legislative Speech","volume":"24","author":[{"family":"Lauderdale","given":"Benjamin E."},{"family":"Herzog","given":"Alexander"}],"issued":{"date-parts":[["2016"]]}}}],"schema":"https://github.com/citation-style-language/schema/raw/master/csl-citation.json"} </w:instrText>
+        <w:instrText xml:space="preserve"> ADDIN ZOTERO_ITEM CSL_CITATION {"citationID":"yA7LoJ6D","properties":{"formattedCitation":"(Lauderdale and Herzog 2016)","plainCitation":"(Lauderdale and Herzog 2016)","noteIndex":0},"citationItems":[{"id":149,"uris":["http://zotero.org/groups/6681328/items/6AZ7VJB3"],"itemData":{"id":149,"type":"article-journal","abstract":"Existing approaches to measuring political disagreement from text data perform poorly except when applied to narrowly selected texts discussing the same issues and written in the same style. We demonstrate the first viable approach for estimating legislator-specific scores from the entire speech corpus of a legislature, while also producing extensive information about the evolution of speech polarization and politically loaded language. In the Irish Dáil, we show that the dominant dimension of speech variation is government–opposition, with ministers more extreme on this dimension than backbenchers, and a second dimension distinguishing between the establishment and anti-establishment opposition parties. In the U. S. Senate, we estimate a dimension that has moderate within-party correlations with scales based on roll-call votes and campaign donation patterns; however, we observe greater overlap across parties in speech positions than roll-call positions and partisan polarization in speeches varies more clearly in response to major political events.","container-title":"Political Analysis","DOI":"10.1093/pan/mpw017","ISSN":"1047-1987, 1476-4989","issue":"3","language":"en","page":"374-394","source":"Cambridge University Press","title":"Measuring Political Positions from Legislative Speech","volume":"24","author":[{"family":"Lauderdale","given":"Benjamin E."},{"family":"Herzog","given":"Alexander"}],"issued":{"date-parts":[["2016",7]]}}}],"schema":"https://github.com/citation-style-language/schema/raw/master/csl-citation.json"} </w:instrText>
       </w:r>
       <w:r>
         <w:rPr>
@@ -2825,7 +2840,7 @@
         <w:rPr>
           <w:rFonts w:ascii="Times New Roman" w:hAnsi="Times New Roman" w:cs="Times New Roman"/>
         </w:rPr>
-        <w:instrText xml:space="preserve"> ADDIN ZOTERO_ITEM CSL_CITATION {"citationID":"M9vbZadr","properties":{"formattedCitation":"(Green et al. 2024)","plainCitation":"(Green et al. 2024)","noteIndex":0},"citationItems":[{"id":236,"uris":["http://zotero.org/groups/6681328/items/AE9KUAJC"],"itemData":{"id":236,"type":"article-journal","abstract":"Legislative activity—whether votes or communications—is often represented in a single partisan or ideological dimension. But as lawmakers communicate in various venues (e.g., traditional, direct, or social media), the extent to which these estimates are interchangeable—reflecting a common underlying dimension—is unclear. We estimate a partisan dimension in members’ tweets, Facebook posts, e-newsletters, press releases, and one-minute House floor speeches for the 116th U.S. Congress and test the extent to which representations remain consistent across different venues. We find that while Democrats are consistently separable from Republicans, members’ relative intra-party positions frequently shift between venues. This is likely driven by differences in the affordances and audiences present in each venue, as venues with more nationalized audiences (such as social media) show higher levels of rhetorical polarization than venues with more local audiences (e-newsletters). These results suggest that the level of polarization we observe depends on where we look, and that the scholars of congressional communication should explicitly consider the input they use to measure partisanship.","container-title":"Political Research Quarterly","DOI":"10.1177/10659129241236685","ISSN":"1065-9129","issue":"3","language":"EN","page":"653-668","publisher":"SAGE Publications Inc","source":"SAGE Journals","title":"Cross-Platform Partisan Positioning in Congressional Speech","volume":"77","author":[{"family":"Green","given":"Jon"},{"family":"Shoub","given":"Kelsey"},{"family":"Blum","given":"Rachel"},{"family":"Cormack","given":"Lindsey"}],"issued":{"date-parts":[["2024",9,1]]}}}],"schema":"https://github.com/citation-style-language/schema/raw/master/csl-citation.json"} </w:instrText>
+        <w:instrText xml:space="preserve"> ADDIN ZOTERO_ITEM CSL_CITATION {"citationID":"6PJVAqp0","properties":{"formattedCitation":"(Green et al. 2024)","plainCitation":"(Green et al. 2024)","noteIndex":0},"citationItems":[{"id":236,"uris":["http://zotero.org/groups/6681328/items/AE9KUAJC"],"itemData":{"id":236,"type":"article-journal","abstract":"Legislative activity—whether votes or communications—is often represented in a single partisan or ideological dimension. But as lawmakers communicate in various venues (e.g., traditional, direct, or social media), the extent to which these estimates are interchangeable—reflecting a common underlying dimension—is unclear. We estimate a partisan dimension in members’ tweets, Facebook posts, e-newsletters, press releases, and one-minute House floor speeches for the 116th U.S. Congress and test the extent to which representations remain consistent across different venues. We find that while Democrats are consistently separable from Republicans, members’ relative intra-party positions frequently shift between venues. This is likely driven by differences in the affordances and audiences present in each venue, as venues with more nationalized audiences (such as social media) show higher levels of rhetorical polarization than venues with more local audiences (e-newsletters). These results suggest that the level of polarization we observe depends on where we look, and that the scholars of congressional communication should explicitly consider the input they use to measure partisanship.","container-title":"Political Research Quarterly","DOI":"10.1177/10659129241236685","ISSN":"1065-9129","issue":"3","language":"EN","page":"653-668","publisher":"SAGE Publications Inc","source":"SAGE Journals","title":"Cross-Platform Partisan Positioning in Congressional Speech","volume":"77","author":[{"family":"Green","given":"Jon"},{"family":"Shoub","given":"Kelsey"},{"family":"Blum","given":"Rachel"},{"family":"Cormack","given":"Lindsey"}],"issued":{"date-parts":[["2024",9,1]]}}}],"schema":"https://github.com/citation-style-language/schema/raw/master/csl-citation.json"} </w:instrText>
       </w:r>
       <w:r>
         <w:rPr>
@@ -2863,7 +2878,21 @@
         <w:rPr>
           <w:rFonts w:ascii="Times New Roman" w:hAnsi="Times New Roman" w:cs="Times New Roman"/>
         </w:rPr>
-        <w:t xml:space="preserve">The interpretation of these estimates also depends on which texts and words are selected. Wordfish, another text-based method, estimates a single dimension, so the input texts need to reflect the policy distinction being examined. In German manifestos from 1969–2005, including all words produced estimated party movements dominated by changes in the </w:t>
+        <w:t xml:space="preserve">The interpretation of these estimates also depends on which texts and words are selected. </w:t>
+      </w:r>
+      <w:proofErr w:type="spellStart"/>
+      <w:r>
+        <w:rPr>
+          <w:rFonts w:ascii="Times New Roman" w:hAnsi="Times New Roman" w:cs="Times New Roman"/>
+        </w:rPr>
+        <w:t>Wordfish</w:t>
+      </w:r>
+      <w:proofErr w:type="spellEnd"/>
+      <w:r>
+        <w:rPr>
+          <w:rFonts w:ascii="Times New Roman" w:hAnsi="Times New Roman" w:cs="Times New Roman"/>
+        </w:rPr>
+        <w:t xml:space="preserve">, another text-based method, estimates a single dimension, so the input texts need to reflect the policy distinction being examined. In German manifestos from 1969–2005, including all words produced estimated party movements dominated by changes in the </w:t>
       </w:r>
       <w:r>
         <w:rPr>
@@ -2882,7 +2911,7 @@
         <w:rPr>
           <w:rFonts w:ascii="Times New Roman" w:hAnsi="Times New Roman" w:cs="Times New Roman"/>
         </w:rPr>
-        <w:instrText xml:space="preserve"> ADDIN ZOTERO_ITEM CSL_CITATION {"citationID":"SfqigJkV","properties":{"formattedCitation":"(Proksch and Slapin 2009)","plainCitation":"(Proksch and Slapin 2009)","noteIndex":0},"citationItems":[{"id":279,"uris":["http://zotero.org/groups/6681328/items/W9E4TYSG"],"itemData":{"id":279,"type":"article-journal","container-title":"German Politics","DOI":"10.1080/09644000903055799","ISSN":"0964-4008, 1743-8993","issue":"3","journalAbbreviation":"German Politics","language":"en","page":"323-344","source":"DOI.org (Crossref)","title":"How to Avoid Pitfalls in Statistical Analysis of Political Texts: The Case of Germany","title-short":"How to Avoid Pitfalls in Statistical Analysis of Political Texts","volume":"18","author":[{"family":"Proksch","given":"Sven-Oliver"},{"family":"Slapin","given":"Jonathan B."}],"issued":{"date-parts":[["2009",9]]}}}],"schema":"https://github.com/citation-style-language/schema/raw/master/csl-citation.json"} </w:instrText>
+        <w:instrText xml:space="preserve"> ADDIN ZOTERO_ITEM CSL_CITATION {"citationID":"zkfFmLcJ","properties":{"formattedCitation":"(Proksch and Slapin 2009)","plainCitation":"(Proksch and Slapin 2009)","noteIndex":0},"citationItems":[{"id":279,"uris":["http://zotero.org/groups/6681328/items/W9E4TYSG"],"itemData":{"id":279,"type":"article-journal","container-title":"German Politics","DOI":"10.1080/09644000903055799","ISSN":"0964-4008, 1743-8993","issue":"3","journalAbbreviation":"German Politics","language":"en","page":"323-344","source":"DOI.org (Crossref)","title":"How to Avoid Pitfalls in Statistical Analysis of Political Texts: The Case of Germany","title-short":"How to Avoid Pitfalls in Statistical Analysis of Political Texts","volume":"18","author":[{"family":"Proksch","given":"Sven-Oliver"},{"family":"Slapin","given":"Jonathan B."}],"issued":{"date-parts":[["2009",9]]}}}],"schema":"https://github.com/citation-style-language/schema/raw/master/csl-citation.json"} </w:instrText>
       </w:r>
       <w:r>
         <w:rPr>
@@ -2894,7 +2923,21 @@
         <w:rPr>
           <w:rFonts w:ascii="Times New Roman" w:hAnsi="Times New Roman" w:cs="Times New Roman"/>
         </w:rPr>
-        <w:t>(Proksch and Slapin 2009)</w:t>
+        <w:t xml:space="preserve">(Proksch and </w:t>
+      </w:r>
+      <w:proofErr w:type="spellStart"/>
+      <w:r>
+        <w:rPr>
+          <w:rFonts w:ascii="Times New Roman" w:hAnsi="Times New Roman" w:cs="Times New Roman"/>
+        </w:rPr>
+        <w:t>Slapin</w:t>
+      </w:r>
+      <w:proofErr w:type="spellEnd"/>
+      <w:r>
+        <w:rPr>
+          <w:rFonts w:ascii="Times New Roman" w:hAnsi="Times New Roman" w:cs="Times New Roman"/>
+        </w:rPr>
+        <w:t xml:space="preserve"> 2009)</w:t>
       </w:r>
       <w:r>
         <w:rPr>
@@ -2932,7 +2975,7 @@
         <w:rPr>
           <w:rFonts w:ascii="Times New Roman" w:hAnsi="Times New Roman" w:cs="Times New Roman"/>
         </w:rPr>
-        <w:instrText xml:space="preserve"> ADDIN ZOTERO_ITEM CSL_CITATION {"citationID":"incdo66S","properties":{"formattedCitation":"(Goet 2019)","plainCitation":"(Goet 2019)","noteIndex":0},"citationItems":[{"id":153,"uris":["http://zotero.org/groups/6681328/items/YDWDQ6XE"],"itemData":{"id":153,"type":"article-journal","abstract":"Political scientists can rely on a long tradition of applying unsupervised measurement models to estimate ideology and preferences from texts. However, in practice the hope that the dominant source of variation in their data is the quantity of interest is often not realized. In this paper, I argue that in the messy world of speeches we have to rely on supervised approaches that include information on party affiliation in order to produce meaningful estimates of polarization. To substantiate this argument, I introduce a validation framework that may be used to comparatively assess supervised and unsupervised methods, and estimate polarization on the basis of 6.2 million records of parliamentary speeches from the UK House of Commons over the period 1811–2015. Beyond introducing several important adjustments to existing estimation approaches, the paper’s methodological contribution therefore consists of outlining the challenges of applying unsupervised estimation techniques to speech data, and arguing in detail why we should instead rely on supervised methods to measure polarization.","container-title":"Political Analysis","DOI":"10.1017/pan.2019.2","ISSN":"1047-1987, 1476-4989","issue":"4","language":"en","page":"518-539","source":"Cambridge University Press","title":"Measuring Polarization with Text Analysis: Evidence from the UK House of Commons, 1811–2015","title-short":"Measuring Polarization with Text Analysis","volume":"27","author":[{"family":"Goet","given":"Niels D."}],"issued":{"date-parts":[["2019",10]]}}}],"schema":"https://github.com/citation-style-language/schema/raw/master/csl-citation.json"} </w:instrText>
+        <w:instrText xml:space="preserve"> ADDIN ZOTERO_ITEM CSL_CITATION {"citationID":"Pgk3l4V8","properties":{"formattedCitation":"(Goet 2019)","plainCitation":"(Goet 2019)","noteIndex":0},"citationItems":[{"id":153,"uris":["http://zotero.org/groups/6681328/items/YDWDQ6XE"],"itemData":{"id":153,"type":"article-journal","abstract":"Political scientists can rely on a long tradition of applying unsupervised measurement models to estimate ideology and preferences from texts. However, in practice the hope that the dominant source of variation in their data is the quantity of interest is often not realized. In this paper, I argue that in the messy world of speeches we have to rely on supervised approaches that include information on party affiliation in order to produce meaningful estimates of polarization. To substantiate this argument, I introduce a validation framework that may be used to comparatively assess supervised and unsupervised methods, and estimate polarization on the basis of 6.2 million records of parliamentary speeches from the UK House of Commons over the period 1811–2015. Beyond introducing several important adjustments to existing estimation approaches, the paper’s methodological contribution therefore consists of outlining the challenges of applying unsupervised estimation techniques to speech data, and arguing in detail why we should instead rely on supervised methods to measure polarization.","container-title":"Political Analysis","DOI":"10.1017/pan.2019.2","ISSN":"1047-1987, 1476-4989","issue":"4","language":"en","page":"518-539","source":"Cambridge University Press","title":"Measuring Polarization with Text Analysis: Evidence from the UK House of Commons, 1811–2015","title-short":"Measuring Polarization with Text Analysis","volume":"27","author":[{"family":"Goet","given":"Niels D."}],"issued":{"date-parts":[["2019",10]]}}}],"schema":"https://github.com/citation-style-language/schema/raw/master/csl-citation.json"} </w:instrText>
       </w:r>
       <w:r>
         <w:rPr>
@@ -2944,7 +2987,21 @@
         <w:rPr>
           <w:rFonts w:ascii="Times New Roman" w:hAnsi="Times New Roman" w:cs="Times New Roman"/>
         </w:rPr>
-        <w:t>(Goet 2019)</w:t>
+        <w:t>(</w:t>
+      </w:r>
+      <w:proofErr w:type="spellStart"/>
+      <w:r>
+        <w:rPr>
+          <w:rFonts w:ascii="Times New Roman" w:hAnsi="Times New Roman" w:cs="Times New Roman"/>
+        </w:rPr>
+        <w:t>Goet</w:t>
+      </w:r>
+      <w:proofErr w:type="spellEnd"/>
+      <w:r>
+        <w:rPr>
+          <w:rFonts w:ascii="Times New Roman" w:hAnsi="Times New Roman" w:cs="Times New Roman"/>
+        </w:rPr>
+        <w:t xml:space="preserve"> 2019)</w:t>
       </w:r>
       <w:r>
         <w:rPr>
@@ -3054,7 +3111,7 @@
         <w:rPr>
           <w:rFonts w:ascii="Times New Roman" w:hAnsi="Times New Roman" w:cs="Times New Roman"/>
         </w:rPr>
-        <w:instrText xml:space="preserve"> ADDIN ZOTERO_ITEM CSL_CITATION {"citationID":"Mxep0uFj","properties":{"formattedCitation":"(Benoit et al. 2026; Le Mens and Gallego 2025)","plainCitation":"(Benoit et al. 2026; Le Mens and Gallego 2025)","noteIndex":0},"citationItems":[{"id":252,"uris":["http://zotero.org/groups/6681328/items/IW425C33"],"itemData":{"id":252,"type":"article-journal","abstract":"Large language models (LLMs) offer scalable alternatives to human experts when analyzing political texts for meaning, using natural language understanding (NLU). Qualitative NLU methods relying on human experts are severely limited by cost and scalability. Statistical text-as-data methods are scalable but rely on strong and often unrealistic assumptions. We propose a systematic, scalable, and replicable method that can extend existing qualitative and quantitative approaches by using LLMs to interpret texts meaningfully rather than as mere data. Our ensemble means of LLMgenerated estimates of party positions on six key issue dimensions correlate highly with equivalent mean ratings by country specialists. When applied to coalition policy declarations, LLM estimates align more closely with standard models of government formation than hand-coded estimates. We conclude with a discussion of the profound implications of modern LLMs for political text analysis.","container-title":"American Journal of Political Science","DOI":"10.1111/ajps.70050","ISSN":"0092-5853, 1540-5907","journalAbbreviation":"American J Political Sci","language":"en","page":"ajps.70050","source":"DOI.org (Crossref)","title":"Using large language models to analyze political texts through natural language understanding","author":[{"family":"Benoit","given":"Kenneth"},{"family":"De Marchi","given":"Scott"},{"family":"Laver","given":"Conor"},{"family":"Laver","given":"Michael"},{"family":"Ma","given":"Jinshuai"}],"issued":{"date-parts":[["2026",3,19]]}}},{"id":396,"uris":["http://zotero.org/groups/6681328/items/PPPXRPUR"],"itemData":{"id":396,"type":"article-journal","abstract":"We use instruction-tuned large language models (LLMs) like GPT-4, Llama 3, MiXtral, or Aya to position political texts within policy and ideological spaces. We ask an LLM where a tweet or a sentence of a political text stands on the focal dimension and take the average of the LLM responses to position political actors such as US Senators, or longer texts such as UK party manifestos or EU policy speeches given in 10 different languages. The correlations between the position estimates obtained with the best LLMs and benchmarks based on text coding by experts, crowdworkers, or roll call votes exceed .90. This approach is generally more accurate than the positions obtained with supervised classifiers trained on large amounts of research data. Using instruction-tuned LLMs to position texts in policy and ideological spaces is fast, cost-efficient, reliable, and reproducible (in the case of open LLMs) even if the texts are short and written in different languages. We conclude with cautionary notes about the need for empirical validation.","container-title":"Political Analysis","DOI":"10.1017/pan.2024.29","ISSN":"1047-1987, 1476-4989","issue":"3","journalAbbreviation":"Polit. Anal.","language":"en","license":"https://creativecommons.org/licenses/by/4.0","page":"274-282","source":"DOI.org (Crossref)","title":"Positioning Political Texts with Large Language Models by Asking and Averaging","volume":"33","author":[{"family":"Le Mens","given":"Gaël"},{"family":"Gallego","given":"Aina"}],"issued":{"date-parts":[["2025",7]]}}}],"schema":"https://github.com/citation-style-language/schema/raw/master/csl-citation.json"} </w:instrText>
+        <w:instrText xml:space="preserve"> ADDIN ZOTERO_ITEM CSL_CITATION {"citationID":"h1GQVAtM","properties":{"formattedCitation":"(Le Mens and Gallego 2025; Benoit et al. 2026)","plainCitation":"(Le Mens and Gallego 2025; Benoit et al. 2026)","noteIndex":0},"citationItems":[{"id":302,"uris":["http://zotero.org/groups/6681328/items/JFE2NQTG"],"itemData":{"id":302,"type":"article-journal","abstract":"We use instruction-tuned large language models (LLMs) like GPT-4, Llama 3, MiXtral, or Aya to position political texts within policy and ideological spaces. We ask an LLM where a tweet or a sentence of a political text stands on the focal dimension and take the average of the LLM responses to position political actors such as US Senators, or longer texts such as UK party manifestos or EU policy speeches given in 10 different languages. The correlations between the position estimates obtained with the best LLMs and benchmarks based on text coding by experts, crowdworkers, or roll call votes exceed .90. This approach is generally more accurate than the positions obtained with supervised classifiers trained on large amounts of research data. Using instruction-tuned LLMs to position texts in policy and ideological spaces is fast, cost-efficient, reliable, and reproducible (in the case of open LLMs) even if the texts are short and written in different languages. We conclude with cautionary notes about the need for empirical validation.","container-title":"Political Analysis","DOI":"10.1017/pan.2024.29","ISSN":"1047-1987, 1476-4989","issue":"3","language":"en","page":"274-282","source":"Cambridge University Press","title":"Positioning Political Texts with Large Language Models by Asking and Averaging","volume":"33","author":[{"family":"Le Mens","given":"Gaël"},{"family":"Gallego","given":"Aina"}],"issued":{"date-parts":[["2025",7]]}}},{"id":240,"uris":["http://zotero.org/groups/6681328/items/IW425C33"],"itemData":{"id":240,"type":"article-journal","abstract":"Large language models (LLMs) offer scalable alternatives to human experts when analyzing political texts for meaning, using natural language understanding (NLU). Qualitative NLU methods relying on human experts are severely limited by cost and scalability. Statistical text-as-data methods are scalable but rely on strong and often unrealistic assumptions. We propose a systematic, scalable, and replicable method that can extend existing qualitative and quantitative approaches by using LLMs to interpret texts meaningfully rather than as mere data. Our ensemble means of LLMgenerated estimates of party positions on six key issue dimensions correlate highly with equivalent mean ratings by country specialists. When applied to coalition policy declarations, LLM estimates align more closely with standard models of government formation than hand-coded estimates. We conclude with a discussion of the profound implications of modern LLMs for political text analysis.","container-title":"American Journal of Political Science","DOI":"10.1111/ajps.70050","ISSN":"0092-5853, 1540-5907","journalAbbreviation":"American J Political Sci","language":"en","page":"ajps.70050","source":"DOI.org (Crossref)","title":"Using large language models to analyze political texts through natural language understanding","author":[{"family":"Benoit","given":"Kenneth"},{"family":"De Marchi","given":"Scott"},{"family":"Laver","given":"Conor"},{"family":"Laver","given":"Michael"},{"family":"Ma","given":"Jinshuai"}],"issued":{"date-parts":[["2026",3,19]]}}}],"schema":"https://github.com/citation-style-language/schema/raw/master/csl-citation.json"} </w:instrText>
       </w:r>
       <w:r>
         <w:rPr>
@@ -3065,9 +3122,22 @@
       <w:r>
         <w:rPr>
           <w:rFonts w:ascii="Times New Roman" w:hAnsi="Times New Roman" w:cs="Times New Roman"/>
-          <w:noProof/>
-        </w:rPr>
-        <w:t>(Benoit et al. 2026; Le Mens and Gallego 2025)</w:t>
+        </w:rPr>
+        <w:t xml:space="preserve">(Le </w:t>
+      </w:r>
+      <w:proofErr w:type="spellStart"/>
+      <w:r>
+        <w:rPr>
+          <w:rFonts w:ascii="Times New Roman" w:hAnsi="Times New Roman" w:cs="Times New Roman"/>
+        </w:rPr>
+        <w:t>Mens</w:t>
+      </w:r>
+      <w:proofErr w:type="spellEnd"/>
+      <w:r>
+        <w:rPr>
+          <w:rFonts w:ascii="Times New Roman" w:hAnsi="Times New Roman" w:cs="Times New Roman"/>
+        </w:rPr>
+        <w:t xml:space="preserve"> and Gallego 2025; Benoit et al. 2026)</w:t>
       </w:r>
       <w:r>
         <w:rPr>
@@ -3219,7 +3289,33 @@
         <w:rPr>
           <w:rFonts w:ascii="Times New Roman" w:hAnsi="Times New Roman" w:cs="Times New Roman"/>
         </w:rPr>
-        <w:t>Averaged LLM scores correlate with expert, crowdworker and roll-call benchmarks and outperform the supervised classifiers used for comparison, despite their training on large labelled datasets. Direct prompting allows the LLM to score a text on a dimension chosen by the researcher, with scores averaged to estimate political actors’ positions</w:t>
+        <w:t xml:space="preserve">Averaged LLM scores correlate with expert, </w:t>
+      </w:r>
+      <w:proofErr w:type="spellStart"/>
+      <w:r>
+        <w:rPr>
+          <w:rFonts w:ascii="Times New Roman" w:hAnsi="Times New Roman" w:cs="Times New Roman"/>
+        </w:rPr>
+        <w:t>crowdworker</w:t>
+      </w:r>
+      <w:proofErr w:type="spellEnd"/>
+      <w:r>
+        <w:rPr>
+          <w:rFonts w:ascii="Times New Roman" w:hAnsi="Times New Roman" w:cs="Times New Roman"/>
+        </w:rPr>
+        <w:t xml:space="preserve"> and roll-call benchmarks and outperform the supervised classifiers used for comparison, despite their training on </w:t>
+      </w:r>
+      <w:r>
+        <w:rPr>
+          <w:rFonts w:ascii="Times New Roman" w:hAnsi="Times New Roman" w:cs="Times New Roman"/>
+        </w:rPr>
+        <w:t>large, labelled</w:t>
+      </w:r>
+      <w:r>
+        <w:rPr>
+          <w:rFonts w:ascii="Times New Roman" w:hAnsi="Times New Roman" w:cs="Times New Roman"/>
+        </w:rPr>
+        <w:t xml:space="preserve"> datasets. Direct prompting allows the LLM to score a text on a dimension chosen by the researcher, with scores averaged to estimate political actors’ positions</w:t>
       </w:r>
       <w:r>
         <w:rPr>
@@ -3237,7 +3333,7 @@
         <w:rPr>
           <w:rFonts w:ascii="Times New Roman" w:hAnsi="Times New Roman" w:cs="Times New Roman"/>
         </w:rPr>
-        <w:instrText xml:space="preserve"> ADDIN ZOTERO_ITEM CSL_CITATION {"citationID":"FkjLQJPG","properties":{"formattedCitation":"(Le Mens and Gallego 2025)","plainCitation":"(Le Mens and Gallego 2025)","noteIndex":0},"citationItems":[{"id":396,"uris":["http://zotero.org/groups/6681328/items/PPPXRPUR"],"itemData":{"id":396,"type":"article-journal","abstract":"We use instruction-tuned large language models (LLMs) like GPT-4, Llama 3, MiXtral, or Aya to position political texts within policy and ideological spaces. We ask an LLM where a tweet or a sentence of a political text stands on the focal dimension and take the average of the LLM responses to position political actors such as US Senators, or longer texts such as UK party manifestos or EU policy speeches given in 10 different languages. The correlations between the position estimates obtained with the best LLMs and benchmarks based on text coding by experts, crowdworkers, or roll call votes exceed .90. This approach is generally more accurate than the positions obtained with supervised classifiers trained on large amounts of research data. Using instruction-tuned LLMs to position texts in policy and ideological spaces is fast, cost-efficient, reliable, and reproducible (in the case of open LLMs) even if the texts are short and written in different languages. We conclude with cautionary notes about the need for empirical validation.","container-title":"Political Analysis","DOI":"10.1017/pan.2024.29","ISSN":"1047-1987, 1476-4989","issue":"3","journalAbbreviation":"Polit. Anal.","language":"en","license":"https://creativecommons.org/licenses/by/4.0","page":"274-282","source":"DOI.org (Crossref)","title":"Positioning Political Texts with Large Language Models by Asking and Averaging","volume":"33","author":[{"family":"Le Mens","given":"Gaël"},{"family":"Gallego","given":"Aina"}],"issued":{"date-parts":[["2025",7]]}}}],"schema":"https://github.com/citation-style-language/schema/raw/master/csl-citation.json"} </w:instrText>
+        <w:instrText xml:space="preserve"> ADDIN ZOTERO_ITEM CSL_CITATION {"citationID":"eFXwtdMJ","properties":{"formattedCitation":"(Le Mens and Gallego 2025)","plainCitation":"(Le Mens and Gallego 2025)","noteIndex":0},"citationItems":[{"id":302,"uris":["http://zotero.org/groups/6681328/items/JFE2NQTG"],"itemData":{"id":302,"type":"article-journal","abstract":"We use instruction-tuned large language models (LLMs) like GPT-4, Llama 3, MiXtral, or Aya to position political texts within policy and ideological spaces. We ask an LLM where a tweet or a sentence of a political text stands on the focal dimension and take the average of the LLM responses to position political actors such as US Senators, or longer texts such as UK party manifestos or EU policy speeches given in 10 different languages. The correlations between the position estimates obtained with the best LLMs and benchmarks based on text coding by experts, crowdworkers, or roll call votes exceed .90. This approach is generally more accurate than the positions obtained with supervised classifiers trained on large amounts of research data. Using instruction-tuned LLMs to position texts in policy and ideological spaces is fast, cost-efficient, reliable, and reproducible (in the case of open LLMs) even if the texts are short and written in different languages. We conclude with cautionary notes about the need for empirical validation.","container-title":"Political Analysis","DOI":"10.1017/pan.2024.29","ISSN":"1047-1987, 1476-4989","issue":"3","language":"en","page":"274-282","source":"Cambridge University Press","title":"Positioning Political Texts with Large Language Models by Asking and Averaging","volume":"33","author":[{"family":"Le Mens","given":"Gaël"},{"family":"Gallego","given":"Aina"}],"issued":{"date-parts":[["2025",7]]}}}],"schema":"https://github.com/citation-style-language/schema/raw/master/csl-citation.json"} </w:instrText>
       </w:r>
       <w:r>
         <w:rPr>
@@ -3248,9 +3344,22 @@
       <w:r>
         <w:rPr>
           <w:rFonts w:ascii="Times New Roman" w:hAnsi="Times New Roman" w:cs="Times New Roman"/>
-          <w:noProof/>
-        </w:rPr>
-        <w:t>(Le Mens and Gallego 2025)</w:t>
+        </w:rPr>
+        <w:t xml:space="preserve">(Le </w:t>
+      </w:r>
+      <w:proofErr w:type="spellStart"/>
+      <w:r>
+        <w:rPr>
+          <w:rFonts w:ascii="Times New Roman" w:hAnsi="Times New Roman" w:cs="Times New Roman"/>
+        </w:rPr>
+        <w:t>Mens</w:t>
+      </w:r>
+      <w:proofErr w:type="spellEnd"/>
+      <w:r>
+        <w:rPr>
+          <w:rFonts w:ascii="Times New Roman" w:hAnsi="Times New Roman" w:cs="Times New Roman"/>
+        </w:rPr>
+        <w:t xml:space="preserve"> and Gallego 2025)</w:t>
       </w:r>
       <w:r>
         <w:rPr>
@@ -3292,7 +3401,7 @@
         <w:rPr>
           <w:rFonts w:ascii="Times New Roman" w:hAnsi="Times New Roman" w:cs="Times New Roman"/>
         </w:rPr>
-        <w:instrText xml:space="preserve"> ADDIN ZOTERO_ITEM CSL_CITATION {"citationID":"cgJBTNET","properties":{"formattedCitation":"(Ornstein, Blasingame, and Truscott 2025)","plainCitation":"(Ornstein, Blasingame, and Truscott 2025)","noteIndex":0},"citationItems":[{"id":354,"uris":["http://zotero.org/groups/6681328/items/Z9MD2RRI"],"itemData":{"id":354,"type":"article-journal","abstract":"We demonstrate how few-shot prompts to large language models (LLMs) can be effectively applied to a wide range of text-as-data tasks in political science—including sentiment analysis, document scaling, and topic modeling. In a series of pre-registered analyses, this approach outperforms conventional supervised learning methods without the need for extensive data pre-processing or large sets of labeled training data. Performance is comparable to expert and crowd-coding methods at a fraction of the cost. We propose a set of best practices for adapting these models to social science measurement tasks, and develop an open-source software package for researchers.","container-title":"Political Science Research and Methods","DOI":"10.1017/psrm.2024.64","ISSN":"2049-8470, 2049-8489","issue":"2","language":"en","page":"264-281","source":"Cambridge University Press","title":"How to train your stochastic parrot: large language models for political texts","title-short":"How to train your stochastic parrot","volume":"13","author":[{"family":"Ornstein","given":"Joseph T."},{"family":"Blasingame","given":"Elise N."},{"family":"Truscott","given":"Jake S."}],"issued":{"date-parts":[["2025",4]]}}}],"schema":"https://github.com/citation-style-language/schema/raw/master/csl-citation.json"} </w:instrText>
+        <w:instrText xml:space="preserve"> ADDIN ZOTERO_ITEM CSL_CITATION {"citationID":"sgxjmYzR","properties":{"formattedCitation":"(Ornstein, Blasingame, and Truscott 2025)","plainCitation":"(Ornstein, Blasingame, and Truscott 2025)","noteIndex":0},"citationItems":[{"id":241,"uris":["http://zotero.org/groups/6681328/items/5FATWLDD"],"itemData":{"id":241,"type":"article-journal","abstract":"We demonstrate how few-shot prompts to large language models (LLMs) can be effectively applied to a wide range of text-as-data tasks in political science—including sentiment analysis, document scaling, and topic modeling. In a series of pre-registered analyses, this approach outperforms conventional supervised learning methods without the need for extensive data pre-processing or large sets of labeled training data. Performance is comparable to expert and crowd-coding methods at a fraction of the cost. We propose a set of best practices for adapting these models to social science measurement tasks, and develop an opensource software package for researchers.","container-title":"Political Science Research and Methods","DOI":"10.1017/psrm.2024.64","ISSN":"2049-8470, 2049-8489","issue":"2","journalAbbreviation":"PSRM","language":"en","license":"http://creativecommons.org/licenses/by/4.0/","page":"264-281","source":"DOI.org (Crossref)","title":"How to train your stochastic parrot: large language models for political texts","title-short":"How to train your stochastic parrot","volume":"13","author":[{"family":"Ornstein","given":"Joseph T."},{"family":"Blasingame","given":"Elise N."},{"family":"Truscott","given":"Jake S."}],"issued":{"date-parts":[["2025",4]]}}}],"schema":"https://github.com/citation-style-language/schema/raw/master/csl-citation.json"} </w:instrText>
       </w:r>
       <w:r>
         <w:rPr>
@@ -3509,7 +3618,21 @@
         <w:rPr>
           <w:rFonts w:ascii="Times New Roman" w:hAnsi="Times New Roman" w:cs="Times New Roman"/>
         </w:rPr>
-        <w:t xml:space="preserve"> These applications concern particular issues and stances rather than a general liberal–conservative position.</w:t>
+        <w:t xml:space="preserve"> These applications concern </w:t>
+      </w:r>
+      <w:proofErr w:type="gramStart"/>
+      <w:r>
+        <w:rPr>
+          <w:rFonts w:ascii="Times New Roman" w:hAnsi="Times New Roman" w:cs="Times New Roman"/>
+        </w:rPr>
+        <w:t>particular issues</w:t>
+      </w:r>
+      <w:proofErr w:type="gramEnd"/>
+      <w:r>
+        <w:rPr>
+          <w:rFonts w:ascii="Times New Roman" w:hAnsi="Times New Roman" w:cs="Times New Roman"/>
+        </w:rPr>
+        <w:t xml:space="preserve"> and stances rather than a general liberal–conservative position.</w:t>
       </w:r>
     </w:p>
     <w:p>
@@ -3615,7 +3738,21 @@
         <w:rPr>
           <w:rFonts w:ascii="Times New Roman" w:hAnsi="Times New Roman" w:cs="Times New Roman"/>
         </w:rPr>
-        <w:t>Positions on particular issues can also be estimated from parliamentary speech. Representation-based methods use embeddings of representatives’ speech and reference points representing support and opposition to place individual representatives on an axis of the researcher’s choosing, including defence and nuclear energy in a Japanese application</w:t>
+        <w:t xml:space="preserve">Positions on </w:t>
+      </w:r>
+      <w:proofErr w:type="gramStart"/>
+      <w:r>
+        <w:rPr>
+          <w:rFonts w:ascii="Times New Roman" w:hAnsi="Times New Roman" w:cs="Times New Roman"/>
+        </w:rPr>
+        <w:t>particular issues</w:t>
+      </w:r>
+      <w:proofErr w:type="gramEnd"/>
+      <w:r>
+        <w:rPr>
+          <w:rFonts w:ascii="Times New Roman" w:hAnsi="Times New Roman" w:cs="Times New Roman"/>
+        </w:rPr>
+        <w:t xml:space="preserve"> can also be estimated from parliamentary speech. Representation-based methods use embeddings of representatives’ speech and reference points representing support and opposition to place individual representatives on an axis of the researcher’s choosing, including defence and nuclear energy in a Japanese application</w:t>
       </w:r>
       <w:r>
         <w:rPr>
@@ -3972,7 +4109,21 @@
         <w:rPr>
           <w:rFonts w:ascii="Times New Roman" w:hAnsi="Times New Roman" w:cs="Times New Roman"/>
         </w:rPr>
-        <w:t xml:space="preserve">Performance also depends on the coding task. On classification tasks, LLMs do not consistently outperform the strongest task-specific models but can agree well with humans, while some free-form generation tasks receive favourable evaluations relative to crowdworker references </w:t>
+        <w:t xml:space="preserve">Performance also depends on the coding task. On classification tasks, LLMs do not consistently outperform the strongest task-specific models but can agree well with humans, while some free-form generation tasks receive favourable evaluations relative to </w:t>
+      </w:r>
+      <w:proofErr w:type="spellStart"/>
+      <w:r>
+        <w:rPr>
+          <w:rFonts w:ascii="Times New Roman" w:hAnsi="Times New Roman" w:cs="Times New Roman"/>
+        </w:rPr>
+        <w:t>crowdworker</w:t>
+      </w:r>
+      <w:proofErr w:type="spellEnd"/>
+      <w:r>
+        <w:rPr>
+          <w:rFonts w:ascii="Times New Roman" w:hAnsi="Times New Roman" w:cs="Times New Roman"/>
+        </w:rPr>
+        <w:t xml:space="preserve"> references </w:t>
       </w:r>
       <w:r>
         <w:rPr>
@@ -3984,7 +4135,7 @@
         <w:rPr>
           <w:rFonts w:ascii="Times New Roman" w:hAnsi="Times New Roman" w:cs="Times New Roman"/>
         </w:rPr>
-        <w:instrText xml:space="preserve"> ADDIN ZOTERO_ITEM CSL_CITATION {"citationID":"zoShS2hn","properties":{"formattedCitation":"(Ziems et al. 2024)","plainCitation":"(Ziems et al. 2024)","noteIndex":0},"citationItems":[{"id":387,"uris":["http://zotero.org/groups/6681328/items/BBUJX9UZ"],"itemData":{"id":387,"type":"article-journal","abstract":"Abstract\n            Large language models (LLMs) are capable of successfully performing many language processing tasks zero-shot (without training data). If zero-shot LLMs can also reliably classify and explain social phenomena like persuasiveness and political ideology, then LLMs could augment the computational social science (CSS) pipeline in important ways. This work provides a road map for using LLMs as CSS tools. Towards this end, we contribute a set of prompting best practices and an extensive evaluation pipeline to measure the zero-shot performance of 13 language models on 25 representative English CSS benchmarks. On taxonomic labeling tasks (classification), LLMs fail to outperform the best fine-tuned models but still achieve fair levels of agreement with humans. On free-form coding tasks (generation), LLMs produce explanations that often exceed the quality of crowdworkers’ gold references. We conclude that the performance of today’s LLMs can augment the CSS research pipeline in two ways: (1) serving as zero-shot data annotators on human annotation teams, and (2) bootstrapping challenging creative generation tasks (e.g., explaining the underlying attributes of a text). In summary, LLMs are posed to meaningfully participate in social science analysis in partnership with humans.","container-title":"Computational Linguistics","DOI":"10.1162/coli_a_00502","ISSN":"0891-2017, 1530-9312","issue":"1","language":"en","page":"237-291","source":"DOI.org (Crossref)","title":"Can Large Language Models Transform Computational Social Science?","volume":"50","author":[{"family":"Ziems","given":"Caleb"},{"family":"Held","given":"William"},{"family":"Shaikh","given":"Omar"},{"family":"Chen","given":"Jiaao"},{"family":"Zhang","given":"Zhehao"},{"family":"Yang","given":"Diyi"}],"issued":{"date-parts":[["2024",3,1]]}}}],"schema":"https://github.com/citation-style-language/schema/raw/master/csl-citation.json"} </w:instrText>
+        <w:instrText xml:space="preserve"> ADDIN ZOTERO_ITEM CSL_CITATION {"citationID":"8dyQXZH6","properties":{"formattedCitation":"(Ziems et al. 2024)","plainCitation":"(Ziems et al. 2024)","noteIndex":0},"citationItems":[{"id":387,"uris":["http://zotero.org/groups/6681328/items/BBUJX9UZ"],"itemData":{"id":387,"type":"article-journal","abstract":"Abstract\n            Large language models (LLMs) are capable of successfully performing many language processing tasks zero-shot (without training data). If zero-shot LLMs can also reliably classify and explain social phenomena like persuasiveness and political ideology, then LLMs could augment the computational social science (CSS) pipeline in important ways. This work provides a road map for using LLMs as CSS tools. Towards this end, we contribute a set of prompting best practices and an extensive evaluation pipeline to measure the zero-shot performance of 13 language models on 25 representative English CSS benchmarks. On taxonomic labeling tasks (classification), LLMs fail to outperform the best fine-tuned models but still achieve fair levels of agreement with humans. On free-form coding tasks (generation), LLMs produce explanations that often exceed the quality of crowdworkers’ gold references. We conclude that the performance of today’s LLMs can augment the CSS research pipeline in two ways: (1) serving as zero-shot data annotators on human annotation teams, and (2) bootstrapping challenging creative generation tasks (e.g., explaining the underlying attributes of a text). In summary, LLMs are posed to meaningfully participate in social science analysis in partnership with humans.","container-title":"Computational Linguistics","DOI":"10.1162/coli_a_00502","ISSN":"0891-2017, 1530-9312","issue":"1","language":"en","page":"237-291","source":"DOI.org (Crossref)","title":"Can Large Language Models Transform Computational Social Science?","volume":"50","author":[{"family":"Ziems","given":"Caleb"},{"family":"Held","given":"William"},{"family":"Shaikh","given":"Omar"},{"family":"Chen","given":"Jiaao"},{"family":"Zhang","given":"Zhehao"},{"family":"Yang","given":"Diyi"}],"issued":{"date-parts":[["2024",3,1]]}}}],"schema":"https://github.com/citation-style-language/schema/raw/master/csl-citation.json"} </w:instrText>
       </w:r>
       <w:r>
         <w:rPr>
@@ -4076,7 +4227,7 @@
         <w:rPr>
           <w:rFonts w:ascii="Times New Roman" w:hAnsi="Times New Roman" w:cs="Times New Roman"/>
         </w:rPr>
-        <w:instrText xml:space="preserve"> ADDIN ZOTERO_ITEM CSL_CITATION {"citationID":"vmEceA6N","properties":{"formattedCitation":"(Moskowitz, Rogowski, and Snyder 2024)","plainCitation":"(Moskowitz, Rogowski, and Snyder 2024)","noteIndex":0},"citationItems":[{"id":179,"uris":["http://zotero.org/groups/6681328/items/E4GGWSA6"],"itemData":{"id":179,"type":"article-journal","abstract":"Using candidate surveys to hold the policy agenda constant over 1996–2008, the authors find that congressional polarization is not solely an artifact of an evolving roll-call agenda. Under a fixed agenda, increased House polarization is due to replacement: incoming members are more extreme than departing members. Apparent within-member movement toward extremity in roll-call records may instead reflect agenda change, party pressure, or both.","container-title":"Quarterly Journal of Political Science","title":"Parsing Party Polarization in Congress","URL":"https://consensus.app/papers/parsing-party-polarization-in-congress-moskowitz-rogowski/6430fea8ea5454cebf4c4715ebdb3892/?utm_source=chatgpt","author":[{"family":"Moskowitz","given":"D."},{"family":"Rogowski","given":"Jon C."},{"family":"Snyder","given":"J."}],"issued":{"date-parts":[["2024"]]}}}],"schema":"https://github.com/citation-style-language/schema/raw/master/csl-citation.json"} </w:instrText>
+        <w:instrText xml:space="preserve"> ADDIN ZOTERO_ITEM CSL_CITATION {"citationID":"ZpTEQ1zm","properties":{"formattedCitation":"(Moskowitz, Rogowski, and Snyder 2024)","plainCitation":"(Moskowitz, Rogowski, and Snyder 2024)","noteIndex":0},"citationItems":[{"id":412,"uris":["http://zotero.org/groups/6681328/items/BLZ5CRNN"],"itemData":{"id":412,"type":"article-journal","abstract":"A vast literature documents growing ideological divisions between the parties in the contemporary U.S. Congress based on estimates from roll-call voting behavior (such as DW-NOMINATE). We revisit theoretical and empirical claims about the nature of partisan polarization by addressing concerns raised in recent scholarship about the comparability and interpretation of roll-call estimates over time. We leverage data from candidate surveys that allow us to hold the policy agenda constant from 1996 to 2008. We show that the replacement of relatively moderate legislators with more ideologically extreme legislators, particularly among Republicans, explains virtually all of the recent growth in partisan polarization. We further demonstrate that these patterns are explained mostly by increased polarization over social and environmental issues and link our findings to changes in the congressional agenda. Our results have important substantive and methodological implications for evaluating sources of legislative polarization and using roll-call measures in empirical applications.","container-title":"Quarterly Journal of Political Science","DOI":"10.1561/100.00022039","ISSN":"1554-0626","issue":"4","page":"357-385","source":"Silverchair","title":"Parsing Party Polarization in Congress","volume":"19","author":[{"family":"Moskowitz","given":"Daniel J."},{"family":"Rogowski","given":"Jon C."},{"family":"Snyder","given":"James M.","suffix":"Jr."}],"issued":{"date-parts":[["2024",10,16]]}}}],"schema":"https://github.com/citation-style-language/schema/raw/master/csl-citation.json"} </w:instrText>
       </w:r>
       <w:r>
         <w:rPr>
@@ -4207,7 +4358,7 @@
         <w:rPr>
           <w:rFonts w:ascii="Times New Roman" w:hAnsi="Times New Roman" w:cs="Times New Roman"/>
         </w:rPr>
-        <w:instrText xml:space="preserve"> ADDIN ZOTERO_ITEM CSL_CITATION {"citationID":"qs5FfUAv","properties":{"formattedCitation":"(Poole and Rosenthal 2007b; Wu et al. 2023)","plainCitation":"(Poole and Rosenthal 2007b; Wu et al. 2023)","noteIndex":0},"citationItems":[{"id":222,"uris":["http://zotero.org/groups/6681328/items/6BBVJBBT"],"itemData":{"id":222,"type":"article-journal","container-title":"Daedalus","ISSN":"0011-5266","issue":"3","page":"104-107","publisher":"[American Academy of Arts &amp; Sciences, The MIT Press]","source":"JSTOR","title":"On Party Polarization in Congress","volume":"136","author":[{"family":"Poole","given":"Keith T."},{"family":"Rosenthal","given":"Howard"}],"issued":{"date-parts":[["2007"]]}}},{"id":242,"uris":["http://zotero.org/groups/6681328/items/RT9WQ4GJ"],"itemData":{"id":242,"type":"article","abstract":"Existing approaches to estimating politicians' latent positions along specific dimensions often fail when relevant data is limited. We leverage the embedded knowledge in generative large language models (LLMs) to address this challenge and measure lawmakers' positions along specific political or policy dimensions. We prompt an instruction/dialogue-tuned LLM to pairwise compare lawmakers and then scale the resulting graph using the Bradley-Terry model. We estimate novel measures of U.S. senators' positions on liberal-conservative ideology, gun control, and abortion. Our liberal-conservative scale, used to validate LLM-driven scaling, strongly correlates with existing measures and offsets interpretive gaps, suggesting LLMs synthesize relevant data from internet and digitized media rather than memorizing existing measures. Our gun control and abortion measures -- the first of their kind -- differ from the liberal-conservative scale in face-valid ways and predict interest group ratings and legislator votes better than ideology alone. Our findings suggest LLMs hold promise for solving complex social science measurement problems.","DOI":"10.48550/arXiv.2303.12057","note":"arXiv:2303.12057 [cs.CY]","number":"arXiv:2303.12057","publisher":"arXiv","source":"arXiv.org","title":"Large Language Models Can Be Used to Estimate the Latent Positions of Politicians","URL":"http://arxiv.org/abs/2303.12057","author":[{"family":"Wu","given":"Patrick Y."},{"family":"Nagler","given":"Jonathan"},{"family":"Tucker","given":"Joshua A."},{"family":"Messing","given":"Solomon"}],"accessed":{"date-parts":[["2026",10,2]]},"issued":{"date-parts":[["2023",9,26]]}}}],"schema":"https://github.com/citation-style-language/schema/raw/master/csl-citation.json"} </w:instrText>
+        <w:instrText xml:space="preserve"> ADDIN ZOTERO_ITEM CSL_CITATION {"citationID":"qs5FfUAv","properties":{"formattedCitation":"(Poole and Rosenthal 2007b; Wu et al. 2023)","plainCitation":"(Poole and Rosenthal 2007b; Wu et al. 2023)","dontUpdate":true,"noteIndex":0},"citationItems":[{"id":222,"uris":["http://zotero.org/groups/6681328/items/6BBVJBBT"],"itemData":{"id":222,"type":"article-journal","container-title":"Daedalus","ISSN":"0011-5266","issue":"3","page":"104-107","publisher":"[American Academy of Arts &amp; Sciences, The MIT Press]","source":"JSTOR","title":"On Party Polarization in Congress","volume":"136","author":[{"family":"Poole","given":"Keith T."},{"family":"Rosenthal","given":"Howard"}],"issued":{"date-parts":[["2007"]]}}},{"id":242,"uris":["http://zotero.org/groups/6681328/items/RT9WQ4GJ"],"itemData":{"id":242,"type":"article","abstract":"Existing approaches to estimating politicians' latent positions along specific dimensions often fail when relevant data is limited. We leverage the embedded knowledge in generative large language models (LLMs) to address this challenge and measure lawmakers' positions along specific political or policy dimensions. We prompt an instruction/dialogue-tuned LLM to pairwise compare lawmakers and then scale the resulting graph using the Bradley-Terry model. We estimate novel measures of U.S. senators' positions on liberal-conservative ideology, gun control, and abortion. Our liberal-conservative scale, used to validate LLM-driven scaling, strongly correlates with existing measures and offsets interpretive gaps, suggesting LLMs synthesize relevant data from internet and digitized media rather than memorizing existing measures. Our gun control and abortion measures -- the first of their kind -- differ from the liberal-conservative scale in face-valid ways and predict interest group ratings and legislator votes better than ideology alone. Our findings suggest LLMs hold promise for solving complex social science measurement problems.","DOI":"10.48550/arXiv.2303.12057","note":"arXiv:2303.12057 [cs.CY]","number":"arXiv:2303.12057","publisher":"arXiv","source":"arXiv.org","title":"Large Language Models Can Be Used to Estimate the Latent Positions of Politicians","URL":"http://arxiv.org/abs/2303.12057","author":[{"family":"Wu","given":"Patrick Y."},{"family":"Nagler","given":"Jonathan"},{"family":"Tucker","given":"Joshua A."},{"family":"Messing","given":"Solomon"}],"accessed":{"date-parts":[["2026",10,2]]},"issued":{"date-parts":[["2023",9,26]]}}}],"schema":"https://github.com/citation-style-language/schema/raw/master/csl-citation.json"} </w:instrText>
       </w:r>
       <w:r>
         <w:rPr>
@@ -4219,7 +4370,7 @@
         <w:rPr>
           <w:rFonts w:ascii="Times New Roman" w:hAnsi="Times New Roman" w:cs="Times New Roman"/>
         </w:rPr>
-        <w:t>(Poole and Rosenthal 2007b; Wu et al. 2023)</w:t>
+        <w:t>(Poole and Rosenthal 2007; Wu et al. 2023)</w:t>
       </w:r>
       <w:r>
         <w:rPr>
@@ -4243,7 +4394,7 @@
         <w:rPr>
           <w:rFonts w:ascii="Times New Roman" w:hAnsi="Times New Roman" w:cs="Times New Roman"/>
         </w:rPr>
-        <w:instrText xml:space="preserve"> ADDIN ZOTERO_ITEM CSL_CITATION {"citationID":"BFKGXRW3","properties":{"formattedCitation":"(Moskowitz, Rogowski, and Snyder 2024; O\\uc0\\u8217{}Hagan and Schein 2024)","plainCitation":"(Moskowitz, Rogowski, and Snyder 2024; O’Hagan and Schein 2024)","noteIndex":0},"citationItems":[{"id":179,"uris":["http://zotero.org/groups/6681328/items/E4GGWSA6"],"itemData":{"id":179,"type":"article-journal","abstract":"Using candidate surveys to hold the policy agenda constant over 1996–2008, the authors find that congressional polarization is not solely an artifact of an evolving roll-call agenda. Under a fixed agenda, increased House polarization is due to replacement: incoming members are more extreme than departing members. Apparent within-member movement toward extremity in roll-call records may instead reflect agenda change, party pressure, or both.","container-title":"Quarterly Journal of Political Science","title":"Parsing Party Polarization in Congress","URL":"https://consensus.app/papers/parsing-party-polarization-in-congress-moskowitz-rogowski/6430fea8ea5454cebf4c4715ebdb3892/?utm_source=chatgpt","author":[{"family":"Moskowitz","given":"D."},{"family":"Rogowski","given":"Jon C."},{"family":"Snyder","given":"J."}],"issued":{"date-parts":[["2024"]]}}},{"id":243,"uris":["http://zotero.org/groups/6681328/items/ZZPEPMA3"],"itemData":{"id":243,"type":"article","abstract":"Much of social science is centered around terms like ``ideology'' or ``power'', which generally elude precise definition, and whose contextual meanings are trapped in surrounding language. This paper explores the use of large language models (LLMs) to flexibly navigate the conceptual clutter inherent to social scientific measurement tasks. We rely on LLMs' remarkable linguistic fluency to elicit ideological scales of both legislators and text, which accord closely to established methods and our own judgement. A key aspect of our approach is that we elicit such scores directly, instructing the LLM to furnish numeric scores itself. This approach affords a great deal of flexibility, which we showcase through a variety of different case studies. Our results suggest that LLMs can be used to characterize highly subtle and diffuse manifestations of political ideology in text.","DOI":"10.48550/arXiv.2312.09203","note":"arXiv:2312.09203 [cs.CL]","number":"arXiv:2312.09203","publisher":"arXiv","source":"arXiv.org","title":"Measurement in the Age of LLMs: An Application to Ideological Scaling","title-short":"Measurement in the Age of LLMs","URL":"http://arxiv.org/abs/2312.09203","author":[{"family":"O'Hagan","given":"Sean"},{"family":"Schein","given":"Aaron"}],"accessed":{"date-parts":[["2026",10,2]]},"issued":{"date-parts":[["2024",4,8]]}}}],"schema":"https://github.com/citation-style-language/schema/raw/master/csl-citation.json"} </w:instrText>
+        <w:instrText xml:space="preserve"> ADDIN ZOTERO_ITEM CSL_CITATION {"citationID":"f1Cwe9Tp","properties":{"formattedCitation":"(O\\uc0\\u8217{}Hagan and Schein 2024; Moskowitz, Rogowski, and Snyder 2024)","plainCitation":"(O’Hagan and Schein 2024; Moskowitz, Rogowski, and Snyder 2024)","noteIndex":0},"citationItems":[{"id":243,"uris":["http://zotero.org/groups/6681328/items/ZZPEPMA3"],"itemData":{"id":243,"type":"article","abstract":"Much of social science is centered around terms like ``ideology'' or ``power'', which generally elude precise definition, and whose contextual meanings are trapped in surrounding language. This paper explores the use of large language models (LLMs) to flexibly navigate the conceptual clutter inherent to social scientific measurement tasks. We rely on LLMs' remarkable linguistic fluency to elicit ideological scales of both legislators and text, which accord closely to established methods and our own judgement. A key aspect of our approach is that we elicit such scores directly, instructing the LLM to furnish numeric scores itself. This approach affords a great deal of flexibility, which we showcase through a variety of different case studies. Our results suggest that LLMs can be used to characterize highly subtle and diffuse manifestations of political ideology in text.","DOI":"10.48550/arXiv.2312.09203","note":"arXiv:2312.09203 [cs.CL]","number":"arXiv:2312.09203","publisher":"arXiv","source":"arXiv.org","title":"Measurement in the Age of LLMs: An Application to Ideological Scaling","title-short":"Measurement in the Age of LLMs","URL":"http://arxiv.org/abs/2312.09203","author":[{"family":"O'Hagan","given":"Sean"},{"family":"Schein","given":"Aaron"}],"accessed":{"date-parts":[["2026",10,2]]},"issued":{"date-parts":[["2024",4,8]]}}},{"id":412,"uris":["http://zotero.org/groups/6681328/items/BLZ5CRNN"],"itemData":{"id":412,"type":"article-journal","abstract":"A vast literature documents growing ideological divisions between the parties in the contemporary U.S. Congress based on estimates from roll-call voting behavior (such as DW-NOMINATE). We revisit theoretical and empirical claims about the nature of partisan polarization by addressing concerns raised in recent scholarship about the comparability and interpretation of roll-call estimates over time. We leverage data from candidate surveys that allow us to hold the policy agenda constant from 1996 to 2008. We show that the replacement of relatively moderate legislators with more ideologically extreme legislators, particularly among Republicans, explains virtually all of the recent growth in partisan polarization. We further demonstrate that these patterns are explained mostly by increased polarization over social and environmental issues and link our findings to changes in the congressional agenda. Our results have important substantive and methodological implications for evaluating sources of legislative polarization and using roll-call measures in empirical applications.","container-title":"Quarterly Journal of Political Science","DOI":"10.1561/100.00022039","ISSN":"1554-0626","issue":"4","page":"357-385","source":"Silverchair","title":"Parsing Party Polarization in Congress","volume":"19","author":[{"family":"Moskowitz","given":"Daniel J."},{"family":"Rogowski","given":"Jon C."},{"family":"Snyder","given":"James M.","suffix":"Jr."}],"issued":{"date-parts":[["2024",10,16]]}}}],"schema":"https://github.com/citation-style-language/schema/raw/master/csl-citation.json"} </w:instrText>
       </w:r>
       <w:r>
         <w:rPr>
@@ -4256,7 +4407,7 @@
           <w:rFonts w:ascii="Times New Roman" w:hAnsi="Times New Roman" w:cs="Times New Roman"/>
           <w:kern w:val="0"/>
         </w:rPr>
-        <w:t>(Moskowitz, Rogowski, and Snyder 2024; O’Hagan and Schein 2024)</w:t>
+        <w:t>(O’Hagan and Schein 2024; Moskowitz, Rogowski, and Snyder 2024)</w:t>
       </w:r>
       <w:r>
         <w:rPr>
@@ -4280,7 +4431,7 @@
         <w:rPr>
           <w:rFonts w:ascii="Times New Roman" w:hAnsi="Times New Roman" w:cs="Times New Roman"/>
         </w:rPr>
-        <w:instrText xml:space="preserve"> ADDIN ZOTERO_ITEM CSL_CITATION {"citationID":"kq2gdcWD","properties":{"formattedCitation":"(Lauderdale and Herzog 2016)","plainCitation":"(Lauderdale and Herzog 2016)","noteIndex":0},"citationItems":[{"id":237,"uris":["http://zotero.org/groups/6681328/items/UFF3DLZ4"],"itemData":{"id":237,"type":"article-journal","abstract":"Existing approaches to measuring political disagreement from text data perform poorly except when applied to narrowly selected texts discussing the same issues and written in the same style. We demonstrate the first viable approach for estimating legislator-specific scores from the entire speech corpus of a legislature, while also producing extensive information about the evolution of speech polarization and politically loaded language. In the Irish Dáil, we show that the dominant dimension of speech variation is government–opposition, with ministers more extreme on this dimension than backbenchers, and a second dimension distinguishing between the establishment and anti-establishment opposition parties. In the U. S. Senate, we estimate a dimension that has moderate within-party correlations with scales based on roll-call votes and campaign donation patterns; however, we observe greater overlap across parties in speech positions than roll-call positions and partisan polarization in speeches varies more clearly in response to major political events.","container-title":"Political Analysis","DOI":"10.1093/pan/mpw017","ISSN":"1047-1987, 1476-4989","issue":"3","journalAbbreviation":"Polit. anal.","language":"en","license":"https://www.cambridge.org/core/terms","page":"374-394","source":"DOI.org (Crossref)","title":"Measuring Political Positions from Legislative Speech","volume":"24","author":[{"family":"Lauderdale","given":"Benjamin E."},{"family":"Herzog","given":"Alexander"}],"issued":{"date-parts":[["2016"]]}}}],"schema":"https://github.com/citation-style-language/schema/raw/master/csl-citation.json"} </w:instrText>
+        <w:instrText xml:space="preserve"> ADDIN ZOTERO_ITEM CSL_CITATION {"citationID":"e1EkJ1u8","properties":{"formattedCitation":"(Lauderdale and Herzog 2016)","plainCitation":"(Lauderdale and Herzog 2016)","noteIndex":0},"citationItems":[{"id":149,"uris":["http://zotero.org/groups/6681328/items/6AZ7VJB3"],"itemData":{"id":149,"type":"article-journal","abstract":"Existing approaches to measuring political disagreement from text data perform poorly except when applied to narrowly selected texts discussing the same issues and written in the same style. We demonstrate the first viable approach for estimating legislator-specific scores from the entire speech corpus of a legislature, while also producing extensive information about the evolution of speech polarization and politically loaded language. In the Irish Dáil, we show that the dominant dimension of speech variation is government–opposition, with ministers more extreme on this dimension than backbenchers, and a second dimension distinguishing between the establishment and anti-establishment opposition parties. In the U. S. Senate, we estimate a dimension that has moderate within-party correlations with scales based on roll-call votes and campaign donation patterns; however, we observe greater overlap across parties in speech positions than roll-call positions and partisan polarization in speeches varies more clearly in response to major political events.","container-title":"Political Analysis","DOI":"10.1093/pan/mpw017","ISSN":"1047-1987, 1476-4989","issue":"3","language":"en","page":"374-394","source":"Cambridge University Press","title":"Measuring Political Positions from Legislative Speech","volume":"24","author":[{"family":"Lauderdale","given":"Benjamin E."},{"family":"Herzog","given":"Alexander"}],"issued":{"date-parts":[["2016",7]]}}}],"schema":"https://github.com/citation-style-language/schema/raw/master/csl-citation.json"} </w:instrText>
       </w:r>
       <w:r>
         <w:rPr>
@@ -4312,11 +4463,808 @@
         <w:spacing w:line="480" w:lineRule="auto"/>
         <w:rPr>
           <w:rFonts w:ascii="Times New Roman" w:hAnsi="Times New Roman" w:cs="Times New Roman"/>
-        </w:rPr>
-      </w:pPr>
+          <w:b/>
+          <w:bCs/>
+        </w:rPr>
+      </w:pPr>
+      <w:r>
+        <w:rPr>
+          <w:rFonts w:ascii="Times New Roman" w:hAnsi="Times New Roman" w:cs="Times New Roman"/>
+          <w:b/>
+          <w:bCs/>
+        </w:rPr>
+        <w:t>Bibliography for section 2:</w:t>
+      </w:r>
+    </w:p>
+    <w:p>
+      <w:pPr>
+        <w:pStyle w:val="Bibliography"/>
+      </w:pPr>
+      <w:r>
+        <w:fldChar w:fldCharType="begin"/>
+      </w:r>
+      <w:r>
+        <w:instrText xml:space="preserve"> ADDIN ZOTERO_BIBL {"uncited":[],"omitted":[],"custom":[]} CSL_BIBLIOGRAPHY </w:instrText>
+      </w:r>
+      <w:r>
+        <w:fldChar w:fldCharType="separate"/>
+      </w:r>
+      <w:r>
+        <w:t xml:space="preserve">Ainsley, Caitlin, Clifford J. Carrubba, Brian F. Crisp, Betul Demirkaya, Matthew J. Gabel, and Dino Hadzic. 2020. “Roll-Call Vote Selection: Implications for the Study of Legislative Politics.” </w:t>
+      </w:r>
+      <w:r>
+        <w:rPr>
+          <w:i/>
+          <w:iCs/>
+        </w:rPr>
+        <w:t>American Political Science Review</w:t>
+      </w:r>
+      <w:r>
+        <w:t xml:space="preserve"> 114 (3): 691–706. https://doi.org/10.1017/S0003055420000192.</w:t>
+      </w:r>
+    </w:p>
+    <w:p>
+      <w:pPr>
+        <w:pStyle w:val="Bibliography"/>
+      </w:pPr>
+      <w:r>
+        <w:t xml:space="preserve">Bakker, Bert N., and </w:t>
+      </w:r>
+      <w:proofErr w:type="spellStart"/>
+      <w:r>
+        <w:t>Yphtach</w:t>
+      </w:r>
+      <w:proofErr w:type="spellEnd"/>
+      <w:r>
+        <w:t xml:space="preserve"> Lelkes. 2024. “Putting the Affect into Affective Polarisation.” </w:t>
+      </w:r>
+      <w:r>
+        <w:rPr>
+          <w:i/>
+          <w:iCs/>
+        </w:rPr>
+        <w:t>Cognition and Emotion</w:t>
+      </w:r>
+      <w:r>
+        <w:t xml:space="preserve"> 38 (4): 418–36. https://doi.org/10.1080/02699931.2024.2362366.</w:t>
+      </w:r>
+    </w:p>
+    <w:p>
+      <w:pPr>
+        <w:pStyle w:val="Bibliography"/>
+      </w:pPr>
+      <w:r>
+        <w:t xml:space="preserve">Bateman, David A., Joshua D. Clinton, and John S. Lapinski. 2017. “A House Divided? Roll Calls, Polarization, and Policy Differences in the U.S. House, 1877–2011.” </w:t>
+      </w:r>
+      <w:r>
+        <w:rPr>
+          <w:i/>
+          <w:iCs/>
+        </w:rPr>
+        <w:t>American Journal of Political Science</w:t>
+      </w:r>
+      <w:r>
+        <w:t xml:space="preserve"> 61 (3): 698–714. https://doi.org/10.1111/ajps.12281.</w:t>
+      </w:r>
+    </w:p>
+    <w:p>
+      <w:pPr>
+        <w:pStyle w:val="Bibliography"/>
+      </w:pPr>
+      <w:r>
+        <w:t xml:space="preserve">Benoit, Kenneth, Scott De Marchi, Conor Laver, Michael Laver, and </w:t>
+      </w:r>
+      <w:proofErr w:type="spellStart"/>
+      <w:r>
+        <w:t>Jinshuai</w:t>
+      </w:r>
+      <w:proofErr w:type="spellEnd"/>
+      <w:r>
+        <w:t xml:space="preserve"> Ma. 2026. “Using Large Language Models to </w:t>
+      </w:r>
+      <w:proofErr w:type="spellStart"/>
+      <w:r>
+        <w:t>Analyze</w:t>
+      </w:r>
+      <w:proofErr w:type="spellEnd"/>
+      <w:r>
+        <w:t xml:space="preserve"> Political Texts through Natural Language Understanding.” </w:t>
+      </w:r>
+      <w:r>
+        <w:rPr>
+          <w:i/>
+          <w:iCs/>
+        </w:rPr>
+        <w:t>American Journal of Political Science</w:t>
+      </w:r>
+      <w:r>
+        <w:t>, March 19, 2026, ajps.70050. https://doi.org/10.1111/ajps.70050.</w:t>
+      </w:r>
+    </w:p>
+    <w:p>
+      <w:pPr>
+        <w:pStyle w:val="Bibliography"/>
+      </w:pPr>
+      <w:r>
+        <w:t xml:space="preserve">Burnham, Michael. 2024. “Semantic Scaling: Bayesian Ideal Point Estimates with Large Language Models.” arXiv:2405.02472. Preprint, </w:t>
+      </w:r>
+      <w:proofErr w:type="spellStart"/>
+      <w:r>
+        <w:t>arXiv</w:t>
+      </w:r>
+      <w:proofErr w:type="spellEnd"/>
+      <w:r>
+        <w:t>, May 3. https://doi.org/10.48550/arXiv.2405.02472.</w:t>
+      </w:r>
+    </w:p>
+    <w:p>
+      <w:pPr>
+        <w:pStyle w:val="Bibliography"/>
+      </w:pPr>
+      <w:r>
+        <w:lastRenderedPageBreak/>
+        <w:t xml:space="preserve">Carroll, Royce, Jeffrey B. Lewis, James Lo, Keith T. Poole, and Howard Rosenthal. 2009. “Measuring Bias and Uncertainty in DW-NOMINATE Ideal Point Estimates via the Parametric Bootstrap.” </w:t>
+      </w:r>
+      <w:r>
+        <w:rPr>
+          <w:i/>
+          <w:iCs/>
+        </w:rPr>
+        <w:t>Political Analysis</w:t>
+      </w:r>
+      <w:r>
+        <w:t xml:space="preserve"> 17 (3): 261–75. https://doi.org/10.1093/pan/mpp005.</w:t>
+      </w:r>
+    </w:p>
+    <w:p>
+      <w:pPr>
+        <w:pStyle w:val="Bibliography"/>
+      </w:pPr>
+      <w:r>
+        <w:t xml:space="preserve">Caughey, Devin, and Eric Schickler. 2016. “Substance and Change in Congressional Ideology: NOMINATE and Its Alternatives.” </w:t>
+      </w:r>
+      <w:r>
+        <w:rPr>
+          <w:i/>
+          <w:iCs/>
+        </w:rPr>
+        <w:t>Studies in American Political Development</w:t>
+      </w:r>
+      <w:r>
+        <w:t xml:space="preserve"> 30 (2): 128–46. https://doi.org/10.1017/S0898588X16000092.</w:t>
+      </w:r>
+    </w:p>
+    <w:p>
+      <w:pPr>
+        <w:pStyle w:val="Bibliography"/>
+      </w:pPr>
+      <w:r>
+        <w:t xml:space="preserve">Coan, Travis G., Ranadheer Malla, Mirjam O. Nanko, William Kattrup, J. Timmons Roberts, John Cook, and Constantine Boussalis. 2026. “Large Language Model Reveals an Increase in Climate Contrarian Speech in the United States Congress.” </w:t>
+      </w:r>
+      <w:r>
+        <w:rPr>
+          <w:i/>
+          <w:iCs/>
+        </w:rPr>
+        <w:t>Communications Sustainability</w:t>
+      </w:r>
+      <w:r>
+        <w:t xml:space="preserve"> 1 (1): 37. https://doi.org/10.1038/s44458-025-00029-z.</w:t>
+      </w:r>
+    </w:p>
+    <w:p>
+      <w:pPr>
+        <w:pStyle w:val="Bibliography"/>
+      </w:pPr>
+      <w:r>
+        <w:t xml:space="preserve">Druckman, James N., and Matthew S. Levendusky. 2019. “What Do We Measure When We Measure Affective Polarization?” </w:t>
+      </w:r>
+      <w:r>
+        <w:rPr>
+          <w:i/>
+          <w:iCs/>
+        </w:rPr>
+        <w:t>Public Opinion Quarterly</w:t>
+      </w:r>
+      <w:r>
+        <w:t xml:space="preserve"> 83 (1): 114–22. https://doi.org/10.1093/poq/nfz003.</w:t>
+      </w:r>
+    </w:p>
+    <w:p>
+      <w:pPr>
+        <w:pStyle w:val="Bibliography"/>
+      </w:pPr>
+      <w:r>
+        <w:t xml:space="preserve">Enders, Adam M. 2021. “Issues versus Affect: How Do Elite and Mass Polarization Compare?” </w:t>
+      </w:r>
+      <w:r>
+        <w:rPr>
+          <w:i/>
+          <w:iCs/>
+        </w:rPr>
+        <w:t>The Journal of Politics</w:t>
+      </w:r>
+      <w:r>
+        <w:t xml:space="preserve"> 83 (4): 1872–77. https://doi.org/10.1086/715059.</w:t>
+      </w:r>
+    </w:p>
+    <w:p>
+      <w:pPr>
+        <w:pStyle w:val="Bibliography"/>
+      </w:pPr>
+      <w:r>
+        <w:t xml:space="preserve">Erdogan, Emre, Bernadette Nadya Jaworsky, Cláudia Álvares, Bojana </w:t>
+      </w:r>
+      <w:proofErr w:type="spellStart"/>
+      <w:r>
+        <w:t>Bodroža</w:t>
+      </w:r>
+      <w:proofErr w:type="spellEnd"/>
+      <w:r>
+        <w:t xml:space="preserve">, Eglė </w:t>
+      </w:r>
+      <w:proofErr w:type="spellStart"/>
+      <w:r>
+        <w:t>Butkevičienė</w:t>
+      </w:r>
+      <w:proofErr w:type="spellEnd"/>
+      <w:r>
+        <w:t xml:space="preserve">, Erlis Cela, Jérémy Dodeigne, et al. 2026. “The Evolving Study of Political Polarization.” </w:t>
+      </w:r>
+      <w:r>
+        <w:rPr>
+          <w:i/>
+          <w:iCs/>
+        </w:rPr>
+        <w:t>Open Research Europe</w:t>
+      </w:r>
+      <w:r>
+        <w:t xml:space="preserve"> 6 (April 2026): 93. https://doi.org/10.12688/openreseurope.23252.1.</w:t>
+      </w:r>
+    </w:p>
+    <w:p>
+      <w:pPr>
+        <w:pStyle w:val="Bibliography"/>
+      </w:pPr>
+      <w:r>
+        <w:t xml:space="preserve">Fiorina, Morris P., and Samuel J. Abrams. 2008. “Political Polarization in the American Public.” </w:t>
+      </w:r>
+      <w:r>
+        <w:rPr>
+          <w:i/>
+          <w:iCs/>
+        </w:rPr>
+        <w:t>Annual Review of Political Science</w:t>
+      </w:r>
+      <w:r>
+        <w:t xml:space="preserve"> 11 (2008): 563–88. https://doi.org/10.1146/annurev.polisci.11.053106.153836.</w:t>
+      </w:r>
+    </w:p>
+    <w:p>
+      <w:pPr>
+        <w:pStyle w:val="Bibliography"/>
+      </w:pPr>
+      <w:r>
+        <w:t xml:space="preserve">Gentzkow, Matthew, Jesse M. Shapiro, and Matt Taddy. 2019. “Measuring Group Differences in High-Dimensional Choices: Method and Application to Congressional Speech.” </w:t>
+      </w:r>
+      <w:proofErr w:type="spellStart"/>
+      <w:r>
+        <w:rPr>
+          <w:i/>
+          <w:iCs/>
+        </w:rPr>
+        <w:t>Econometrica</w:t>
+      </w:r>
+      <w:proofErr w:type="spellEnd"/>
+      <w:r>
+        <w:t xml:space="preserve"> 87 (4): 1307–40. https://doi.org/10.3982/ECTA16566.</w:t>
+      </w:r>
+    </w:p>
+    <w:p>
+      <w:pPr>
+        <w:pStyle w:val="Bibliography"/>
+      </w:pPr>
+      <w:r>
+        <w:t xml:space="preserve">Ghafouri, Vahid, Robert McNeil, Teodor Yankov, Madeleine Sumption, Luc Rocher, Scott A. Hale, and Adam Mahdi. 2025. “Framing Migration: A Computational Analysis of UK Parliamentary Discourse.” Version 1. Preprint, </w:t>
+      </w:r>
+      <w:proofErr w:type="spellStart"/>
+      <w:r>
+        <w:t>arXiv</w:t>
+      </w:r>
+      <w:proofErr w:type="spellEnd"/>
+      <w:r>
+        <w:t>. https://doi.org/10.48550/ARXIV.2509.14197.</w:t>
+      </w:r>
+    </w:p>
+    <w:p>
+      <w:pPr>
+        <w:pStyle w:val="Bibliography"/>
+      </w:pPr>
+      <w:proofErr w:type="spellStart"/>
+      <w:r>
+        <w:t>Goet</w:t>
+      </w:r>
+      <w:proofErr w:type="spellEnd"/>
+      <w:r>
+        <w:t xml:space="preserve">, Niels D. 2019. “Measuring Polarization with Text Analysis: Evidence from the UK House of Commons, 1811–2015.” </w:t>
+      </w:r>
+      <w:r>
+        <w:rPr>
+          <w:i/>
+          <w:iCs/>
+        </w:rPr>
+        <w:t>Political Analysis</w:t>
+      </w:r>
+      <w:r>
+        <w:t xml:space="preserve"> 27 (4): 518–39. https://doi.org/10.1017/pan.2019.2.</w:t>
+      </w:r>
+    </w:p>
+    <w:p>
+      <w:pPr>
+        <w:pStyle w:val="Bibliography"/>
+      </w:pPr>
+      <w:r>
+        <w:t xml:space="preserve">Green, Jon, Kelsey Shoub, Rachel Blum, and Lindsey Cormack. 2024. “Cross-Platform Partisan Positioning in Congressional Speech.” </w:t>
+      </w:r>
+      <w:r>
+        <w:rPr>
+          <w:i/>
+          <w:iCs/>
+        </w:rPr>
+        <w:t>Political Research Quarterly</w:t>
+      </w:r>
+      <w:r>
+        <w:t xml:space="preserve"> 77 (3): 653–68. https://doi.org/10.1177/10659129241236685.</w:t>
+      </w:r>
+    </w:p>
+    <w:p>
+      <w:pPr>
+        <w:pStyle w:val="Bibliography"/>
+      </w:pPr>
+      <w:r>
+        <w:lastRenderedPageBreak/>
+        <w:t xml:space="preserve">Iakovlev, </w:t>
+      </w:r>
+      <w:proofErr w:type="spellStart"/>
+      <w:r>
+        <w:t>Gennadii</w:t>
+      </w:r>
+      <w:proofErr w:type="spellEnd"/>
+      <w:r>
+        <w:t xml:space="preserve">. 2026. “Elite Polarization in European Parliamentary Speeches: A Novel Measurement Approach Using Large Language Models.” arXiv:2507.06658. Preprint, </w:t>
+      </w:r>
+      <w:proofErr w:type="spellStart"/>
+      <w:r>
+        <w:t>arXiv</w:t>
+      </w:r>
+      <w:proofErr w:type="spellEnd"/>
+      <w:r>
+        <w:t>, May 11. https://doi.org/10.48550/arXiv.2507.06658.</w:t>
+      </w:r>
+    </w:p>
+    <w:p>
+      <w:pPr>
+        <w:pStyle w:val="Bibliography"/>
+      </w:pPr>
+      <w:r>
+        <w:t xml:space="preserve">Iyengar, </w:t>
+      </w:r>
+      <w:proofErr w:type="spellStart"/>
+      <w:r>
+        <w:t>Shanto</w:t>
+      </w:r>
+      <w:proofErr w:type="spellEnd"/>
+      <w:r>
+        <w:t xml:space="preserve">, </w:t>
+      </w:r>
+      <w:proofErr w:type="spellStart"/>
+      <w:r>
+        <w:t>Yphtach</w:t>
+      </w:r>
+      <w:proofErr w:type="spellEnd"/>
+      <w:r>
+        <w:t xml:space="preserve"> Lelkes, Matthew Levendusky, Neil Malhotra, and Sean J. Westwood. 2019. “The Origins and Consequences of Affective Polarization in the United States.” </w:t>
+      </w:r>
+      <w:r>
+        <w:rPr>
+          <w:i/>
+          <w:iCs/>
+        </w:rPr>
+        <w:t>Annual Review of Political Science</w:t>
+      </w:r>
+      <w:r>
+        <w:t xml:space="preserve"> 22 (2019): 129–46. https://doi.org/10.1146/annurev-polisci-051117-073034.</w:t>
+      </w:r>
+    </w:p>
+    <w:p>
+      <w:pPr>
+        <w:pStyle w:val="Bibliography"/>
+      </w:pPr>
+      <w:r>
+        <w:t xml:space="preserve">Jacobson, Gary C. 2013. “Partisan Polarization in American Politics: A Background Paper.” </w:t>
+      </w:r>
+      <w:r>
+        <w:rPr>
+          <w:i/>
+          <w:iCs/>
+        </w:rPr>
+        <w:t>Presidential Studies Quarterly</w:t>
+      </w:r>
+      <w:r>
+        <w:t xml:space="preserve"> 43 (4): 688–708. https://doi.org/10.1111/psq.12062.</w:t>
+      </w:r>
+    </w:p>
+    <w:p>
+      <w:pPr>
+        <w:pStyle w:val="Bibliography"/>
+      </w:pPr>
+      <w:r>
+        <w:t xml:space="preserve">Kato, Ken, and Christopher Cochrane. 2025. “KOKKAI DOC: An LLM-Driven Framework for Scaling Parliamentary Representatives.” arXiv:2505.07118. Preprint, </w:t>
+      </w:r>
+      <w:proofErr w:type="spellStart"/>
+      <w:r>
+        <w:t>arXiv</w:t>
+      </w:r>
+      <w:proofErr w:type="spellEnd"/>
+      <w:r>
+        <w:t>, May 11. https://doi.org/10.48550/arXiv.2505.07118.</w:t>
+      </w:r>
+    </w:p>
+    <w:p>
+      <w:pPr>
+        <w:pStyle w:val="Bibliography"/>
+      </w:pPr>
+      <w:r>
+        <w:t xml:space="preserve">Kato, Ken, Annabelle Purnomo, Christopher Cochrane, and </w:t>
+      </w:r>
+      <w:proofErr w:type="spellStart"/>
+      <w:r>
+        <w:t>Raeid</w:t>
+      </w:r>
+      <w:proofErr w:type="spellEnd"/>
+      <w:r>
+        <w:t xml:space="preserve"> Saqur. 2024. “L(u)PIN: LLM-Based Political Ideology Nowcasting.” arXiv:2405.07320. Preprint, </w:t>
+      </w:r>
+      <w:proofErr w:type="spellStart"/>
+      <w:r>
+        <w:t>arXiv</w:t>
+      </w:r>
+      <w:proofErr w:type="spellEnd"/>
+      <w:r>
+        <w:t>, May 12. https://doi.org/10.48550/arXiv.2405.07320.</w:t>
+      </w:r>
+    </w:p>
+    <w:p>
+      <w:pPr>
+        <w:pStyle w:val="Bibliography"/>
+      </w:pPr>
+      <w:r>
+        <w:t xml:space="preserve">Lauderdale, Benjamin E., and Alexander Herzog. 2016. “Measuring Political Positions from Legislative Speech.” </w:t>
+      </w:r>
+      <w:r>
+        <w:rPr>
+          <w:i/>
+          <w:iCs/>
+        </w:rPr>
+        <w:t>Political Analysis</w:t>
+      </w:r>
+      <w:r>
+        <w:t xml:space="preserve"> 24 (3): 374–94. https://doi.org/10.1093/pan/mpw017.</w:t>
+      </w:r>
+    </w:p>
+    <w:p>
+      <w:pPr>
+        <w:pStyle w:val="Bibliography"/>
+      </w:pPr>
+      <w:r>
+        <w:t xml:space="preserve">Layman, Geoffrey C., Thomas M. Carsey, and Juliana Menasce Horowitz. 2006. “PARTY POLARIZATION IN AMERICAN POLITICS: Characteristics, Causes, and Consequences.” </w:t>
+      </w:r>
+      <w:r>
+        <w:rPr>
+          <w:i/>
+          <w:iCs/>
+        </w:rPr>
+        <w:t>Annual Review of Political Science</w:t>
+      </w:r>
+      <w:r>
+        <w:t xml:space="preserve"> 9 (2006): 83–110. https://doi.org/10.1146/annurev.polisci.9.070204.105138.</w:t>
+      </w:r>
+    </w:p>
+    <w:p>
+      <w:pPr>
+        <w:pStyle w:val="Bibliography"/>
+      </w:pPr>
+      <w:r>
+        <w:t xml:space="preserve">Le </w:t>
+      </w:r>
+      <w:proofErr w:type="spellStart"/>
+      <w:r>
+        <w:t>Mens</w:t>
+      </w:r>
+      <w:proofErr w:type="spellEnd"/>
+      <w:r>
+        <w:t xml:space="preserve">, Gaël, and Aina Gallego. 2025. “Positioning Political Texts with Large Language Models by Asking and Averaging.” </w:t>
+      </w:r>
+      <w:r>
+        <w:rPr>
+          <w:i/>
+          <w:iCs/>
+        </w:rPr>
+        <w:t>Political Analysis</w:t>
+      </w:r>
+      <w:r>
+        <w:t xml:space="preserve"> 33 (3): 274–82. https://doi.org/10.1017/pan.2024.29.</w:t>
+      </w:r>
+    </w:p>
+    <w:p>
+      <w:pPr>
+        <w:pStyle w:val="Bibliography"/>
+      </w:pPr>
+      <w:r>
+        <w:t xml:space="preserve">Lelkes, </w:t>
+      </w:r>
+      <w:proofErr w:type="spellStart"/>
+      <w:r>
+        <w:t>Yphtach</w:t>
+      </w:r>
+      <w:proofErr w:type="spellEnd"/>
+      <w:r>
+        <w:t xml:space="preserve">. 2016. “Mass Polarization: Manifestations and Measurements.” </w:t>
+      </w:r>
+      <w:r>
+        <w:rPr>
+          <w:i/>
+          <w:iCs/>
+        </w:rPr>
+        <w:t>Public Opinion Quarterly</w:t>
+      </w:r>
+      <w:r>
+        <w:t xml:space="preserve"> 80 (S1): 392–410. https://doi.org/10.1093/poq/nfw005.</w:t>
+      </w:r>
+    </w:p>
+    <w:p>
+      <w:pPr>
+        <w:pStyle w:val="Bibliography"/>
+      </w:pPr>
+      <w:r>
+        <w:t xml:space="preserve">Mehlhaff, Isaac D. 2024. “A Group-Based Approach to Measuring Polarization.” </w:t>
+      </w:r>
+      <w:r>
+        <w:rPr>
+          <w:i/>
+          <w:iCs/>
+        </w:rPr>
+        <w:t>American Political Science Review</w:t>
+      </w:r>
+      <w:r>
+        <w:t xml:space="preserve"> 118 (3): 1518–26. https://doi.org/10.1017/S0003055423001041.</w:t>
+      </w:r>
+    </w:p>
+    <w:p>
+      <w:pPr>
+        <w:pStyle w:val="Bibliography"/>
+      </w:pPr>
+      <w:r>
+        <w:t xml:space="preserve">Moskowitz, Daniel J., Jon C. Rogowski, and James M. Snyder Jr. 2024. “Parsing Party Polarization in Congress.” </w:t>
+      </w:r>
+      <w:r>
+        <w:rPr>
+          <w:i/>
+          <w:iCs/>
+        </w:rPr>
+        <w:t>Quarterly Journal of Political Science</w:t>
+      </w:r>
+      <w:r>
+        <w:t xml:space="preserve"> 19 (4): 357–85. https://doi.org/10.1561/100.00022039.</w:t>
+      </w:r>
+    </w:p>
+    <w:p>
+      <w:pPr>
+        <w:pStyle w:val="Bibliography"/>
+      </w:pPr>
+      <w:r>
+        <w:lastRenderedPageBreak/>
+        <w:t xml:space="preserve">O’Hagan, Sean, and Aaron Schein. 2024. “Measurement in the Age of LLMs: An Application to Ideological Scaling.” arXiv:2312.09203. Preprint, </w:t>
+      </w:r>
+      <w:proofErr w:type="spellStart"/>
+      <w:r>
+        <w:t>arXiv</w:t>
+      </w:r>
+      <w:proofErr w:type="spellEnd"/>
+      <w:r>
+        <w:t>, April 8. https://doi.org/10.48550/arXiv.2312.09203.</w:t>
+      </w:r>
+    </w:p>
+    <w:p>
+      <w:pPr>
+        <w:pStyle w:val="Bibliography"/>
+      </w:pPr>
+      <w:r>
+        <w:t xml:space="preserve">Ornstein, Joseph T., Elise N. Blasingame, and Jake S. Truscott. 2025. “How to Train Your Stochastic Parrot: Large Language Models for Political Texts.” </w:t>
+      </w:r>
+      <w:r>
+        <w:rPr>
+          <w:i/>
+          <w:iCs/>
+        </w:rPr>
+        <w:t>Political Science Research and Methods</w:t>
+      </w:r>
+      <w:r>
+        <w:t xml:space="preserve"> 13 (2): 264–81. https://doi.org/10.1017/psrm.2024.64.</w:t>
+      </w:r>
+    </w:p>
+    <w:p>
+      <w:pPr>
+        <w:pStyle w:val="Bibliography"/>
+      </w:pPr>
+      <w:r>
+        <w:t xml:space="preserve">Poole, Keith T., and Howard Rosenthal. 2007. “On Party Polarization in Congress.” </w:t>
+      </w:r>
+      <w:r>
+        <w:rPr>
+          <w:i/>
+          <w:iCs/>
+        </w:rPr>
+        <w:t>Daedalus</w:t>
+      </w:r>
+      <w:r>
+        <w:t xml:space="preserve"> 136 (3): 104–7.</w:t>
+      </w:r>
+    </w:p>
+    <w:p>
+      <w:pPr>
+        <w:pStyle w:val="Bibliography"/>
+      </w:pPr>
+      <w:r>
+        <w:t xml:space="preserve">Proksch, Sven-Oliver, and Jonathan B. </w:t>
+      </w:r>
+      <w:proofErr w:type="spellStart"/>
+      <w:r>
+        <w:t>Slapin</w:t>
+      </w:r>
+      <w:proofErr w:type="spellEnd"/>
+      <w:r>
+        <w:t xml:space="preserve">. 2009. “How to Avoid Pitfalls in Statistical Analysis of Political Texts: The Case of Germany.” </w:t>
+      </w:r>
+      <w:r>
+        <w:rPr>
+          <w:i/>
+          <w:iCs/>
+        </w:rPr>
+        <w:t>German Politics</w:t>
+      </w:r>
+      <w:r>
+        <w:t xml:space="preserve"> 18 (3): 323–44. https://doi.org/10.1080/09644000903055799.</w:t>
+      </w:r>
+    </w:p>
+    <w:p>
+      <w:pPr>
+        <w:pStyle w:val="Bibliography"/>
+      </w:pPr>
+      <w:r>
+        <w:t xml:space="preserve">Rheault, Ludovic, and Christopher Cochrane. 2020. “Word Embeddings for the Analysis of Ideological Placement in Parliamentary Corpora.” </w:t>
+      </w:r>
+      <w:r>
+        <w:rPr>
+          <w:i/>
+          <w:iCs/>
+        </w:rPr>
+        <w:t>Political Analysis</w:t>
+      </w:r>
+      <w:r>
+        <w:t xml:space="preserve"> 28 (1): 112–33. https://doi.org/10.1017/pan.2019.26.</w:t>
+      </w:r>
+    </w:p>
+    <w:p>
+      <w:pPr>
+        <w:pStyle w:val="Bibliography"/>
+      </w:pPr>
+      <w:r>
+        <w:t xml:space="preserve">Schwarz, Daniel, Denise Traber, and Kenneth Benoit. 2017. “Estimating Intra-Party Preferences: Comparing Speeches to Votes.” </w:t>
+      </w:r>
+      <w:r>
+        <w:rPr>
+          <w:i/>
+          <w:iCs/>
+        </w:rPr>
+        <w:t>Political Science Research and Methods</w:t>
+      </w:r>
+      <w:r>
+        <w:t xml:space="preserve"> 5 (2): 379–96. https://doi.org/10.1017/psrm.2015.77.</w:t>
+      </w:r>
+    </w:p>
+    <w:p>
+      <w:pPr>
+        <w:pStyle w:val="Bibliography"/>
+      </w:pPr>
+      <w:r>
+        <w:t xml:space="preserve">Theriault, Sean M., and David W. Rohde. 2011. “The Gingrich Senators and Party Polarization in the U.S. Senate.” </w:t>
+      </w:r>
+      <w:r>
+        <w:rPr>
+          <w:i/>
+          <w:iCs/>
+        </w:rPr>
+        <w:t>The Journal of Politics</w:t>
+      </w:r>
+      <w:r>
+        <w:t xml:space="preserve"> 73 (4): 1011–24. https://doi.org/10.1017/S0022381611000752.</w:t>
+      </w:r>
+    </w:p>
+    <w:p>
+      <w:pPr>
+        <w:pStyle w:val="Bibliography"/>
+      </w:pPr>
+      <w:r>
+        <w:t xml:space="preserve">Wu, Patrick Y., Jonathan Nagler, Joshua A. Tucker, and Solomon Messing. 2023. “Large Language Models Can Be Used to Estimate the Latent Positions of Politicians.” arXiv:2303.12057. Preprint, </w:t>
+      </w:r>
+      <w:proofErr w:type="spellStart"/>
+      <w:r>
+        <w:t>arXiv</w:t>
+      </w:r>
+      <w:proofErr w:type="spellEnd"/>
+      <w:r>
+        <w:t>, September 26. https://doi.org/10.48550/arXiv.2303.12057.</w:t>
+      </w:r>
+    </w:p>
+    <w:p>
+      <w:pPr>
+        <w:pStyle w:val="Bibliography"/>
+      </w:pPr>
+      <w:r>
+        <w:t xml:space="preserve">Ziems, Caleb, William Held, Omar Shaikh, </w:t>
+      </w:r>
+      <w:proofErr w:type="spellStart"/>
+      <w:r>
+        <w:t>Jiaao</w:t>
+      </w:r>
+      <w:proofErr w:type="spellEnd"/>
+      <w:r>
+        <w:t xml:space="preserve"> Chen, </w:t>
+      </w:r>
+      <w:proofErr w:type="spellStart"/>
+      <w:r>
+        <w:t>Zhehao</w:t>
+      </w:r>
+      <w:proofErr w:type="spellEnd"/>
+      <w:r>
+        <w:t xml:space="preserve"> Zhang, and </w:t>
+      </w:r>
+      <w:proofErr w:type="spellStart"/>
+      <w:r>
+        <w:t>Diyi</w:t>
+      </w:r>
+      <w:proofErr w:type="spellEnd"/>
+      <w:r>
+        <w:t xml:space="preserve"> Yang. 2024. “Can Large Language Models Transform Computational Social Science?” </w:t>
+      </w:r>
+      <w:r>
+        <w:rPr>
+          <w:i/>
+          <w:iCs/>
+        </w:rPr>
+        <w:t>Computational Linguistics</w:t>
+      </w:r>
+      <w:r>
+        <w:t xml:space="preserve"> 50 (1): 237–91. https://doi.org/10.1162/coli_a_00502.</w:t>
+      </w:r>
+    </w:p>
+    <w:p>
+      <w:pPr>
+        <w:spacing w:line="480" w:lineRule="auto"/>
+        <w:rPr>
+          <w:rFonts w:ascii="Times New Roman" w:hAnsi="Times New Roman" w:cs="Times New Roman"/>
+        </w:rPr>
+      </w:pPr>
+      <w:r>
+        <w:rPr>
+          <w:rFonts w:ascii="Times New Roman" w:hAnsi="Times New Roman" w:cs="Times New Roman"/>
+        </w:rPr>
+        <w:fldChar w:fldCharType="end"/>
+      </w:r>
     </w:p>
     <w:sectPr>
-      <w:footerReference w:type="default" r:id="rId11"/>
+      <w:footerReference w:type="default" r:id="rId7"/>
       <w:pgSz w:w="11906" w:h="16838"/>
       <w:pgMar w:top="1418" w:right="1418" w:bottom="1418" w:left="1418" w:header="709" w:footer="709" w:gutter="0"/>
       <w:cols w:space="708"/>
@@ -4324,45 +5272,6 @@
     </w:sectPr>
   </w:body>
 </w:document>
-</file>
-
-<file path=word/comments.xml><?xml version="1.0" encoding="utf-8"?>
-<w:comments xmlns:wpc="http://schemas.microsoft.com/office/word/2010/wordprocessingCanvas" xmlns:cx="http://schemas.microsoft.com/office/drawing/2014/chartex" xmlns:cx1="http://schemas.microsoft.com/office/drawing/2015/9/8/chartex" xmlns:cx2="http://schemas.microsoft.com/office/drawing/2015/10/21/chartex" xmlns:cx3="http://schemas.microsoft.com/office/drawing/2016/5/9/chartex" xmlns:cx4="http://schemas.microsoft.com/office/drawing/2016/5/10/chartex" xmlns:cx5="http://schemas.microsoft.com/office/drawing/2016/5/11/chartex" xmlns:cx6="http://schemas.microsoft.com/office/drawing/2016/5/12/chartex" xmlns:cx7="http://schemas.microsoft.com/office/drawing/2016/5/13/chartex" xmlns:cx8="http://schemas.microsoft.com/office/drawing/2016/5/14/chartex" xmlns:mc="http://schemas.openxmlformats.org/markup-compatibility/2006" xmlns:aink="http://schemas.microsoft.com/office/drawing/2016/ink" xmlns:am3d="http://schemas.microsoft.com/office/drawing/2017/model3d" xmlns:o="urn:schemas-microsoft-com:office:office" xmlns:oel="http://schemas.microsoft.com/office/2019/extlst" xmlns:r="http://schemas.openxmlformats.org/officeDocument/2006/relationships" xmlns:m="http://schemas.openxmlformats.org/officeDocument/2006/math" xmlns:v="urn:schemas-microsoft-com:vml" xmlns:wp14="http://schemas.microsoft.com/office/word/2010/wordprocessingDrawing" xmlns:wp="http://schemas.openxmlformats.org/drawingml/2006/wordprocessingDrawing" xmlns:w10="urn:schemas-microsoft-com:office:word" xmlns:w="http://schemas.openxmlformats.org/wordprocessingml/2006/main" xmlns:w14="http://schemas.microsoft.com/office/word/2010/wordml" xmlns:w15="http://schemas.microsoft.com/office/word/2012/wordml" xmlns:w16cex="http://schemas.microsoft.com/office/word/2018/wordml/cex" xmlns:w16cid="http://schemas.microsoft.com/office/word/2016/wordml/cid" xmlns:w16="http://schemas.microsoft.com/office/word/2018/wordml" xmlns:w16du="http://schemas.microsoft.com/office/word/2023/wordml/word16du" xmlns:w16sdtdh="http://schemas.microsoft.com/office/word/2020/wordml/sdtdatahash" xmlns:w16sdtfl="http://schemas.microsoft.com/office/word/2024/wordml/sdtformatlock" xmlns:w16se="http://schemas.microsoft.com/office/word/2015/wordml/symex" xmlns:wpg="http://schemas.microsoft.com/office/word/2010/wordprocessingGroup" xmlns:wpi="http://schemas.microsoft.com/office/word/2010/wordprocessingInk" xmlns:wne="http://schemas.microsoft.com/office/word/2006/wordml" xmlns:wps="http://schemas.microsoft.com/office/word/2010/wordprocessingShape" mc:Ignorable="w14 w15 w16se w16cid w16 w16cex w16sdtdh w16sdtfl w16du wp14">
-  <w:comment w:id="0" w:author="Inês Tavares de Azeredo" w:date="2026-10-14T14:16:00Z" w:initials="IT">
-    <w:p>
-      <w:pPr>
-        <w:pStyle w:val="CommentText"/>
-      </w:pPr>
-      <w:r>
-        <w:rPr>
-          <w:rStyle w:val="CommentReference"/>
-        </w:rPr>
-        <w:annotationRef/>
-      </w:r>
-      <w:r>
-        <w:t>I only added twice the citattion cause it was info for different paragraphs but we can remove it if you guys would like. I just think in separate paragraphs the part in the first one might not look like it belongs to the same citation</w:t>
-      </w:r>
-    </w:p>
-  </w:comment>
-</w:comments>
-</file>
-
-<file path=word/commentsExtended.xml><?xml version="1.0" encoding="utf-8"?>
-<w15:commentsEx xmlns:wpc="http://schemas.microsoft.com/office/word/2010/wordprocessingCanvas" xmlns:cx="http://schemas.microsoft.com/office/drawing/2014/chartex" xmlns:cx1="http://schemas.microsoft.com/office/drawing/2015/9/8/chartex" xmlns:cx2="http://schemas.microsoft.com/office/drawing/2015/10/21/chartex" xmlns:cx3="http://schemas.microsoft.com/office/drawing/2016/5/9/chartex" xmlns:cx4="http://schemas.microsoft.com/office/drawing/2016/5/10/chartex" xmlns:cx5="http://schemas.microsoft.com/office/drawing/2016/5/11/chartex" xmlns:cx6="http://schemas.microsoft.com/office/drawing/2016/5/12/chartex" xmlns:cx7="http://schemas.microsoft.com/office/drawing/2016/5/13/chartex" xmlns:cx8="http://schemas.microsoft.com/office/drawing/2016/5/14/chartex" xmlns:mc="http://schemas.openxmlformats.org/markup-compatibility/2006" xmlns:aink="http://schemas.microsoft.com/office/drawing/2016/ink" xmlns:am3d="http://schemas.microsoft.com/office/drawing/2017/model3d" xmlns:o="urn:schemas-microsoft-com:office:office" xmlns:oel="http://schemas.microsoft.com/office/2019/extlst" xmlns:r="http://schemas.openxmlformats.org/officeDocument/2006/relationships" xmlns:m="http://schemas.openxmlformats.org/officeDocument/2006/math" xmlns:v="urn:schemas-microsoft-com:vml" xmlns:wp14="http://schemas.microsoft.com/office/word/2010/wordprocessingDrawing" xmlns:wp="http://schemas.openxmlformats.org/drawingml/2006/wordprocessingDrawing" xmlns:w10="urn:schemas-microsoft-com:office:word" xmlns:w="http://schemas.openxmlformats.org/wordprocessingml/2006/main" xmlns:w14="http://schemas.microsoft.com/office/word/2010/wordml" xmlns:w15="http://schemas.microsoft.com/office/word/2012/wordml" xmlns:w16cex="http://schemas.microsoft.com/office/word/2018/wordml/cex" xmlns:w16cid="http://schemas.microsoft.com/office/word/2016/wordml/cid" xmlns:w16="http://schemas.microsoft.com/office/word/2018/wordml" xmlns:w16du="http://schemas.microsoft.com/office/word/2023/wordml/word16du" xmlns:w16sdtdh="http://schemas.microsoft.com/office/word/2020/wordml/sdtdatahash" xmlns:w16sdtfl="http://schemas.microsoft.com/office/word/2024/wordml/sdtformatlock" xmlns:w16se="http://schemas.microsoft.com/office/word/2015/wordml/symex" xmlns:wpg="http://schemas.microsoft.com/office/word/2010/wordprocessingGroup" xmlns:wpi="http://schemas.microsoft.com/office/word/2010/wordprocessingInk" xmlns:wne="http://schemas.microsoft.com/office/word/2006/wordml" xmlns:wps="http://schemas.microsoft.com/office/word/2010/wordprocessingShape" mc:Ignorable="w14 w15 w16se w16cid w16 w16cex w16sdtdh w16sdtfl w16du wp14">
-  <w15:commentEx w15:paraId="375A683B" w15:done="0"/>
-</w15:commentsEx>
-</file>
-
-<file path=word/commentsExtensible.xml><?xml version="1.0" encoding="utf-8"?>
-<w16cex:commentsExtensible xmlns:wpc="http://schemas.microsoft.com/office/word/2010/wordprocessingCanvas" xmlns:cx="http://schemas.microsoft.com/office/drawing/2014/chartex" xmlns:cx1="http://schemas.microsoft.com/office/drawing/2015/9/8/chartex" xmlns:cx2="http://schemas.microsoft.com/office/drawing/2015/10/21/chartex" xmlns:cx3="http://schemas.microsoft.com/office/drawing/2016/5/9/chartex" xmlns:cx4="http://schemas.microsoft.com/office/drawing/2016/5/10/chartex" xmlns:cx5="http://schemas.microsoft.com/office/drawing/2016/5/11/chartex" xmlns:cx6="http://schemas.microsoft.com/office/drawing/2016/5/12/chartex" xmlns:cx7="http://schemas.microsoft.com/office/drawing/2016/5/13/chartex" xmlns:cx8="http://schemas.microsoft.com/office/drawing/2016/5/14/chartex" xmlns:cr="http://schemas.microsoft.com/office/comments/2020/reactions" xmlns:mc="http://schemas.openxmlformats.org/markup-compatibility/2006" xmlns:aink="http://schemas.microsoft.com/office/drawing/2016/ink" xmlns:am3d="http://schemas.microsoft.com/office/drawing/2017/model3d" xmlns:o="urn:schemas-microsoft-com:office:office" xmlns:oel="http://schemas.microsoft.com/office/2019/extlst" xmlns:r="http://schemas.openxmlformats.org/officeDocument/2006/relationships" xmlns:m="http://schemas.openxmlformats.org/officeDocument/2006/math" xmlns:v="urn:schemas-microsoft-com:vml" xmlns:wp14="http://schemas.microsoft.com/office/word/2010/wordprocessingDrawing" xmlns:wp="http://schemas.openxmlformats.org/drawingml/2006/wordprocessingDrawing" xmlns:w10="urn:schemas-microsoft-com:office:word" xmlns:w="http://schemas.openxmlformats.org/wordprocessingml/2006/main" xmlns:w14="http://schemas.microsoft.com/office/word/2010/wordml" xmlns:w15="http://schemas.microsoft.com/office/word/2012/wordml" xmlns:w16cex="http://schemas.microsoft.com/office/word/2018/wordml/cex" xmlns:w16cid="http://schemas.microsoft.com/office/word/2016/wordml/cid" xmlns:w16="http://schemas.microsoft.com/office/word/2018/wordml" xmlns:w16du="http://schemas.microsoft.com/office/word/2023/wordml/word16du" xmlns:w16sdtdh="http://schemas.microsoft.com/office/word/2020/wordml/sdtdatahash" xmlns:w16sdtfl="http://schemas.microsoft.com/office/word/2024/wordml/sdtformatlock" xmlns:w16se="http://schemas.microsoft.com/office/word/2015/wordml/symex" xmlns:wpg="http://schemas.microsoft.com/office/word/2010/wordprocessingGroup" xmlns:wpi="http://schemas.microsoft.com/office/word/2010/wordprocessingInk" xmlns:wne="http://schemas.microsoft.com/office/word/2006/wordml" xmlns:wps="http://schemas.microsoft.com/office/word/2010/wordprocessingShape" mc:Ignorable="w14 w15 w16se w16cid w16 w16cex w16sdtdh w16sdtfl cr w16du wp14">
-  <w16cex:commentExtensible w16cex:durableId="18487083" w16cex:dateUtc="2026-10-14T13:16:00Z"/>
-</w16cex:commentsExtensible>
-</file>
-
-<file path=word/commentsIds.xml><?xml version="1.0" encoding="utf-8"?>
-<w16cid:commentsIds xmlns:wpc="http://schemas.microsoft.com/office/word/2010/wordprocessingCanvas" xmlns:cx="http://schemas.microsoft.com/office/drawing/2014/chartex" xmlns:cx1="http://schemas.microsoft.com/office/drawing/2015/9/8/chartex" xmlns:cx2="http://schemas.microsoft.com/office/drawing/2015/10/21/chartex" xmlns:cx3="http://schemas.microsoft.com/office/drawing/2016/5/9/chartex" xmlns:cx4="http://schemas.microsoft.com/office/drawing/2016/5/10/chartex" xmlns:cx5="http://schemas.microsoft.com/office/drawing/2016/5/11/chartex" xmlns:cx6="http://schemas.microsoft.com/office/drawing/2016/5/12/chartex" xmlns:cx7="http://schemas.microsoft.com/office/drawing/2016/5/13/chartex" xmlns:cx8="http://schemas.microsoft.com/office/drawing/2016/5/14/chartex" xmlns:mc="http://schemas.openxmlformats.org/markup-compatibility/2006" xmlns:aink="http://schemas.microsoft.com/office/drawing/2016/ink" xmlns:am3d="http://schemas.microsoft.com/office/drawing/2017/model3d" xmlns:o="urn:schemas-microsoft-com:office:office" xmlns:oel="http://schemas.microsoft.com/office/2019/extlst" xmlns:r="http://schemas.openxmlformats.org/officeDocument/2006/relationships" xmlns:m="http://schemas.openxmlformats.org/officeDocument/2006/math" xmlns:v="urn:schemas-microsoft-com:vml" xmlns:wp14="http://schemas.microsoft.com/office/word/2010/wordprocessingDrawing" xmlns:wp="http://schemas.openxmlformats.org/drawingml/2006/wordprocessingDrawing" xmlns:w10="urn:schemas-microsoft-com:office:word" xmlns:w="http://schemas.openxmlformats.org/wordprocessingml/2006/main" xmlns:w14="http://schemas.microsoft.com/office/word/2010/wordml" xmlns:w15="http://schemas.microsoft.com/office/word/2012/wordml" xmlns:w16cex="http://schemas.microsoft.com/office/word/2018/wordml/cex" xmlns:w16cid="http://schemas.microsoft.com/office/word/2016/wordml/cid" xmlns:w16="http://schemas.microsoft.com/office/word/2018/wordml" xmlns:w16du="http://schemas.microsoft.com/office/word/2023/wordml/word16du" xmlns:w16sdtdh="http://schemas.microsoft.com/office/word/2020/wordml/sdtdatahash" xmlns:w16sdtfl="http://schemas.microsoft.com/office/word/2024/wordml/sdtformatlock" xmlns:w16se="http://schemas.microsoft.com/office/word/2015/wordml/symex" xmlns:wpg="http://schemas.microsoft.com/office/word/2010/wordprocessingGroup" xmlns:wpi="http://schemas.microsoft.com/office/word/2010/wordprocessingInk" xmlns:wne="http://schemas.microsoft.com/office/word/2006/wordml" xmlns:wps="http://schemas.microsoft.com/office/word/2010/wordprocessingShape" mc:Ignorable="w14 w15 w16se w16cid w16 w16cex w16sdtdh w16sdtfl w16du wp14">
-  <w16cid:commentId w16cid:paraId="375A683B" w16cid:durableId="18487083"/>
-</w16cid:commentsIds>
 </file>
 
 <file path=word/endnotes.xml><?xml version="1.0" encoding="utf-8"?>
@@ -4575,14 +5484,6 @@
     <w:abstractNumId w:val="0"/>
   </w:num>
 </w:numbering>
-</file>
-
-<file path=word/people.xml><?xml version="1.0" encoding="utf-8"?>
-<w15:people xmlns:wpc="http://schemas.microsoft.com/office/word/2010/wordprocessingCanvas" xmlns:cx="http://schemas.microsoft.com/office/drawing/2014/chartex" xmlns:cx1="http://schemas.microsoft.com/office/drawing/2015/9/8/chartex" xmlns:cx2="http://schemas.microsoft.com/office/drawing/2015/10/21/chartex" xmlns:cx3="http://schemas.microsoft.com/office/drawing/2016/5/9/chartex" xmlns:cx4="http://schemas.microsoft.com/office/drawing/2016/5/10/chartex" xmlns:cx5="http://schemas.microsoft.com/office/drawing/2016/5/11/chartex" xmlns:cx6="http://schemas.microsoft.com/office/drawing/2016/5/12/chartex" xmlns:cx7="http://schemas.microsoft.com/office/drawing/2016/5/13/chartex" xmlns:cx8="http://schemas.microsoft.com/office/drawing/2016/5/14/chartex" xmlns:mc="http://schemas.openxmlformats.org/markup-compatibility/2006" xmlns:aink="http://schemas.microsoft.com/office/drawing/2016/ink" xmlns:am3d="http://schemas.microsoft.com/office/drawing/2017/model3d" xmlns:o="urn:schemas-microsoft-com:office:office" xmlns:oel="http://schemas.microsoft.com/office/2019/extlst" xmlns:r="http://schemas.openxmlformats.org/officeDocument/2006/relationships" xmlns:m="http://schemas.openxmlformats.org/officeDocument/2006/math" xmlns:v="urn:schemas-microsoft-com:vml" xmlns:wp14="http://schemas.microsoft.com/office/word/2010/wordprocessingDrawing" xmlns:wp="http://schemas.openxmlformats.org/drawingml/2006/wordprocessingDrawing" xmlns:w10="urn:schemas-microsoft-com:office:word" xmlns:w="http://schemas.openxmlformats.org/wordprocessingml/2006/main" xmlns:w14="http://schemas.microsoft.com/office/word/2010/wordml" xmlns:w15="http://schemas.microsoft.com/office/word/2012/wordml" xmlns:w16cex="http://schemas.microsoft.com/office/word/2018/wordml/cex" xmlns:w16cid="http://schemas.microsoft.com/office/word/2016/wordml/cid" xmlns:w16="http://schemas.microsoft.com/office/word/2018/wordml" xmlns:w16du="http://schemas.microsoft.com/office/word/2023/wordml/word16du" xmlns:w16sdtdh="http://schemas.microsoft.com/office/word/2020/wordml/sdtdatahash" xmlns:w16sdtfl="http://schemas.microsoft.com/office/word/2024/wordml/sdtformatlock" xmlns:w16se="http://schemas.microsoft.com/office/word/2015/wordml/symex" xmlns:wpg="http://schemas.microsoft.com/office/word/2010/wordprocessingGroup" xmlns:wpi="http://schemas.microsoft.com/office/word/2010/wordprocessingInk" xmlns:wne="http://schemas.microsoft.com/office/word/2006/wordml" xmlns:wps="http://schemas.microsoft.com/office/word/2010/wordprocessingShape" mc:Ignorable="w14 w15 w16se w16cid w16 w16cex w16sdtdh w16sdtfl w16du wp14">
-  <w15:person w15:author="Inês Tavares de Azeredo">
-    <w15:presenceInfo w15:providerId="AD" w15:userId="S::73259@novasbe.pt::2d6dab1e-65fd-4308-a086-60fdd960c81f"/>
-  </w15:person>
-</w15:people>
 </file>
 
 <file path=word/styles.xml><?xml version="1.0" encoding="utf-8"?>
@@ -5618,6 +6519,14 @@
       <w:szCs w:val="20"/>
     </w:rPr>
   </w:style>
+  <w:style w:type="paragraph" w:styleId="Bibliography">
+    <w:name w:val="Bibliography"/>
+    <w:basedOn w:val="Normal"/>
+    <w:next w:val="Normal"/>
+    <w:uiPriority w:val="37"/>
+    <w:unhideWhenUsed/>
+    <w:rsid w:val="001531E8"/>
+  </w:style>
 </w:styles>
 </file>
 

</xml_diff>